<commit_message>
docs: add introduction to language specification document
</commit_message>
<xml_diff>
--- a/spec/LSD.docx
+++ b/spec/LSD.docx
@@ -4,6 +4,7 @@
   <w:body>
     <w:p>
       <w:pPr>
+        <w:jc w:val="both"/>
         <w:rPr>
           <w:rFonts w:asciiTheme="majorBidi" w:hAnsiTheme="majorBidi" w:cstheme="majorBidi"/>
           <w:sz w:val="36"/>
@@ -23,6 +24,7 @@
     </w:p>
     <w:p>
       <w:pPr>
+        <w:jc w:val="both"/>
         <w:rPr>
           <w:rFonts w:asciiTheme="majorBidi" w:hAnsiTheme="majorBidi" w:cstheme="majorBidi"/>
           <w:sz w:val="36"/>
@@ -42,6 +44,7 @@
     </w:p>
     <w:p>
       <w:pPr>
+        <w:jc w:val="both"/>
         <w:rPr>
           <w:rFonts w:asciiTheme="majorBidi" w:hAnsiTheme="majorBidi" w:cstheme="majorBidi"/>
           <w:sz w:val="36"/>
@@ -61,6 +64,7 @@
     </w:p>
     <w:p>
       <w:pPr>
+        <w:jc w:val="both"/>
         <w:rPr>
           <w:rFonts w:asciiTheme="majorBidi" w:hAnsiTheme="majorBidi" w:cstheme="majorBidi"/>
           <w:sz w:val="36"/>
@@ -75,28 +79,26 @@
           <w:szCs w:val="36"/>
           <w:lang w:val="en-US"/>
         </w:rPr>
-        <w:t>Date: 25 April 2026 AD</w:t>
-      </w:r>
-    </w:p>
-    <w:p>
-      <w:pPr>
+        <w:t xml:space="preserve">Date: </w:t>
+      </w:r>
+      <w:r>
         <w:rPr>
           <w:rFonts w:asciiTheme="majorBidi" w:hAnsiTheme="majorBidi" w:cstheme="majorBidi"/>
           <w:sz w:val="36"/>
           <w:szCs w:val="36"/>
           <w:lang w:val="en-US"/>
         </w:rPr>
-      </w:pPr>
-    </w:p>
-    <w:p>
-      <w:pPr>
+        <w:t>18</w:t>
+      </w:r>
+      <w:r>
         <w:rPr>
           <w:rFonts w:asciiTheme="majorBidi" w:hAnsiTheme="majorBidi" w:cstheme="majorBidi"/>
           <w:sz w:val="36"/>
           <w:szCs w:val="36"/>
           <w:lang w:val="en-US"/>
         </w:rPr>
-      </w:pPr>
+        <w:t xml:space="preserve"> </w:t>
+      </w:r>
       <w:r>
         <w:rPr>
           <w:rFonts w:asciiTheme="majorBidi" w:hAnsiTheme="majorBidi" w:cstheme="majorBidi"/>
@@ -104,11 +106,52 @@
           <w:szCs w:val="36"/>
           <w:lang w:val="en-US"/>
         </w:rPr>
+        <w:t xml:space="preserve">May </w:t>
+      </w:r>
+      <w:r>
+        <w:rPr>
+          <w:rFonts w:asciiTheme="majorBidi" w:hAnsiTheme="majorBidi" w:cstheme="majorBidi"/>
+          <w:sz w:val="36"/>
+          <w:szCs w:val="36"/>
+          <w:lang w:val="en-US"/>
+        </w:rPr>
+        <w:t>2026 AD</w:t>
+      </w:r>
+    </w:p>
+    <w:p>
+      <w:pPr>
+        <w:jc w:val="both"/>
+        <w:rPr>
+          <w:rFonts w:asciiTheme="majorBidi" w:hAnsiTheme="majorBidi" w:cstheme="majorBidi"/>
+          <w:sz w:val="36"/>
+          <w:szCs w:val="36"/>
+          <w:lang w:val="en-US"/>
+        </w:rPr>
+      </w:pPr>
+    </w:p>
+    <w:p>
+      <w:pPr>
+        <w:jc w:val="both"/>
+        <w:rPr>
+          <w:rFonts w:asciiTheme="majorBidi" w:hAnsiTheme="majorBidi" w:cstheme="majorBidi"/>
+          <w:sz w:val="36"/>
+          <w:szCs w:val="36"/>
+          <w:lang w:val="en-US"/>
+        </w:rPr>
+      </w:pPr>
+      <w:r>
+        <w:rPr>
+          <w:rFonts w:asciiTheme="majorBidi" w:hAnsiTheme="majorBidi" w:cstheme="majorBidi"/>
+          <w:sz w:val="36"/>
+          <w:szCs w:val="36"/>
+          <w:lang w:val="en-US"/>
+        </w:rPr>
         <w:br w:type="page"/>
       </w:r>
     </w:p>
     <w:p>
       <w:pPr>
+        <w:jc w:val="both"/>
         <w:rPr>
           <w:rFonts w:asciiTheme="majorBidi" w:hAnsiTheme="majorBidi" w:cstheme="majorBidi"/>
           <w:sz w:val="28"/>
@@ -129,6 +172,7 @@
     </w:p>
     <w:p>
       <w:pPr>
+        <w:jc w:val="both"/>
         <w:rPr>
           <w:rFonts w:asciiTheme="majorBidi" w:hAnsiTheme="majorBidi" w:cstheme="majorBidi"/>
           <w:lang w:val="en-US"/>
@@ -144,6 +188,7 @@
     </w:p>
     <w:p>
       <w:pPr>
+        <w:jc w:val="both"/>
         <w:rPr>
           <w:rFonts w:asciiTheme="majorBidi" w:hAnsiTheme="majorBidi" w:cstheme="majorBidi"/>
           <w:lang w:val="en-US"/>
@@ -180,6 +225,7 @@
     </w:p>
     <w:p>
       <w:pPr>
+        <w:jc w:val="both"/>
         <w:rPr>
           <w:rFonts w:asciiTheme="majorBidi" w:hAnsiTheme="majorBidi" w:cstheme="majorBidi"/>
           <w:lang w:val="en-US"/>
@@ -195,6 +241,7 @@
     </w:p>
     <w:p>
       <w:pPr>
+        <w:jc w:val="both"/>
         <w:rPr>
           <w:rFonts w:asciiTheme="majorBidi" w:hAnsiTheme="majorBidi" w:cstheme="majorBidi"/>
           <w:lang w:val="en-US"/>
@@ -210,6 +257,15 @@
     </w:p>
     <w:sdt>
       <w:sdtPr>
+        <w:rPr>
+          <w:rFonts w:asciiTheme="minorHAnsi" w:eastAsiaTheme="minorHAnsi" w:hAnsiTheme="minorHAnsi" w:cstheme="minorBidi"/>
+          <w:color w:val="auto"/>
+          <w:kern w:val="2"/>
+          <w:sz w:val="24"/>
+          <w:szCs w:val="24"/>
+          <w:lang w:val="en-GB"/>
+          <w14:ligatures w14:val="standardContextual"/>
+        </w:rPr>
         <w:id w:val="-1644576960"/>
         <w:docPartObj>
           <w:docPartGallery w:val="Table of Contents"/>
@@ -218,22 +274,16 @@
       </w:sdtPr>
       <w:sdtEndPr>
         <w:rPr>
-          <w:rFonts w:asciiTheme="minorHAnsi" w:eastAsiaTheme="minorHAnsi" w:hAnsiTheme="minorHAnsi" w:cstheme="minorBidi"/>
           <w:b/>
           <w:bCs/>
           <w:noProof/>
-          <w:color w:val="auto"/>
-          <w:kern w:val="2"/>
-          <w:sz w:val="24"/>
-          <w:szCs w:val="24"/>
-          <w:lang w:val="en-GB"/>
-          <w14:ligatures w14:val="standardContextual"/>
         </w:rPr>
       </w:sdtEndPr>
       <w:sdtContent>
         <w:p>
           <w:pPr>
             <w:pStyle w:val="TOCHeading"/>
+            <w:jc w:val="both"/>
           </w:pPr>
           <w:r>
             <w:t>Table of Contents</w:t>
@@ -243,8 +293,10 @@
           <w:pPr>
             <w:pStyle w:val="TOC1"/>
             <w:tabs>
+              <w:tab w:val="left" w:pos="480"/>
               <w:tab w:val="right" w:leader="dot" w:pos="9736"/>
             </w:tabs>
+            <w:jc w:val="both"/>
             <w:rPr>
               <w:rFonts w:eastAsiaTheme="minorEastAsia"/>
               <w:noProof/>
@@ -260,7 +312,7 @@
           <w:r>
             <w:fldChar w:fldCharType="separate"/>
           </w:r>
-          <w:hyperlink w:anchor="_Toc228013451" w:history="1">
+          <w:hyperlink w:anchor="_Toc230027572" w:history="1">
             <w:r>
               <w:rPr>
                 <w:rStyle w:val="Hyperlink"/>
@@ -268,6 +320,23 @@
                 <w:noProof/>
                 <w:lang w:val="en-US"/>
               </w:rPr>
+              <w:t>1.</w:t>
+            </w:r>
+            <w:r>
+              <w:rPr>
+                <w:rFonts w:eastAsiaTheme="minorEastAsia"/>
+                <w:noProof/>
+                <w:lang w:eastAsia="en-GB"/>
+              </w:rPr>
+              <w:tab/>
+            </w:r>
+            <w:r>
+              <w:rPr>
+                <w:rStyle w:val="Hyperlink"/>
+                <w:rFonts w:asciiTheme="majorBidi" w:hAnsiTheme="majorBidi" w:cstheme="majorBidi"/>
+                <w:noProof/>
+                <w:lang w:val="en-US"/>
+              </w:rPr>
               <w:t>Introduction</w:t>
             </w:r>
             <w:r>
@@ -289,7 +358,7 @@
                 <w:noProof/>
                 <w:webHidden/>
               </w:rPr>
-              <w:instrText xml:space="preserve"> PAGEREF _Toc228013451 \h </w:instrText>
+              <w:instrText xml:space="preserve"> PAGEREF _Toc230027572 \h </w:instrText>
             </w:r>
             <w:r>
               <w:rPr>
@@ -327,11 +396,14 @@
               <w:tab w:val="left" w:pos="960"/>
               <w:tab w:val="right" w:leader="dot" w:pos="9736"/>
             </w:tabs>
+            <w:jc w:val="both"/>
             <w:rPr>
+              <w:rFonts w:eastAsiaTheme="minorEastAsia"/>
               <w:noProof/>
+              <w:lang w:eastAsia="en-GB"/>
             </w:rPr>
           </w:pPr>
-          <w:hyperlink w:anchor="_Toc228013452" w:history="1">
+          <w:hyperlink w:anchor="_Toc230027573" w:history="1">
             <w:r>
               <w:rPr>
                 <w:rStyle w:val="Hyperlink"/>
@@ -343,7 +415,9 @@
             </w:r>
             <w:r>
               <w:rPr>
-                <w:noProof/>
+                <w:rFonts w:eastAsiaTheme="minorEastAsia"/>
+                <w:noProof/>
+                <w:lang w:eastAsia="en-GB"/>
               </w:rPr>
               <w:tab/>
             </w:r>
@@ -354,7 +428,7 @@
                 <w:noProof/>
                 <w:lang w:val="en-US"/>
               </w:rPr>
-              <w:t>Purpose</w:t>
+              <w:t>Overview</w:t>
             </w:r>
             <w:r>
               <w:rPr>
@@ -375,7 +449,7 @@
                 <w:noProof/>
                 <w:webHidden/>
               </w:rPr>
-              <w:instrText xml:space="preserve"> PAGEREF _Toc228013452 \h </w:instrText>
+              <w:instrText xml:space="preserve"> PAGEREF _Toc230027573 \h </w:instrText>
             </w:r>
             <w:r>
               <w:rPr>
@@ -413,11 +487,14 @@
               <w:tab w:val="left" w:pos="960"/>
               <w:tab w:val="right" w:leader="dot" w:pos="9736"/>
             </w:tabs>
+            <w:jc w:val="both"/>
             <w:rPr>
+              <w:rFonts w:eastAsiaTheme="minorEastAsia"/>
               <w:noProof/>
+              <w:lang w:eastAsia="en-GB"/>
             </w:rPr>
           </w:pPr>
-          <w:hyperlink w:anchor="_Toc228013453" w:history="1">
+          <w:hyperlink w:anchor="_Toc230027574" w:history="1">
             <w:r>
               <w:rPr>
                 <w:rStyle w:val="Hyperlink"/>
@@ -429,7 +506,9 @@
             </w:r>
             <w:r>
               <w:rPr>
-                <w:noProof/>
+                <w:rFonts w:eastAsiaTheme="minorEastAsia"/>
+                <w:noProof/>
+                <w:lang w:eastAsia="en-GB"/>
               </w:rPr>
               <w:tab/>
             </w:r>
@@ -440,7 +519,7 @@
                 <w:noProof/>
                 <w:lang w:val="en-US"/>
               </w:rPr>
-              <w:t>Design Goals</w:t>
+              <w:t>Motivation</w:t>
             </w:r>
             <w:r>
               <w:rPr>
@@ -461,7 +540,7 @@
                 <w:noProof/>
                 <w:webHidden/>
               </w:rPr>
-              <w:instrText xml:space="preserve"> PAGEREF _Toc228013453 \h </w:instrText>
+              <w:instrText xml:space="preserve"> PAGEREF _Toc230027574 \h </w:instrText>
             </w:r>
             <w:r>
               <w:rPr>
@@ -493,6 +572,1283 @@
           </w:hyperlink>
         </w:p>
         <w:p>
+          <w:pPr>
+            <w:pStyle w:val="TOC2"/>
+            <w:tabs>
+              <w:tab w:val="left" w:pos="960"/>
+              <w:tab w:val="right" w:leader="dot" w:pos="9736"/>
+            </w:tabs>
+            <w:jc w:val="both"/>
+            <w:rPr>
+              <w:rFonts w:eastAsiaTheme="minorEastAsia"/>
+              <w:noProof/>
+              <w:lang w:eastAsia="en-GB"/>
+            </w:rPr>
+          </w:pPr>
+          <w:hyperlink w:anchor="_Toc230027575" w:history="1">
+            <w:r>
+              <w:rPr>
+                <w:rStyle w:val="Hyperlink"/>
+                <w:rFonts w:asciiTheme="majorBidi" w:hAnsiTheme="majorBidi" w:cstheme="majorBidi"/>
+                <w:noProof/>
+                <w:lang w:val="en-US"/>
+              </w:rPr>
+              <w:t>1.3</w:t>
+            </w:r>
+            <w:r>
+              <w:rPr>
+                <w:rFonts w:eastAsiaTheme="minorEastAsia"/>
+                <w:noProof/>
+                <w:lang w:eastAsia="en-GB"/>
+              </w:rPr>
+              <w:tab/>
+            </w:r>
+            <w:r>
+              <w:rPr>
+                <w:rStyle w:val="Hyperlink"/>
+                <w:rFonts w:asciiTheme="majorBidi" w:hAnsiTheme="majorBidi" w:cstheme="majorBidi"/>
+                <w:noProof/>
+                <w:lang w:val="en-US"/>
+              </w:rPr>
+              <w:t>Design Goals</w:t>
+            </w:r>
+            <w:r>
+              <w:rPr>
+                <w:noProof/>
+                <w:webHidden/>
+              </w:rPr>
+              <w:tab/>
+            </w:r>
+            <w:r>
+              <w:rPr>
+                <w:noProof/>
+                <w:webHidden/>
+              </w:rPr>
+              <w:fldChar w:fldCharType="begin"/>
+            </w:r>
+            <w:r>
+              <w:rPr>
+                <w:noProof/>
+                <w:webHidden/>
+              </w:rPr>
+              <w:instrText xml:space="preserve"> PAGEREF _Toc230027575 \h </w:instrText>
+            </w:r>
+            <w:r>
+              <w:rPr>
+                <w:noProof/>
+                <w:webHidden/>
+              </w:rPr>
+            </w:r>
+            <w:r>
+              <w:rPr>
+                <w:noProof/>
+                <w:webHidden/>
+              </w:rPr>
+              <w:fldChar w:fldCharType="separate"/>
+            </w:r>
+            <w:r>
+              <w:rPr>
+                <w:noProof/>
+                <w:webHidden/>
+              </w:rPr>
+              <w:t>4</w:t>
+            </w:r>
+            <w:r>
+              <w:rPr>
+                <w:noProof/>
+                <w:webHidden/>
+              </w:rPr>
+              <w:fldChar w:fldCharType="end"/>
+            </w:r>
+          </w:hyperlink>
+        </w:p>
+        <w:p>
+          <w:pPr>
+            <w:pStyle w:val="TOC2"/>
+            <w:tabs>
+              <w:tab w:val="left" w:pos="960"/>
+              <w:tab w:val="right" w:leader="dot" w:pos="9736"/>
+            </w:tabs>
+            <w:jc w:val="both"/>
+            <w:rPr>
+              <w:rFonts w:eastAsiaTheme="minorEastAsia"/>
+              <w:noProof/>
+              <w:lang w:eastAsia="en-GB"/>
+            </w:rPr>
+          </w:pPr>
+          <w:hyperlink w:anchor="_Toc230027576" w:history="1">
+            <w:r>
+              <w:rPr>
+                <w:rStyle w:val="Hyperlink"/>
+                <w:rFonts w:asciiTheme="majorBidi" w:hAnsiTheme="majorBidi" w:cstheme="majorBidi"/>
+                <w:noProof/>
+                <w:lang w:val="en-US"/>
+              </w:rPr>
+              <w:t>1.4</w:t>
+            </w:r>
+            <w:r>
+              <w:rPr>
+                <w:rFonts w:eastAsiaTheme="minorEastAsia"/>
+                <w:noProof/>
+                <w:lang w:eastAsia="en-GB"/>
+              </w:rPr>
+              <w:tab/>
+            </w:r>
+            <w:r>
+              <w:rPr>
+                <w:rStyle w:val="Hyperlink"/>
+                <w:rFonts w:asciiTheme="majorBidi" w:hAnsiTheme="majorBidi" w:cstheme="majorBidi"/>
+                <w:noProof/>
+                <w:lang w:val="en-US"/>
+              </w:rPr>
+              <w:t>Intended Audience</w:t>
+            </w:r>
+            <w:r>
+              <w:rPr>
+                <w:noProof/>
+                <w:webHidden/>
+              </w:rPr>
+              <w:tab/>
+            </w:r>
+            <w:r>
+              <w:rPr>
+                <w:noProof/>
+                <w:webHidden/>
+              </w:rPr>
+              <w:fldChar w:fldCharType="begin"/>
+            </w:r>
+            <w:r>
+              <w:rPr>
+                <w:noProof/>
+                <w:webHidden/>
+              </w:rPr>
+              <w:instrText xml:space="preserve"> PAGEREF _Toc230027576 \h </w:instrText>
+            </w:r>
+            <w:r>
+              <w:rPr>
+                <w:noProof/>
+                <w:webHidden/>
+              </w:rPr>
+            </w:r>
+            <w:r>
+              <w:rPr>
+                <w:noProof/>
+                <w:webHidden/>
+              </w:rPr>
+              <w:fldChar w:fldCharType="separate"/>
+            </w:r>
+            <w:r>
+              <w:rPr>
+                <w:noProof/>
+                <w:webHidden/>
+              </w:rPr>
+              <w:t>4</w:t>
+            </w:r>
+            <w:r>
+              <w:rPr>
+                <w:noProof/>
+                <w:webHidden/>
+              </w:rPr>
+              <w:fldChar w:fldCharType="end"/>
+            </w:r>
+          </w:hyperlink>
+        </w:p>
+        <w:p>
+          <w:pPr>
+            <w:pStyle w:val="TOC1"/>
+            <w:tabs>
+              <w:tab w:val="left" w:pos="480"/>
+              <w:tab w:val="right" w:leader="dot" w:pos="9736"/>
+            </w:tabs>
+            <w:jc w:val="both"/>
+            <w:rPr>
+              <w:rFonts w:eastAsiaTheme="minorEastAsia"/>
+              <w:noProof/>
+              <w:lang w:eastAsia="en-GB"/>
+            </w:rPr>
+          </w:pPr>
+          <w:hyperlink w:anchor="_Toc230027577" w:history="1">
+            <w:r>
+              <w:rPr>
+                <w:rStyle w:val="Hyperlink"/>
+                <w:rFonts w:asciiTheme="majorBidi" w:hAnsiTheme="majorBidi" w:cstheme="majorBidi"/>
+                <w:noProof/>
+                <w:lang w:val="en-US"/>
+              </w:rPr>
+              <w:t>2.</w:t>
+            </w:r>
+            <w:r>
+              <w:rPr>
+                <w:rFonts w:eastAsiaTheme="minorEastAsia"/>
+                <w:noProof/>
+                <w:lang w:eastAsia="en-GB"/>
+              </w:rPr>
+              <w:tab/>
+            </w:r>
+            <w:r>
+              <w:rPr>
+                <w:rStyle w:val="Hyperlink"/>
+                <w:rFonts w:asciiTheme="majorBidi" w:hAnsiTheme="majorBidi" w:cstheme="majorBidi"/>
+                <w:noProof/>
+                <w:lang w:val="en-US"/>
+              </w:rPr>
+              <w:t>Lexical Structure</w:t>
+            </w:r>
+            <w:r>
+              <w:rPr>
+                <w:noProof/>
+                <w:webHidden/>
+              </w:rPr>
+              <w:tab/>
+            </w:r>
+            <w:r>
+              <w:rPr>
+                <w:noProof/>
+                <w:webHidden/>
+              </w:rPr>
+              <w:fldChar w:fldCharType="begin"/>
+            </w:r>
+            <w:r>
+              <w:rPr>
+                <w:noProof/>
+                <w:webHidden/>
+              </w:rPr>
+              <w:instrText xml:space="preserve"> PAGEREF _Toc230027577 \h </w:instrText>
+            </w:r>
+            <w:r>
+              <w:rPr>
+                <w:noProof/>
+                <w:webHidden/>
+              </w:rPr>
+            </w:r>
+            <w:r>
+              <w:rPr>
+                <w:noProof/>
+                <w:webHidden/>
+              </w:rPr>
+              <w:fldChar w:fldCharType="separate"/>
+            </w:r>
+            <w:r>
+              <w:rPr>
+                <w:noProof/>
+                <w:webHidden/>
+              </w:rPr>
+              <w:t>4</w:t>
+            </w:r>
+            <w:r>
+              <w:rPr>
+                <w:noProof/>
+                <w:webHidden/>
+              </w:rPr>
+              <w:fldChar w:fldCharType="end"/>
+            </w:r>
+          </w:hyperlink>
+        </w:p>
+        <w:p>
+          <w:pPr>
+            <w:pStyle w:val="TOC1"/>
+            <w:tabs>
+              <w:tab w:val="left" w:pos="480"/>
+              <w:tab w:val="right" w:leader="dot" w:pos="9736"/>
+            </w:tabs>
+            <w:jc w:val="both"/>
+            <w:rPr>
+              <w:rFonts w:eastAsiaTheme="minorEastAsia"/>
+              <w:noProof/>
+              <w:lang w:eastAsia="en-GB"/>
+            </w:rPr>
+          </w:pPr>
+          <w:hyperlink w:anchor="_Toc230027578" w:history="1">
+            <w:r>
+              <w:rPr>
+                <w:rStyle w:val="Hyperlink"/>
+                <w:rFonts w:asciiTheme="majorBidi" w:hAnsiTheme="majorBidi" w:cstheme="majorBidi"/>
+                <w:noProof/>
+                <w:lang w:val="en-US"/>
+              </w:rPr>
+              <w:t>3.</w:t>
+            </w:r>
+            <w:r>
+              <w:rPr>
+                <w:rFonts w:eastAsiaTheme="minorEastAsia"/>
+                <w:noProof/>
+                <w:lang w:eastAsia="en-GB"/>
+              </w:rPr>
+              <w:tab/>
+            </w:r>
+            <w:r>
+              <w:rPr>
+                <w:rStyle w:val="Hyperlink"/>
+                <w:rFonts w:asciiTheme="majorBidi" w:hAnsiTheme="majorBidi" w:cstheme="majorBidi"/>
+                <w:noProof/>
+                <w:lang w:val="en-US"/>
+              </w:rPr>
+              <w:t>Types</w:t>
+            </w:r>
+            <w:r>
+              <w:rPr>
+                <w:noProof/>
+                <w:webHidden/>
+              </w:rPr>
+              <w:tab/>
+            </w:r>
+            <w:r>
+              <w:rPr>
+                <w:noProof/>
+                <w:webHidden/>
+              </w:rPr>
+              <w:fldChar w:fldCharType="begin"/>
+            </w:r>
+            <w:r>
+              <w:rPr>
+                <w:noProof/>
+                <w:webHidden/>
+              </w:rPr>
+              <w:instrText xml:space="preserve"> PAGEREF _Toc230027578 \h </w:instrText>
+            </w:r>
+            <w:r>
+              <w:rPr>
+                <w:noProof/>
+                <w:webHidden/>
+              </w:rPr>
+            </w:r>
+            <w:r>
+              <w:rPr>
+                <w:noProof/>
+                <w:webHidden/>
+              </w:rPr>
+              <w:fldChar w:fldCharType="separate"/>
+            </w:r>
+            <w:r>
+              <w:rPr>
+                <w:noProof/>
+                <w:webHidden/>
+              </w:rPr>
+              <w:t>4</w:t>
+            </w:r>
+            <w:r>
+              <w:rPr>
+                <w:noProof/>
+                <w:webHidden/>
+              </w:rPr>
+              <w:fldChar w:fldCharType="end"/>
+            </w:r>
+          </w:hyperlink>
+        </w:p>
+        <w:p>
+          <w:pPr>
+            <w:pStyle w:val="TOC1"/>
+            <w:tabs>
+              <w:tab w:val="left" w:pos="480"/>
+              <w:tab w:val="right" w:leader="dot" w:pos="9736"/>
+            </w:tabs>
+            <w:jc w:val="both"/>
+            <w:rPr>
+              <w:rFonts w:eastAsiaTheme="minorEastAsia"/>
+              <w:noProof/>
+              <w:lang w:eastAsia="en-GB"/>
+            </w:rPr>
+          </w:pPr>
+          <w:hyperlink w:anchor="_Toc230027579" w:history="1">
+            <w:r>
+              <w:rPr>
+                <w:rStyle w:val="Hyperlink"/>
+                <w:rFonts w:asciiTheme="majorBidi" w:hAnsiTheme="majorBidi" w:cstheme="majorBidi"/>
+                <w:noProof/>
+                <w:lang w:val="en-US"/>
+              </w:rPr>
+              <w:t>4.</w:t>
+            </w:r>
+            <w:r>
+              <w:rPr>
+                <w:rFonts w:eastAsiaTheme="minorEastAsia"/>
+                <w:noProof/>
+                <w:lang w:eastAsia="en-GB"/>
+              </w:rPr>
+              <w:tab/>
+            </w:r>
+            <w:r>
+              <w:rPr>
+                <w:rStyle w:val="Hyperlink"/>
+                <w:rFonts w:asciiTheme="majorBidi" w:hAnsiTheme="majorBidi" w:cstheme="majorBidi"/>
+                <w:noProof/>
+                <w:lang w:val="en-US"/>
+              </w:rPr>
+              <w:t>Operators</w:t>
+            </w:r>
+            <w:r>
+              <w:rPr>
+                <w:noProof/>
+                <w:webHidden/>
+              </w:rPr>
+              <w:tab/>
+            </w:r>
+            <w:r>
+              <w:rPr>
+                <w:noProof/>
+                <w:webHidden/>
+              </w:rPr>
+              <w:fldChar w:fldCharType="begin"/>
+            </w:r>
+            <w:r>
+              <w:rPr>
+                <w:noProof/>
+                <w:webHidden/>
+              </w:rPr>
+              <w:instrText xml:space="preserve"> PAGEREF _Toc230027579 \h </w:instrText>
+            </w:r>
+            <w:r>
+              <w:rPr>
+                <w:noProof/>
+                <w:webHidden/>
+              </w:rPr>
+            </w:r>
+            <w:r>
+              <w:rPr>
+                <w:noProof/>
+                <w:webHidden/>
+              </w:rPr>
+              <w:fldChar w:fldCharType="separate"/>
+            </w:r>
+            <w:r>
+              <w:rPr>
+                <w:noProof/>
+                <w:webHidden/>
+              </w:rPr>
+              <w:t>4</w:t>
+            </w:r>
+            <w:r>
+              <w:rPr>
+                <w:noProof/>
+                <w:webHidden/>
+              </w:rPr>
+              <w:fldChar w:fldCharType="end"/>
+            </w:r>
+          </w:hyperlink>
+        </w:p>
+        <w:p>
+          <w:pPr>
+            <w:pStyle w:val="TOC1"/>
+            <w:tabs>
+              <w:tab w:val="left" w:pos="480"/>
+              <w:tab w:val="right" w:leader="dot" w:pos="9736"/>
+            </w:tabs>
+            <w:jc w:val="both"/>
+            <w:rPr>
+              <w:rFonts w:eastAsiaTheme="minorEastAsia"/>
+              <w:noProof/>
+              <w:lang w:eastAsia="en-GB"/>
+            </w:rPr>
+          </w:pPr>
+          <w:hyperlink w:anchor="_Toc230027580" w:history="1">
+            <w:r>
+              <w:rPr>
+                <w:rStyle w:val="Hyperlink"/>
+                <w:rFonts w:asciiTheme="majorBidi" w:hAnsiTheme="majorBidi" w:cstheme="majorBidi"/>
+                <w:noProof/>
+                <w:lang w:val="en-US"/>
+              </w:rPr>
+              <w:t>5.</w:t>
+            </w:r>
+            <w:r>
+              <w:rPr>
+                <w:rFonts w:eastAsiaTheme="minorEastAsia"/>
+                <w:noProof/>
+                <w:lang w:eastAsia="en-GB"/>
+              </w:rPr>
+              <w:tab/>
+            </w:r>
+            <w:r>
+              <w:rPr>
+                <w:rStyle w:val="Hyperlink"/>
+                <w:rFonts w:asciiTheme="majorBidi" w:hAnsiTheme="majorBidi" w:cstheme="majorBidi"/>
+                <w:noProof/>
+                <w:lang w:val="en-US"/>
+              </w:rPr>
+              <w:t>Expressions</w:t>
+            </w:r>
+            <w:r>
+              <w:rPr>
+                <w:noProof/>
+                <w:webHidden/>
+              </w:rPr>
+              <w:tab/>
+            </w:r>
+            <w:r>
+              <w:rPr>
+                <w:noProof/>
+                <w:webHidden/>
+              </w:rPr>
+              <w:fldChar w:fldCharType="begin"/>
+            </w:r>
+            <w:r>
+              <w:rPr>
+                <w:noProof/>
+                <w:webHidden/>
+              </w:rPr>
+              <w:instrText xml:space="preserve"> PAGEREF _Toc230027580 \h </w:instrText>
+            </w:r>
+            <w:r>
+              <w:rPr>
+                <w:noProof/>
+                <w:webHidden/>
+              </w:rPr>
+            </w:r>
+            <w:r>
+              <w:rPr>
+                <w:noProof/>
+                <w:webHidden/>
+              </w:rPr>
+              <w:fldChar w:fldCharType="separate"/>
+            </w:r>
+            <w:r>
+              <w:rPr>
+                <w:noProof/>
+                <w:webHidden/>
+              </w:rPr>
+              <w:t>4</w:t>
+            </w:r>
+            <w:r>
+              <w:rPr>
+                <w:noProof/>
+                <w:webHidden/>
+              </w:rPr>
+              <w:fldChar w:fldCharType="end"/>
+            </w:r>
+          </w:hyperlink>
+        </w:p>
+        <w:p>
+          <w:pPr>
+            <w:pStyle w:val="TOC1"/>
+            <w:tabs>
+              <w:tab w:val="left" w:pos="480"/>
+              <w:tab w:val="right" w:leader="dot" w:pos="9736"/>
+            </w:tabs>
+            <w:jc w:val="both"/>
+            <w:rPr>
+              <w:rFonts w:eastAsiaTheme="minorEastAsia"/>
+              <w:noProof/>
+              <w:lang w:eastAsia="en-GB"/>
+            </w:rPr>
+          </w:pPr>
+          <w:hyperlink w:anchor="_Toc230027581" w:history="1">
+            <w:r>
+              <w:rPr>
+                <w:rStyle w:val="Hyperlink"/>
+                <w:rFonts w:asciiTheme="majorBidi" w:hAnsiTheme="majorBidi" w:cstheme="majorBidi"/>
+                <w:noProof/>
+                <w:lang w:val="en-US"/>
+              </w:rPr>
+              <w:t>6.</w:t>
+            </w:r>
+            <w:r>
+              <w:rPr>
+                <w:rFonts w:eastAsiaTheme="minorEastAsia"/>
+                <w:noProof/>
+                <w:lang w:eastAsia="en-GB"/>
+              </w:rPr>
+              <w:tab/>
+            </w:r>
+            <w:r>
+              <w:rPr>
+                <w:rStyle w:val="Hyperlink"/>
+                <w:rFonts w:asciiTheme="majorBidi" w:hAnsiTheme="majorBidi" w:cstheme="majorBidi"/>
+                <w:noProof/>
+                <w:lang w:val="en-US"/>
+              </w:rPr>
+              <w:t>Statements</w:t>
+            </w:r>
+            <w:r>
+              <w:rPr>
+                <w:noProof/>
+                <w:webHidden/>
+              </w:rPr>
+              <w:tab/>
+            </w:r>
+            <w:r>
+              <w:rPr>
+                <w:noProof/>
+                <w:webHidden/>
+              </w:rPr>
+              <w:fldChar w:fldCharType="begin"/>
+            </w:r>
+            <w:r>
+              <w:rPr>
+                <w:noProof/>
+                <w:webHidden/>
+              </w:rPr>
+              <w:instrText xml:space="preserve"> PAGEREF _Toc230027581 \h </w:instrText>
+            </w:r>
+            <w:r>
+              <w:rPr>
+                <w:noProof/>
+                <w:webHidden/>
+              </w:rPr>
+            </w:r>
+            <w:r>
+              <w:rPr>
+                <w:noProof/>
+                <w:webHidden/>
+              </w:rPr>
+              <w:fldChar w:fldCharType="separate"/>
+            </w:r>
+            <w:r>
+              <w:rPr>
+                <w:noProof/>
+                <w:webHidden/>
+              </w:rPr>
+              <w:t>4</w:t>
+            </w:r>
+            <w:r>
+              <w:rPr>
+                <w:noProof/>
+                <w:webHidden/>
+              </w:rPr>
+              <w:fldChar w:fldCharType="end"/>
+            </w:r>
+          </w:hyperlink>
+        </w:p>
+        <w:p>
+          <w:pPr>
+            <w:pStyle w:val="TOC1"/>
+            <w:tabs>
+              <w:tab w:val="left" w:pos="480"/>
+              <w:tab w:val="right" w:leader="dot" w:pos="9736"/>
+            </w:tabs>
+            <w:jc w:val="both"/>
+            <w:rPr>
+              <w:rFonts w:eastAsiaTheme="minorEastAsia"/>
+              <w:noProof/>
+              <w:lang w:eastAsia="en-GB"/>
+            </w:rPr>
+          </w:pPr>
+          <w:hyperlink w:anchor="_Toc230027582" w:history="1">
+            <w:r>
+              <w:rPr>
+                <w:rStyle w:val="Hyperlink"/>
+                <w:rFonts w:asciiTheme="majorBidi" w:hAnsiTheme="majorBidi" w:cstheme="majorBidi"/>
+                <w:noProof/>
+                <w:lang w:val="en-US"/>
+              </w:rPr>
+              <w:t>7.</w:t>
+            </w:r>
+            <w:r>
+              <w:rPr>
+                <w:rFonts w:eastAsiaTheme="minorEastAsia"/>
+                <w:noProof/>
+                <w:lang w:eastAsia="en-GB"/>
+              </w:rPr>
+              <w:tab/>
+            </w:r>
+            <w:r>
+              <w:rPr>
+                <w:rStyle w:val="Hyperlink"/>
+                <w:rFonts w:asciiTheme="majorBidi" w:hAnsiTheme="majorBidi" w:cstheme="majorBidi"/>
+                <w:noProof/>
+                <w:lang w:val="en-US"/>
+              </w:rPr>
+              <w:t>Functions</w:t>
+            </w:r>
+            <w:r>
+              <w:rPr>
+                <w:noProof/>
+                <w:webHidden/>
+              </w:rPr>
+              <w:tab/>
+            </w:r>
+            <w:r>
+              <w:rPr>
+                <w:noProof/>
+                <w:webHidden/>
+              </w:rPr>
+              <w:fldChar w:fldCharType="begin"/>
+            </w:r>
+            <w:r>
+              <w:rPr>
+                <w:noProof/>
+                <w:webHidden/>
+              </w:rPr>
+              <w:instrText xml:space="preserve"> PAGEREF _Toc230027582 \h </w:instrText>
+            </w:r>
+            <w:r>
+              <w:rPr>
+                <w:noProof/>
+                <w:webHidden/>
+              </w:rPr>
+            </w:r>
+            <w:r>
+              <w:rPr>
+                <w:noProof/>
+                <w:webHidden/>
+              </w:rPr>
+              <w:fldChar w:fldCharType="separate"/>
+            </w:r>
+            <w:r>
+              <w:rPr>
+                <w:noProof/>
+                <w:webHidden/>
+              </w:rPr>
+              <w:t>4</w:t>
+            </w:r>
+            <w:r>
+              <w:rPr>
+                <w:noProof/>
+                <w:webHidden/>
+              </w:rPr>
+              <w:fldChar w:fldCharType="end"/>
+            </w:r>
+          </w:hyperlink>
+        </w:p>
+        <w:p>
+          <w:pPr>
+            <w:pStyle w:val="TOC1"/>
+            <w:tabs>
+              <w:tab w:val="left" w:pos="480"/>
+              <w:tab w:val="right" w:leader="dot" w:pos="9736"/>
+            </w:tabs>
+            <w:jc w:val="both"/>
+            <w:rPr>
+              <w:rFonts w:eastAsiaTheme="minorEastAsia"/>
+              <w:noProof/>
+              <w:lang w:eastAsia="en-GB"/>
+            </w:rPr>
+          </w:pPr>
+          <w:hyperlink w:anchor="_Toc230027583" w:history="1">
+            <w:r>
+              <w:rPr>
+                <w:rStyle w:val="Hyperlink"/>
+                <w:rFonts w:asciiTheme="majorBidi" w:hAnsiTheme="majorBidi" w:cstheme="majorBidi"/>
+                <w:noProof/>
+                <w:lang w:val="en-US"/>
+              </w:rPr>
+              <w:t>8.</w:t>
+            </w:r>
+            <w:r>
+              <w:rPr>
+                <w:rFonts w:eastAsiaTheme="minorEastAsia"/>
+                <w:noProof/>
+                <w:lang w:eastAsia="en-GB"/>
+              </w:rPr>
+              <w:tab/>
+            </w:r>
+            <w:r>
+              <w:rPr>
+                <w:rStyle w:val="Hyperlink"/>
+                <w:rFonts w:asciiTheme="majorBidi" w:hAnsiTheme="majorBidi" w:cstheme="majorBidi"/>
+                <w:noProof/>
+                <w:lang w:val="en-US"/>
+              </w:rPr>
+              <w:t>Classes</w:t>
+            </w:r>
+            <w:r>
+              <w:rPr>
+                <w:noProof/>
+                <w:webHidden/>
+              </w:rPr>
+              <w:tab/>
+            </w:r>
+            <w:r>
+              <w:rPr>
+                <w:noProof/>
+                <w:webHidden/>
+              </w:rPr>
+              <w:fldChar w:fldCharType="begin"/>
+            </w:r>
+            <w:r>
+              <w:rPr>
+                <w:noProof/>
+                <w:webHidden/>
+              </w:rPr>
+              <w:instrText xml:space="preserve"> PAGEREF _Toc230027583 \h </w:instrText>
+            </w:r>
+            <w:r>
+              <w:rPr>
+                <w:noProof/>
+                <w:webHidden/>
+              </w:rPr>
+            </w:r>
+            <w:r>
+              <w:rPr>
+                <w:noProof/>
+                <w:webHidden/>
+              </w:rPr>
+              <w:fldChar w:fldCharType="separate"/>
+            </w:r>
+            <w:r>
+              <w:rPr>
+                <w:noProof/>
+                <w:webHidden/>
+              </w:rPr>
+              <w:t>4</w:t>
+            </w:r>
+            <w:r>
+              <w:rPr>
+                <w:noProof/>
+                <w:webHidden/>
+              </w:rPr>
+              <w:fldChar w:fldCharType="end"/>
+            </w:r>
+          </w:hyperlink>
+        </w:p>
+        <w:p>
+          <w:pPr>
+            <w:pStyle w:val="TOC1"/>
+            <w:tabs>
+              <w:tab w:val="left" w:pos="480"/>
+              <w:tab w:val="right" w:leader="dot" w:pos="9736"/>
+            </w:tabs>
+            <w:jc w:val="both"/>
+            <w:rPr>
+              <w:rFonts w:eastAsiaTheme="minorEastAsia"/>
+              <w:noProof/>
+              <w:lang w:eastAsia="en-GB"/>
+            </w:rPr>
+          </w:pPr>
+          <w:hyperlink w:anchor="_Toc230027584" w:history="1">
+            <w:r>
+              <w:rPr>
+                <w:rStyle w:val="Hyperlink"/>
+                <w:rFonts w:asciiTheme="majorBidi" w:hAnsiTheme="majorBidi" w:cstheme="majorBidi"/>
+                <w:noProof/>
+                <w:lang w:val="en-US"/>
+              </w:rPr>
+              <w:t>9.</w:t>
+            </w:r>
+            <w:r>
+              <w:rPr>
+                <w:rFonts w:eastAsiaTheme="minorEastAsia"/>
+                <w:noProof/>
+                <w:lang w:eastAsia="en-GB"/>
+              </w:rPr>
+              <w:tab/>
+            </w:r>
+            <w:r>
+              <w:rPr>
+                <w:rStyle w:val="Hyperlink"/>
+                <w:rFonts w:asciiTheme="majorBidi" w:hAnsiTheme="majorBidi" w:cstheme="majorBidi"/>
+                <w:noProof/>
+                <w:lang w:val="en-US"/>
+              </w:rPr>
+              <w:t>Error Handling</w:t>
+            </w:r>
+            <w:r>
+              <w:rPr>
+                <w:noProof/>
+                <w:webHidden/>
+              </w:rPr>
+              <w:tab/>
+            </w:r>
+            <w:r>
+              <w:rPr>
+                <w:noProof/>
+                <w:webHidden/>
+              </w:rPr>
+              <w:fldChar w:fldCharType="begin"/>
+            </w:r>
+            <w:r>
+              <w:rPr>
+                <w:noProof/>
+                <w:webHidden/>
+              </w:rPr>
+              <w:instrText xml:space="preserve"> PAGEREF _Toc230027584 \h </w:instrText>
+            </w:r>
+            <w:r>
+              <w:rPr>
+                <w:noProof/>
+                <w:webHidden/>
+              </w:rPr>
+            </w:r>
+            <w:r>
+              <w:rPr>
+                <w:noProof/>
+                <w:webHidden/>
+              </w:rPr>
+              <w:fldChar w:fldCharType="separate"/>
+            </w:r>
+            <w:r>
+              <w:rPr>
+                <w:noProof/>
+                <w:webHidden/>
+              </w:rPr>
+              <w:t>4</w:t>
+            </w:r>
+            <w:r>
+              <w:rPr>
+                <w:noProof/>
+                <w:webHidden/>
+              </w:rPr>
+              <w:fldChar w:fldCharType="end"/>
+            </w:r>
+          </w:hyperlink>
+        </w:p>
+        <w:p>
+          <w:pPr>
+            <w:pStyle w:val="TOC1"/>
+            <w:tabs>
+              <w:tab w:val="left" w:pos="720"/>
+              <w:tab w:val="right" w:leader="dot" w:pos="9736"/>
+            </w:tabs>
+            <w:jc w:val="both"/>
+            <w:rPr>
+              <w:rFonts w:eastAsiaTheme="minorEastAsia"/>
+              <w:noProof/>
+              <w:lang w:eastAsia="en-GB"/>
+            </w:rPr>
+          </w:pPr>
+          <w:hyperlink w:anchor="_Toc230027585" w:history="1">
+            <w:r>
+              <w:rPr>
+                <w:rStyle w:val="Hyperlink"/>
+                <w:rFonts w:asciiTheme="majorBidi" w:hAnsiTheme="majorBidi" w:cstheme="majorBidi"/>
+                <w:noProof/>
+                <w:lang w:val="en-US"/>
+              </w:rPr>
+              <w:t>10.</w:t>
+            </w:r>
+            <w:r>
+              <w:rPr>
+                <w:rFonts w:eastAsiaTheme="minorEastAsia"/>
+                <w:noProof/>
+                <w:lang w:eastAsia="en-GB"/>
+              </w:rPr>
+              <w:tab/>
+            </w:r>
+            <w:r>
+              <w:rPr>
+                <w:rStyle w:val="Hyperlink"/>
+                <w:rFonts w:asciiTheme="majorBidi" w:hAnsiTheme="majorBidi" w:cstheme="majorBidi"/>
+                <w:noProof/>
+                <w:lang w:val="en-US"/>
+              </w:rPr>
+              <w:t>Modules</w:t>
+            </w:r>
+            <w:r>
+              <w:rPr>
+                <w:noProof/>
+                <w:webHidden/>
+              </w:rPr>
+              <w:tab/>
+            </w:r>
+            <w:r>
+              <w:rPr>
+                <w:noProof/>
+                <w:webHidden/>
+              </w:rPr>
+              <w:fldChar w:fldCharType="begin"/>
+            </w:r>
+            <w:r>
+              <w:rPr>
+                <w:noProof/>
+                <w:webHidden/>
+              </w:rPr>
+              <w:instrText xml:space="preserve"> PAGEREF _Toc230027585 \h </w:instrText>
+            </w:r>
+            <w:r>
+              <w:rPr>
+                <w:noProof/>
+                <w:webHidden/>
+              </w:rPr>
+            </w:r>
+            <w:r>
+              <w:rPr>
+                <w:noProof/>
+                <w:webHidden/>
+              </w:rPr>
+              <w:fldChar w:fldCharType="separate"/>
+            </w:r>
+            <w:r>
+              <w:rPr>
+                <w:noProof/>
+                <w:webHidden/>
+              </w:rPr>
+              <w:t>4</w:t>
+            </w:r>
+            <w:r>
+              <w:rPr>
+                <w:noProof/>
+                <w:webHidden/>
+              </w:rPr>
+              <w:fldChar w:fldCharType="end"/>
+            </w:r>
+          </w:hyperlink>
+        </w:p>
+        <w:p>
+          <w:pPr>
+            <w:pStyle w:val="TOC1"/>
+            <w:tabs>
+              <w:tab w:val="left" w:pos="720"/>
+              <w:tab w:val="right" w:leader="dot" w:pos="9736"/>
+            </w:tabs>
+            <w:jc w:val="both"/>
+            <w:rPr>
+              <w:rFonts w:eastAsiaTheme="minorEastAsia"/>
+              <w:noProof/>
+              <w:lang w:eastAsia="en-GB"/>
+            </w:rPr>
+          </w:pPr>
+          <w:hyperlink w:anchor="_Toc230027586" w:history="1">
+            <w:r>
+              <w:rPr>
+                <w:rStyle w:val="Hyperlink"/>
+                <w:rFonts w:asciiTheme="majorBidi" w:hAnsiTheme="majorBidi" w:cstheme="majorBidi"/>
+                <w:noProof/>
+                <w:lang w:val="en-US"/>
+              </w:rPr>
+              <w:t>11.</w:t>
+            </w:r>
+            <w:r>
+              <w:rPr>
+                <w:rFonts w:eastAsiaTheme="minorEastAsia"/>
+                <w:noProof/>
+                <w:lang w:eastAsia="en-GB"/>
+              </w:rPr>
+              <w:tab/>
+            </w:r>
+            <w:r>
+              <w:rPr>
+                <w:rStyle w:val="Hyperlink"/>
+                <w:rFonts w:asciiTheme="majorBidi" w:hAnsiTheme="majorBidi" w:cstheme="majorBidi"/>
+                <w:noProof/>
+                <w:lang w:val="en-US"/>
+              </w:rPr>
+              <w:t>Standard Library Reference</w:t>
+            </w:r>
+            <w:r>
+              <w:rPr>
+                <w:noProof/>
+                <w:webHidden/>
+              </w:rPr>
+              <w:tab/>
+            </w:r>
+            <w:r>
+              <w:rPr>
+                <w:noProof/>
+                <w:webHidden/>
+              </w:rPr>
+              <w:fldChar w:fldCharType="begin"/>
+            </w:r>
+            <w:r>
+              <w:rPr>
+                <w:noProof/>
+                <w:webHidden/>
+              </w:rPr>
+              <w:instrText xml:space="preserve"> PAGEREF _Toc230027586 \h </w:instrText>
+            </w:r>
+            <w:r>
+              <w:rPr>
+                <w:noProof/>
+                <w:webHidden/>
+              </w:rPr>
+            </w:r>
+            <w:r>
+              <w:rPr>
+                <w:noProof/>
+                <w:webHidden/>
+              </w:rPr>
+              <w:fldChar w:fldCharType="separate"/>
+            </w:r>
+            <w:r>
+              <w:rPr>
+                <w:noProof/>
+                <w:webHidden/>
+              </w:rPr>
+              <w:t>5</w:t>
+            </w:r>
+            <w:r>
+              <w:rPr>
+                <w:noProof/>
+                <w:webHidden/>
+              </w:rPr>
+              <w:fldChar w:fldCharType="end"/>
+            </w:r>
+          </w:hyperlink>
+        </w:p>
+        <w:p>
+          <w:pPr>
+            <w:pStyle w:val="TOC1"/>
+            <w:tabs>
+              <w:tab w:val="left" w:pos="720"/>
+              <w:tab w:val="right" w:leader="dot" w:pos="9736"/>
+            </w:tabs>
+            <w:jc w:val="both"/>
+            <w:rPr>
+              <w:rFonts w:eastAsiaTheme="minorEastAsia"/>
+              <w:noProof/>
+              <w:lang w:eastAsia="en-GB"/>
+            </w:rPr>
+          </w:pPr>
+          <w:hyperlink w:anchor="_Toc230027587" w:history="1">
+            <w:r>
+              <w:rPr>
+                <w:rStyle w:val="Hyperlink"/>
+                <w:rFonts w:asciiTheme="majorBidi" w:hAnsiTheme="majorBidi" w:cstheme="majorBidi"/>
+                <w:noProof/>
+                <w:lang w:val="en-US"/>
+              </w:rPr>
+              <w:t>12.</w:t>
+            </w:r>
+            <w:r>
+              <w:rPr>
+                <w:rFonts w:eastAsiaTheme="minorEastAsia"/>
+                <w:noProof/>
+                <w:lang w:eastAsia="en-GB"/>
+              </w:rPr>
+              <w:tab/>
+            </w:r>
+            <w:r>
+              <w:rPr>
+                <w:rStyle w:val="Hyperlink"/>
+                <w:rFonts w:asciiTheme="majorBidi" w:hAnsiTheme="majorBidi" w:cstheme="majorBidi"/>
+                <w:noProof/>
+                <w:lang w:val="en-US"/>
+              </w:rPr>
+              <w:t>The ML Pipeline</w:t>
+            </w:r>
+            <w:r>
+              <w:rPr>
+                <w:noProof/>
+                <w:webHidden/>
+              </w:rPr>
+              <w:tab/>
+            </w:r>
+            <w:r>
+              <w:rPr>
+                <w:noProof/>
+                <w:webHidden/>
+              </w:rPr>
+              <w:fldChar w:fldCharType="begin"/>
+            </w:r>
+            <w:r>
+              <w:rPr>
+                <w:noProof/>
+                <w:webHidden/>
+              </w:rPr>
+              <w:instrText xml:space="preserve"> PAGEREF _Toc230027587 \h </w:instrText>
+            </w:r>
+            <w:r>
+              <w:rPr>
+                <w:noProof/>
+                <w:webHidden/>
+              </w:rPr>
+            </w:r>
+            <w:r>
+              <w:rPr>
+                <w:noProof/>
+                <w:webHidden/>
+              </w:rPr>
+              <w:fldChar w:fldCharType="separate"/>
+            </w:r>
+            <w:r>
+              <w:rPr>
+                <w:noProof/>
+                <w:webHidden/>
+              </w:rPr>
+              <w:t>5</w:t>
+            </w:r>
+            <w:r>
+              <w:rPr>
+                <w:noProof/>
+                <w:webHidden/>
+              </w:rPr>
+              <w:fldChar w:fldCharType="end"/>
+            </w:r>
+          </w:hyperlink>
+        </w:p>
+        <w:p>
+          <w:pPr>
+            <w:pStyle w:val="TOC1"/>
+            <w:tabs>
+              <w:tab w:val="left" w:pos="720"/>
+              <w:tab w:val="right" w:leader="dot" w:pos="9736"/>
+            </w:tabs>
+            <w:jc w:val="both"/>
+            <w:rPr>
+              <w:rFonts w:eastAsiaTheme="minorEastAsia"/>
+              <w:noProof/>
+              <w:lang w:eastAsia="en-GB"/>
+            </w:rPr>
+          </w:pPr>
+          <w:hyperlink w:anchor="_Toc230027588" w:history="1">
+            <w:r>
+              <w:rPr>
+                <w:rStyle w:val="Hyperlink"/>
+                <w:rFonts w:asciiTheme="majorBidi" w:hAnsiTheme="majorBidi" w:cstheme="majorBidi"/>
+                <w:noProof/>
+                <w:lang w:val="en-US"/>
+              </w:rPr>
+              <w:t>13.</w:t>
+            </w:r>
+            <w:r>
+              <w:rPr>
+                <w:rFonts w:eastAsiaTheme="minorEastAsia"/>
+                <w:noProof/>
+                <w:lang w:eastAsia="en-GB"/>
+              </w:rPr>
+              <w:tab/>
+            </w:r>
+            <w:r>
+              <w:rPr>
+                <w:rStyle w:val="Hyperlink"/>
+                <w:rFonts w:asciiTheme="majorBidi" w:hAnsiTheme="majorBidi" w:cstheme="majorBidi"/>
+                <w:noProof/>
+                <w:lang w:val="en-US"/>
+              </w:rPr>
+              <w:t>Grammar Reference</w:t>
+            </w:r>
+            <w:r>
+              <w:rPr>
+                <w:noProof/>
+                <w:webHidden/>
+              </w:rPr>
+              <w:tab/>
+            </w:r>
+            <w:r>
+              <w:rPr>
+                <w:noProof/>
+                <w:webHidden/>
+              </w:rPr>
+              <w:fldChar w:fldCharType="begin"/>
+            </w:r>
+            <w:r>
+              <w:rPr>
+                <w:noProof/>
+                <w:webHidden/>
+              </w:rPr>
+              <w:instrText xml:space="preserve"> PAGEREF _Toc230027588 \h </w:instrText>
+            </w:r>
+            <w:r>
+              <w:rPr>
+                <w:noProof/>
+                <w:webHidden/>
+              </w:rPr>
+            </w:r>
+            <w:r>
+              <w:rPr>
+                <w:noProof/>
+                <w:webHidden/>
+              </w:rPr>
+              <w:fldChar w:fldCharType="separate"/>
+            </w:r>
+            <w:r>
+              <w:rPr>
+                <w:noProof/>
+                <w:webHidden/>
+              </w:rPr>
+              <w:t>5</w:t>
+            </w:r>
+            <w:r>
+              <w:rPr>
+                <w:noProof/>
+                <w:webHidden/>
+              </w:rPr>
+              <w:fldChar w:fldCharType="end"/>
+            </w:r>
+          </w:hyperlink>
+        </w:p>
+        <w:p>
+          <w:pPr>
+            <w:jc w:val="both"/>
+          </w:pPr>
           <w:r>
             <w:rPr>
               <w:b/>
@@ -506,6 +1862,17 @@
     </w:sdt>
     <w:p>
       <w:pPr>
+        <w:jc w:val="both"/>
+        <w:rPr>
+          <w:rFonts w:asciiTheme="majorBidi" w:hAnsiTheme="majorBidi" w:cstheme="majorBidi"/>
+          <w:lang w:val="en-US"/>
+        </w:rPr>
+      </w:pPr>
+    </w:p>
+    <w:p>
+      <w:pPr>
+        <w:ind w:left="426" w:hanging="426"/>
+        <w:jc w:val="both"/>
         <w:rPr>
           <w:rFonts w:asciiTheme="majorBidi" w:hAnsiTheme="majorBidi" w:cstheme="majorBidi"/>
           <w:lang w:val="en-US"/>
@@ -521,6 +1888,13 @@
     </w:p>
     <w:p>
       <w:pPr>
+        <w:pStyle w:val="ListParagraph"/>
+        <w:numPr>
+          <w:ilvl w:val="0"/>
+          <w:numId w:val="2"/>
+        </w:numPr>
+        <w:ind w:left="425" w:hanging="425"/>
+        <w:jc w:val="both"/>
         <w:outlineLvl w:val="0"/>
         <w:rPr>
           <w:rFonts w:asciiTheme="majorBidi" w:hAnsiTheme="majorBidi" w:cstheme="majorBidi"/>
@@ -529,7 +1903,7 @@
           <w:lang w:val="en-US"/>
         </w:rPr>
       </w:pPr>
-      <w:bookmarkStart w:id="0" w:name="_Toc228013451"/>
+      <w:bookmarkStart w:id="0" w:name="_Toc230027572"/>
       <w:r>
         <w:rPr>
           <w:rFonts w:asciiTheme="majorBidi" w:hAnsiTheme="majorBidi" w:cstheme="majorBidi"/>
@@ -547,77 +1921,77 @@
         <w:pStyle w:val="ListParagraph"/>
         <w:numPr>
           <w:ilvl w:val="1"/>
-          <w:numId w:val="1"/>
+          <w:numId w:val="2"/>
         </w:numPr>
-        <w:ind w:left="357" w:hanging="357"/>
+        <w:ind w:left="845"/>
+        <w:jc w:val="both"/>
         <w:outlineLvl w:val="1"/>
         <w:rPr>
           <w:rFonts w:asciiTheme="majorBidi" w:hAnsiTheme="majorBidi" w:cstheme="majorBidi"/>
-          <w:sz w:val="26"/>
-          <w:szCs w:val="26"/>
-          <w:lang w:val="en-US"/>
-        </w:rPr>
-      </w:pPr>
-      <w:bookmarkStart w:id="1" w:name="_Toc228013452"/>
-      <w:r>
-        <w:rPr>
-          <w:rFonts w:asciiTheme="majorBidi" w:hAnsiTheme="majorBidi" w:cstheme="majorBidi"/>
-          <w:sz w:val="26"/>
-          <w:szCs w:val="26"/>
-          <w:lang w:val="en-US"/>
-        </w:rPr>
-        <w:t>Purpose</w:t>
+          <w:lang w:val="en-US"/>
+        </w:rPr>
+      </w:pPr>
+      <w:bookmarkStart w:id="1" w:name="_Toc230027573"/>
+      <w:r>
+        <w:rPr>
+          <w:rFonts w:asciiTheme="majorBidi" w:hAnsiTheme="majorBidi" w:cstheme="majorBidi"/>
+          <w:lang w:val="en-US"/>
+        </w:rPr>
+        <w:t>Overview</w:t>
       </w:r>
       <w:bookmarkEnd w:id="1"/>
     </w:p>
     <w:p>
       <w:pPr>
         <w:pStyle w:val="ListParagraph"/>
-        <w:ind w:left="360"/>
-        <w:rPr>
-          <w:rFonts w:asciiTheme="majorBidi" w:hAnsiTheme="majorBidi" w:cstheme="majorBidi"/>
-          <w:lang w:val="en-US"/>
-        </w:rPr>
-      </w:pPr>
-      <w:r>
-        <w:rPr>
-          <w:rFonts w:asciiTheme="majorBidi" w:hAnsiTheme="majorBidi" w:cstheme="majorBidi"/>
-          <w:lang w:val="en-US"/>
-        </w:rPr>
-        <w:t>Pulse is a programming language built for AI and machine learning development. It is designed to eliminate the gap between how ML workflows are conceptually described and how they are actually written in code. In conventional languages, a data scientist must import tensor libraries, instantiate model objects from external frameworks, and manually compose transformation pipelines, none of which are concepts the language itself understands. Pulse treats these as core language constructs, not library dependencies.</w:t>
-      </w:r>
-    </w:p>
-    <w:p>
-      <w:pPr>
-        <w:pStyle w:val="ListParagraph"/>
-        <w:ind w:left="360"/>
-        <w:rPr>
-          <w:rFonts w:asciiTheme="majorBidi" w:hAnsiTheme="majorBidi" w:cstheme="majorBidi"/>
-          <w:lang w:val="en-US"/>
-        </w:rPr>
-      </w:pPr>
-    </w:p>
-    <w:p>
-      <w:pPr>
-        <w:pStyle w:val="ListParagraph"/>
-        <w:ind w:left="360"/>
-        <w:rPr>
-          <w:rFonts w:asciiTheme="majorBidi" w:hAnsiTheme="majorBidi" w:cstheme="majorBidi"/>
-          <w:lang w:val="en-US"/>
-        </w:rPr>
-      </w:pPr>
-      <w:r>
-        <w:rPr>
-          <w:rFonts w:asciiTheme="majorBidi" w:hAnsiTheme="majorBidi" w:cstheme="majorBidi"/>
-          <w:lang w:val="en-US"/>
-        </w:rPr>
-        <w:t>The language targets three groups: AI developers who prototype models frequently, researchers who need expressive and readable experiment code, and students learning ML concepts without the overhead of a general-purpose language’s ecosystem.</w:t>
-      </w:r>
-    </w:p>
-    <w:p>
-      <w:pPr>
-        <w:pStyle w:val="ListParagraph"/>
-        <w:ind w:left="360"/>
+        <w:ind w:left="846"/>
+        <w:jc w:val="both"/>
+        <w:rPr>
+          <w:rFonts w:asciiTheme="majorBidi" w:hAnsiTheme="majorBidi" w:cstheme="majorBidi"/>
+          <w:lang w:val="en-US"/>
+        </w:rPr>
+      </w:pPr>
+      <w:r>
+        <w:rPr>
+          <w:rFonts w:asciiTheme="majorBidi" w:hAnsiTheme="majorBidi" w:cstheme="majorBidi"/>
+          <w:lang w:val="en-US"/>
+        </w:rPr>
+        <w:t xml:space="preserve">Pulse is a domain-specific programming language designed for artificial intelligence and machine learning. </w:t>
+      </w:r>
+      <w:r>
+        <w:rPr>
+          <w:rFonts w:asciiTheme="majorBidi" w:hAnsiTheme="majorBidi" w:cstheme="majorBidi"/>
+          <w:lang w:val="en-US"/>
+        </w:rPr>
+        <w:t>Although focused on ML, it also supports general-purpose programming.</w:t>
+      </w:r>
+      <w:r>
+        <w:rPr>
+          <w:rFonts w:asciiTheme="majorBidi" w:hAnsiTheme="majorBidi" w:cstheme="majorBidi"/>
+          <w:lang w:val="en-US"/>
+        </w:rPr>
+        <w:t xml:space="preserve"> </w:t>
+      </w:r>
+      <w:r>
+        <w:rPr>
+          <w:rFonts w:asciiTheme="majorBidi" w:hAnsiTheme="majorBidi" w:cstheme="majorBidi"/>
+          <w:lang w:val="en-US"/>
+        </w:rPr>
+        <w:t xml:space="preserve">It is implemented </w:t>
+      </w:r>
+      <w:r>
+        <w:rPr>
+          <w:rFonts w:asciiTheme="majorBidi" w:hAnsiTheme="majorBidi" w:cstheme="majorBidi"/>
+          <w:lang w:val="en-US"/>
+        </w:rPr>
+        <w:t>entirely from scratch in Python, with performance-critical components offloaded to C/C++ for efficiency. Unlike general-purpose languages that treat machine learning as an afterthought addressed through third-party libraries, Pulse is built around AI from the ground up – the language itself understands tensors, models, and datasets as native constructs rather than imported abstractions. Pulse v1.0 is the first stable release of the language and covers the full pipeline from data loading to model training and evaluation.</w:t>
+      </w:r>
+    </w:p>
+    <w:p>
+      <w:pPr>
+        <w:pStyle w:val="ListParagraph"/>
+        <w:ind w:left="846"/>
+        <w:jc w:val="both"/>
         <w:rPr>
           <w:rFonts w:asciiTheme="majorBidi" w:hAnsiTheme="majorBidi" w:cstheme="majorBidi"/>
           <w:lang w:val="en-US"/>
@@ -629,220 +2003,1648 @@
         <w:pStyle w:val="ListParagraph"/>
         <w:numPr>
           <w:ilvl w:val="1"/>
-          <w:numId w:val="1"/>
+          <w:numId w:val="2"/>
         </w:numPr>
-        <w:ind w:left="357" w:hanging="357"/>
+        <w:ind w:left="845"/>
+        <w:jc w:val="both"/>
         <w:outlineLvl w:val="1"/>
         <w:rPr>
           <w:rFonts w:asciiTheme="majorBidi" w:hAnsiTheme="majorBidi" w:cstheme="majorBidi"/>
-          <w:sz w:val="26"/>
-          <w:szCs w:val="26"/>
-          <w:lang w:val="en-US"/>
-        </w:rPr>
-      </w:pPr>
-      <w:bookmarkStart w:id="2" w:name="_Toc228013453"/>
-      <w:r>
-        <w:rPr>
-          <w:rFonts w:asciiTheme="majorBidi" w:hAnsiTheme="majorBidi" w:cstheme="majorBidi"/>
-          <w:sz w:val="26"/>
-          <w:szCs w:val="26"/>
+          <w:lang w:val="en-US"/>
+        </w:rPr>
+      </w:pPr>
+      <w:bookmarkStart w:id="2" w:name="_Toc230027574"/>
+      <w:r>
+        <w:rPr>
+          <w:rFonts w:asciiTheme="majorBidi" w:hAnsiTheme="majorBidi" w:cstheme="majorBidi"/>
+          <w:lang w:val="en-US"/>
+        </w:rPr>
+        <w:t>Motivation</w:t>
+      </w:r>
+      <w:bookmarkEnd w:id="2"/>
+    </w:p>
+    <w:p>
+      <w:pPr>
+        <w:pStyle w:val="ListParagraph"/>
+        <w:ind w:left="846"/>
+        <w:jc w:val="both"/>
+        <w:rPr>
+          <w:rFonts w:asciiTheme="majorBidi" w:hAnsiTheme="majorBidi" w:cstheme="majorBidi"/>
+          <w:lang w:val="en-US"/>
+        </w:rPr>
+      </w:pPr>
+      <w:r>
+        <w:rPr>
+          <w:rFonts w:asciiTheme="majorBidi" w:hAnsiTheme="majorBidi" w:cstheme="majorBidi"/>
+          <w:lang w:val="en-US"/>
+        </w:rPr>
+        <w:t xml:space="preserve">Modern AI development relies on a fragmented ecosystem of external libraries. A typical Python ML project imports NumPy for numerical arrays, pandas for data manipulation, scikit-learn for models, and several other packages just to get started. Each of these libraries has its own API design, its own conventions, and its own learning curve, creating significant friction especially for developers who are new to the field. Pulse addresses this problem directly by treating AI constructs as native language features </w:t>
+      </w:r>
+      <w:r>
+        <w:rPr>
+          <w:rFonts w:asciiTheme="majorBidi" w:hAnsiTheme="majorBidi" w:cstheme="majorBidi"/>
+          <w:lang w:val="en-US"/>
+        </w:rPr>
+        <w:t>rather than imported dependencies. Tensors and their operations are first-class values in the language with dedicated syntax and semantics. The standard library provides datasets, models, preprocessing utilities, evaluation metrics, and educational tooling as integral parts of the language itself, so a complete ML workflow requires no external imports at all.</w:t>
+      </w:r>
+    </w:p>
+    <w:p>
+      <w:pPr>
+        <w:pStyle w:val="ListParagraph"/>
+        <w:ind w:left="846"/>
+        <w:jc w:val="both"/>
+        <w:rPr>
+          <w:rFonts w:asciiTheme="majorBidi" w:hAnsiTheme="majorBidi" w:cstheme="majorBidi"/>
+          <w:lang w:val="en-US"/>
+        </w:rPr>
+      </w:pPr>
+    </w:p>
+    <w:p>
+      <w:pPr>
+        <w:pStyle w:val="ListParagraph"/>
+        <w:numPr>
+          <w:ilvl w:val="1"/>
+          <w:numId w:val="2"/>
+        </w:numPr>
+        <w:ind w:left="845"/>
+        <w:jc w:val="both"/>
+        <w:outlineLvl w:val="1"/>
+        <w:rPr>
+          <w:rFonts w:asciiTheme="majorBidi" w:hAnsiTheme="majorBidi" w:cstheme="majorBidi"/>
+          <w:lang w:val="en-US"/>
+        </w:rPr>
+      </w:pPr>
+      <w:bookmarkStart w:id="3" w:name="_Toc230027575"/>
+      <w:r>
+        <w:rPr>
+          <w:rFonts w:asciiTheme="majorBidi" w:hAnsiTheme="majorBidi" w:cstheme="majorBidi"/>
           <w:lang w:val="en-US"/>
         </w:rPr>
         <w:t>Design Goals</w:t>
       </w:r>
-      <w:bookmarkEnd w:id="2"/>
-    </w:p>
-    <w:p>
-      <w:pPr>
-        <w:pStyle w:val="ListParagraph"/>
-        <w:ind w:left="360"/>
-        <w:rPr>
-          <w:rFonts w:asciiTheme="majorBidi" w:hAnsiTheme="majorBidi" w:cstheme="majorBidi"/>
-          <w:lang w:val="en-US"/>
-        </w:rPr>
-      </w:pPr>
-      <w:r>
-        <w:rPr>
-          <w:rFonts w:asciiTheme="majorBidi" w:hAnsiTheme="majorBidi" w:cstheme="majorBidi"/>
-          <w:lang w:val="en-US"/>
-        </w:rPr>
-        <w:t>AI-first syntax: Tensors, models, and pipelines are language-level constructs. They are not imported from external sources; they exist natively in the language.</w:t>
-      </w:r>
-    </w:p>
-    <w:p>
-      <w:pPr>
-        <w:pStyle w:val="ListParagraph"/>
-        <w:ind w:left="360"/>
-        <w:rPr>
-          <w:rFonts w:asciiTheme="majorBidi" w:hAnsiTheme="majorBidi" w:cstheme="majorBidi"/>
-          <w:lang w:val="en-US"/>
-        </w:rPr>
-      </w:pPr>
-    </w:p>
-    <w:p>
-      <w:pPr>
-        <w:pStyle w:val="ListParagraph"/>
-        <w:ind w:left="360"/>
-        <w:rPr>
-          <w:rFonts w:asciiTheme="majorBidi" w:hAnsiTheme="majorBidi" w:cstheme="majorBidi"/>
-          <w:lang w:val="en-US"/>
-        </w:rPr>
-      </w:pPr>
-      <w:r>
-        <w:rPr>
-          <w:rFonts w:asciiTheme="majorBidi" w:hAnsiTheme="majorBidi" w:cstheme="majorBidi"/>
-          <w:lang w:val="en-US"/>
-        </w:rPr>
-        <w:t>Minimal boilerplate: A model can be declared, trained, and used for inference in three lines. The language does not require type annotations, class hierarchies, or configuration objects to perform standard ML tasks.</w:t>
-      </w:r>
-    </w:p>
-    <w:p>
-      <w:pPr>
-        <w:pStyle w:val="ListParagraph"/>
-        <w:ind w:left="360"/>
-        <w:rPr>
-          <w:rFonts w:asciiTheme="majorBidi" w:hAnsiTheme="majorBidi" w:cstheme="majorBidi"/>
-          <w:lang w:val="en-US"/>
-        </w:rPr>
-      </w:pPr>
-    </w:p>
-    <w:p>
-      <w:pPr>
-        <w:pStyle w:val="ListParagraph"/>
-        <w:ind w:left="360"/>
-        <w:rPr>
-          <w:rFonts w:asciiTheme="majorBidi" w:hAnsiTheme="majorBidi" w:cstheme="majorBidi"/>
-          <w:lang w:val="en-US"/>
-        </w:rPr>
-      </w:pPr>
-      <w:r>
-        <w:rPr>
-          <w:rFonts w:asciiTheme="majorBidi" w:hAnsiTheme="majorBidi" w:cstheme="majorBidi"/>
-          <w:lang w:val="en-US"/>
-        </w:rPr>
-        <w:t>Uniform model interface: Every ML model in Pulse exposes the same interface, i.e., .train(), .predict(), .score() regardless of the underlying algorithm. This makes models interchangeable without API changes.</w:t>
-      </w:r>
-    </w:p>
-    <w:p>
-      <w:pPr>
-        <w:pStyle w:val="ListParagraph"/>
-        <w:ind w:left="360"/>
-        <w:rPr>
-          <w:rFonts w:asciiTheme="majorBidi" w:hAnsiTheme="majorBidi" w:cstheme="majorBidi"/>
-          <w:lang w:val="en-US"/>
-        </w:rPr>
-      </w:pPr>
-    </w:p>
-    <w:p>
-      <w:pPr>
-        <w:pStyle w:val="ListParagraph"/>
-        <w:ind w:left="360"/>
-        <w:rPr>
-          <w:rFonts w:asciiTheme="majorBidi" w:hAnsiTheme="majorBidi" w:cstheme="majorBidi"/>
-          <w:lang w:val="en-US"/>
-        </w:rPr>
-      </w:pPr>
-      <w:r>
-        <w:rPr>
-          <w:rFonts w:asciiTheme="majorBidi" w:hAnsiTheme="majorBidi" w:cstheme="majorBidi"/>
-          <w:lang w:val="en-US"/>
-        </w:rPr>
-        <w:t>Pipeline-oriented data flow: The |&gt; operator allows data transformations to be expressed as linear chains rather than nested function calls, reflecting how ML preprocessing pipelines are naturally described.</w:t>
-      </w:r>
-    </w:p>
-    <w:p>
-      <w:pPr>
-        <w:pStyle w:val="ListParagraph"/>
-        <w:ind w:left="360"/>
-        <w:rPr>
-          <w:rFonts w:asciiTheme="majorBidi" w:hAnsiTheme="majorBidi" w:cstheme="majorBidi"/>
-          <w:lang w:val="en-US"/>
-        </w:rPr>
-      </w:pPr>
-    </w:p>
-    <w:p>
-      <w:pPr>
-        <w:pStyle w:val="ListParagraph"/>
-        <w:ind w:left="360"/>
-        <w:rPr>
-          <w:rFonts w:asciiTheme="majorBidi" w:hAnsiTheme="majorBidi" w:cstheme="majorBidi"/>
-          <w:lang w:val="en-US"/>
-        </w:rPr>
-      </w:pPr>
-      <w:r>
-        <w:rPr>
-          <w:rFonts w:asciiTheme="majorBidi" w:hAnsiTheme="majorBidi" w:cstheme="majorBidi"/>
-          <w:lang w:val="en-US"/>
-        </w:rPr>
-        <w:t>Readable error reporting: Runtime errors, include source location, line context, and a visual pointer to the offending token. This is built into the language, not added as a debugging tool.</w:t>
-      </w:r>
-    </w:p>
-    <w:p>
-      <w:pPr>
-        <w:pStyle w:val="ListParagraph"/>
-        <w:ind w:left="360"/>
-        <w:rPr>
-          <w:rFonts w:asciiTheme="majorBidi" w:hAnsiTheme="majorBidi" w:cstheme="majorBidi"/>
-          <w:lang w:val="en-US"/>
-        </w:rPr>
-      </w:pPr>
-    </w:p>
-    <w:p>
-      <w:pPr>
-        <w:pStyle w:val="ListParagraph"/>
-        <w:ind w:left="360"/>
-        <w:rPr>
-          <w:rFonts w:asciiTheme="majorBidi" w:hAnsiTheme="majorBidi" w:cstheme="majorBidi"/>
-          <w:lang w:val="en-US"/>
-        </w:rPr>
-      </w:pPr>
-      <w:r>
-        <w:rPr>
-          <w:rFonts w:asciiTheme="majorBidi" w:hAnsiTheme="majorBidi" w:cstheme="majorBidi"/>
-          <w:lang w:val="en-US"/>
-        </w:rPr>
-        <w:t>Interpreter-based and portable: Pulse runs on a tree-walking interpreter implemented in Python. It requires no compilation step and no build toolchain, making it suitable for rapid experimentation.</w:t>
-      </w:r>
-    </w:p>
-    <w:p>
-      <w:pPr>
-        <w:pStyle w:val="ListParagraph"/>
-        <w:ind w:left="360"/>
-        <w:rPr>
-          <w:rFonts w:asciiTheme="majorBidi" w:hAnsiTheme="majorBidi" w:cstheme="majorBidi"/>
-          <w:lang w:val="en-US"/>
-        </w:rPr>
-      </w:pPr>
-    </w:p>
-    <w:p>
-      <w:pPr>
-        <w:pStyle w:val="ListParagraph"/>
-        <w:ind w:left="360"/>
-        <w:rPr>
-          <w:rFonts w:asciiTheme="majorBidi" w:hAnsiTheme="majorBidi" w:cstheme="majorBidi"/>
-          <w:lang w:val="en-US"/>
-        </w:rPr>
-      </w:pPr>
-      <w:r>
-        <w:rPr>
-          <w:rFonts w:asciiTheme="majorBidi" w:hAnsiTheme="majorBidi" w:cstheme="majorBidi"/>
-          <w:lang w:val="en-US"/>
-        </w:rPr>
-        <w:t>Familiar syntax for Python users: Pulse uses indentation-based block structure and a syntax influenced by Python, lowering the barrier to entry for the largest existing ML developer community.</w:t>
-      </w:r>
-    </w:p>
-    <w:p>
-      <w:pPr>
-        <w:rPr>
-          <w:rFonts w:asciiTheme="majorBidi" w:hAnsiTheme="majorBidi" w:cstheme="majorBidi"/>
-          <w:lang w:val="en-US"/>
-        </w:rPr>
-      </w:pPr>
-    </w:p>
-    <w:p>
-      <w:pPr>
-        <w:rPr>
-          <w:rFonts w:asciiTheme="majorBidi" w:hAnsiTheme="majorBidi" w:cstheme="majorBidi"/>
+      <w:bookmarkEnd w:id="3"/>
+    </w:p>
+    <w:p>
+      <w:pPr>
+        <w:pStyle w:val="ListParagraph"/>
+        <w:ind w:left="846"/>
+        <w:jc w:val="both"/>
+        <w:rPr>
+          <w:rFonts w:asciiTheme="majorBidi" w:hAnsiTheme="majorBidi" w:cstheme="majorBidi"/>
+          <w:lang w:val="en-US"/>
+        </w:rPr>
+      </w:pPr>
+      <w:r>
+        <w:rPr>
+          <w:rFonts w:asciiTheme="majorBidi" w:hAnsiTheme="majorBidi" w:cstheme="majorBidi"/>
+          <w:lang w:val="en-US"/>
+        </w:rPr>
+        <w:t xml:space="preserve">Pulse was designed around four core principles. First, it should be </w:t>
+      </w:r>
+      <w:r>
+        <w:rPr>
+          <w:rFonts w:asciiTheme="majorBidi" w:hAnsiTheme="majorBidi" w:cstheme="majorBidi"/>
+          <w:b/>
+          <w:bCs/>
+          <w:lang w:val="en-US"/>
+        </w:rPr>
+        <w:t>AI-native</w:t>
+      </w:r>
+      <w:r>
+        <w:rPr>
+          <w:rFonts w:asciiTheme="majorBidi" w:hAnsiTheme="majorBidi" w:cstheme="majorBidi"/>
+          <w:lang w:val="en-US"/>
+        </w:rPr>
+        <w:t xml:space="preserve"> – tensors, models, and datasets are built into the language rather than bolted on through libraries, giving them consistent syntax and deep integration with the rest of the language. Second, it should be </w:t>
+      </w:r>
+      <w:r>
+        <w:rPr>
+          <w:rFonts w:asciiTheme="majorBidi" w:hAnsiTheme="majorBidi" w:cstheme="majorBidi"/>
+          <w:b/>
+          <w:bCs/>
+          <w:lang w:val="en-US"/>
+        </w:rPr>
+        <w:t>accessible</w:t>
+      </w:r>
+      <w:r>
+        <w:rPr>
+          <w:rFonts w:asciiTheme="majorBidi" w:hAnsiTheme="majorBidi" w:cstheme="majorBidi"/>
+          <w:lang w:val="en-US"/>
+        </w:rPr>
+        <w:t xml:space="preserve"> – the syntax is clean, readable, and familiar to anyone with experience in modern scripting languages, keeping the barrier to entry low. Third it should be </w:t>
+      </w:r>
+      <w:r>
+        <w:rPr>
+          <w:rFonts w:asciiTheme="majorBidi" w:hAnsiTheme="majorBidi" w:cstheme="majorBidi"/>
+          <w:b/>
+          <w:bCs/>
+          <w:lang w:val="en-US"/>
+        </w:rPr>
+        <w:t>educational</w:t>
+      </w:r>
+      <w:r>
+        <w:rPr>
+          <w:rFonts w:asciiTheme="majorBidi" w:hAnsiTheme="majorBidi" w:cstheme="majorBidi"/>
+          <w:lang w:val="en-US"/>
+        </w:rPr>
+        <w:t xml:space="preserve"> – the </w:t>
+      </w:r>
+      <w:r>
+        <w:rPr>
+          <w:rStyle w:val="CodeChar"/>
+        </w:rPr>
+        <w:t>learn</w:t>
+      </w:r>
+      <w:r>
+        <w:rPr>
+          <w:rFonts w:asciiTheme="majorBidi" w:hAnsiTheme="majorBidi" w:cstheme="majorBidi"/>
+          <w:lang w:val="en-US"/>
+        </w:rPr>
+        <w:t xml:space="preserve"> standard library module provides interactive step-by-step walkthroughs of common ML algorithms, so students can follow full pipeline. Fourth, it should be </w:t>
+      </w:r>
+      <w:r>
+        <w:rPr>
+          <w:rFonts w:asciiTheme="majorBidi" w:hAnsiTheme="majorBidi" w:cstheme="majorBidi"/>
+          <w:b/>
+          <w:bCs/>
+          <w:lang w:val="en-US"/>
+        </w:rPr>
+        <w:t>self-contained</w:t>
+      </w:r>
+      <w:r>
+        <w:rPr>
+          <w:rFonts w:asciiTheme="majorBidi" w:hAnsiTheme="majorBidi" w:cstheme="majorBidi"/>
+          <w:lang w:val="en-US"/>
+        </w:rPr>
+        <w:t xml:space="preserve"> – a Pulse program can load a dataset, preprocess it, train a model, evaluate performance, and explain what the model learned, all without a single external import statement.</w:t>
+      </w:r>
+    </w:p>
+    <w:p>
+      <w:pPr>
+        <w:pStyle w:val="ListParagraph"/>
+        <w:ind w:left="846"/>
+        <w:jc w:val="both"/>
+        <w:rPr>
+          <w:rFonts w:asciiTheme="majorBidi" w:hAnsiTheme="majorBidi" w:cstheme="majorBidi"/>
+          <w:lang w:val="en-US"/>
+        </w:rPr>
+      </w:pPr>
+    </w:p>
+    <w:p>
+      <w:pPr>
+        <w:pStyle w:val="ListParagraph"/>
+        <w:numPr>
+          <w:ilvl w:val="1"/>
+          <w:numId w:val="2"/>
+        </w:numPr>
+        <w:ind w:left="845"/>
+        <w:jc w:val="both"/>
+        <w:outlineLvl w:val="1"/>
+        <w:rPr>
+          <w:rFonts w:asciiTheme="majorBidi" w:hAnsiTheme="majorBidi" w:cstheme="majorBidi"/>
+          <w:lang w:val="en-US"/>
+        </w:rPr>
+      </w:pPr>
+      <w:bookmarkStart w:id="4" w:name="_Toc230027576"/>
+      <w:r>
+        <w:rPr>
+          <w:rFonts w:asciiTheme="majorBidi" w:hAnsiTheme="majorBidi" w:cstheme="majorBidi"/>
+          <w:lang w:val="en-US"/>
+        </w:rPr>
+        <w:t>Intended Audience</w:t>
+      </w:r>
+      <w:bookmarkEnd w:id="4"/>
+    </w:p>
+    <w:p>
+      <w:pPr>
+        <w:pStyle w:val="ListParagraph"/>
+        <w:ind w:left="846"/>
+        <w:jc w:val="both"/>
+        <w:rPr>
+          <w:rFonts w:asciiTheme="majorBidi" w:hAnsiTheme="majorBidi" w:cstheme="majorBidi"/>
+          <w:lang w:val="en-US"/>
+        </w:rPr>
+      </w:pPr>
+      <w:r>
+        <w:rPr>
+          <w:rFonts w:asciiTheme="majorBidi" w:hAnsiTheme="majorBidi" w:cstheme="majorBidi"/>
+          <w:lang w:val="en-US"/>
+        </w:rPr>
+        <w:t xml:space="preserve">Pulse is designed for anyone who wants to write AI programs, regardless of their background or experience level. Students learning machine learning for the first time will find the clean syntax, built-in datasets, and educational tooling approachable and forgiving. Engineers prototyping models quickly will appreciate that the full ML pipeline is available without any setup or dependency management. The language intentionally does not target low-level systems programming or web development – it is focused specifically on the AI domain and </w:t>
+      </w:r>
+      <w:r>
+        <w:rPr>
+          <w:rFonts w:asciiTheme="majorBidi" w:hAnsiTheme="majorBidi" w:cstheme="majorBidi"/>
+          <w:lang w:val="en-US"/>
+        </w:rPr>
+        <w:lastRenderedPageBreak/>
+        <w:t>optimized for that use case. This focus allows the language to make design decisions, like tensor literals and native model types, that a general-purpose language could not justify.</w:t>
+      </w:r>
+    </w:p>
+    <w:p>
+      <w:pPr>
+        <w:pStyle w:val="ListParagraph"/>
+        <w:ind w:left="426"/>
+        <w:jc w:val="both"/>
+        <w:rPr>
+          <w:rFonts w:asciiTheme="majorBidi" w:hAnsiTheme="majorBidi" w:cstheme="majorBidi"/>
+          <w:lang w:val="en-US"/>
+        </w:rPr>
+      </w:pPr>
+    </w:p>
+    <w:p>
+      <w:pPr>
+        <w:pStyle w:val="ListParagraph"/>
+        <w:numPr>
+          <w:ilvl w:val="0"/>
+          <w:numId w:val="2"/>
+        </w:numPr>
+        <w:ind w:left="425" w:hanging="425"/>
+        <w:jc w:val="both"/>
+        <w:outlineLvl w:val="0"/>
+        <w:rPr>
+          <w:rFonts w:asciiTheme="majorBidi" w:hAnsiTheme="majorBidi" w:cstheme="majorBidi"/>
+          <w:sz w:val="28"/>
+          <w:szCs w:val="28"/>
+          <w:lang w:val="en-US"/>
+        </w:rPr>
+      </w:pPr>
+      <w:bookmarkStart w:id="5" w:name="_Toc230027577"/>
+      <w:r>
+        <w:rPr>
+          <w:rFonts w:asciiTheme="majorBidi" w:hAnsiTheme="majorBidi" w:cstheme="majorBidi"/>
+          <w:sz w:val="28"/>
+          <w:szCs w:val="28"/>
+          <w:lang w:val="en-US"/>
+        </w:rPr>
+        <w:t>Lexical Structure</w:t>
+      </w:r>
+      <w:bookmarkEnd w:id="5"/>
+    </w:p>
+    <w:p>
+      <w:pPr>
+        <w:pStyle w:val="ListParagraph"/>
+        <w:numPr>
+          <w:ilvl w:val="1"/>
+          <w:numId w:val="2"/>
+        </w:numPr>
+        <w:ind w:left="845"/>
+        <w:jc w:val="both"/>
+        <w:outlineLvl w:val="1"/>
+        <w:rPr>
+          <w:rFonts w:asciiTheme="majorBidi" w:hAnsiTheme="majorBidi" w:cstheme="majorBidi"/>
+          <w:lang w:val="en-US"/>
+        </w:rPr>
+      </w:pPr>
+      <w:r>
+        <w:rPr>
+          <w:rFonts w:asciiTheme="majorBidi" w:hAnsiTheme="majorBidi" w:cstheme="majorBidi"/>
+          <w:lang w:val="en-US"/>
+        </w:rPr>
+        <w:t>Source Encoding</w:t>
+      </w:r>
+    </w:p>
+    <w:p>
+      <w:pPr>
+        <w:pStyle w:val="ListParagraph"/>
+        <w:ind w:left="846"/>
+        <w:jc w:val="both"/>
+        <w:rPr>
+          <w:rFonts w:asciiTheme="majorBidi" w:hAnsiTheme="majorBidi" w:cstheme="majorBidi"/>
+          <w:lang w:val="en-US"/>
+        </w:rPr>
+      </w:pPr>
+      <w:r>
+        <w:rPr>
+          <w:rFonts w:asciiTheme="majorBidi" w:hAnsiTheme="majorBidi" w:cstheme="majorBidi"/>
+          <w:lang w:val="en-US"/>
+        </w:rPr>
+        <w:t xml:space="preserve">Pulse source files are plain text encoded in UTF-8. Source files use the </w:t>
+      </w:r>
+      <w:r>
+        <w:rPr>
+          <w:rStyle w:val="CodeChar"/>
+        </w:rPr>
+        <w:t>.pul</w:t>
+      </w:r>
+      <w:r>
+        <w:rPr>
+          <w:rFonts w:asciiTheme="majorBidi" w:hAnsiTheme="majorBidi" w:cstheme="majorBidi"/>
+          <w:lang w:val="en-US"/>
+        </w:rPr>
+        <w:t xml:space="preserve"> file extension by convention. The lexer reads the entire source file as a single string before tokenization begins, allowing it to report precise error messages with line numbers, column positions, and source context for every lexical error it </w:t>
+      </w:r>
+      <w:r>
+        <w:rPr>
+          <w:rFonts w:asciiTheme="majorBidi" w:hAnsiTheme="majorBidi" w:cstheme="majorBidi"/>
+          <w:lang w:val="en-US"/>
+        </w:rPr>
+        <w:t>encounters</w:t>
+      </w:r>
+      <w:r>
+        <w:rPr>
+          <w:rFonts w:asciiTheme="majorBidi" w:hAnsiTheme="majorBidi" w:cstheme="majorBidi"/>
+          <w:lang w:val="en-US"/>
+        </w:rPr>
+        <w:t>.</w:t>
+      </w:r>
+    </w:p>
+    <w:p>
+      <w:pPr>
+        <w:pStyle w:val="ListParagraph"/>
+        <w:ind w:left="846"/>
+        <w:jc w:val="both"/>
+        <w:rPr>
+          <w:rFonts w:asciiTheme="majorBidi" w:hAnsiTheme="majorBidi" w:cstheme="majorBidi"/>
+          <w:lang w:val="en-US"/>
+        </w:rPr>
+      </w:pPr>
+    </w:p>
+    <w:p>
+      <w:pPr>
+        <w:pStyle w:val="ListParagraph"/>
+        <w:numPr>
+          <w:ilvl w:val="1"/>
+          <w:numId w:val="2"/>
+        </w:numPr>
+        <w:ind w:left="845"/>
+        <w:jc w:val="both"/>
+        <w:outlineLvl w:val="1"/>
+        <w:rPr>
+          <w:rFonts w:asciiTheme="majorBidi" w:hAnsiTheme="majorBidi" w:cstheme="majorBidi"/>
+          <w:lang w:val="en-US"/>
+        </w:rPr>
+      </w:pPr>
+      <w:r>
+        <w:rPr>
+          <w:rFonts w:asciiTheme="majorBidi" w:hAnsiTheme="majorBidi" w:cstheme="majorBidi"/>
+          <w:lang w:val="en-US"/>
+        </w:rPr>
+        <w:t>Comments</w:t>
+      </w:r>
+    </w:p>
+    <w:p>
+      <w:pPr>
+        <w:pStyle w:val="ListParagraph"/>
+        <w:ind w:left="846"/>
+        <w:jc w:val="both"/>
+        <w:rPr>
+          <w:rFonts w:asciiTheme="majorBidi" w:hAnsiTheme="majorBidi" w:cstheme="majorBidi"/>
+          <w:lang w:val="en-US"/>
+        </w:rPr>
+      </w:pPr>
+      <w:r>
+        <w:rPr>
+          <w:rFonts w:asciiTheme="majorBidi" w:hAnsiTheme="majorBidi" w:cstheme="majorBidi"/>
+          <w:lang w:val="en-US"/>
+        </w:rPr>
+        <w:t xml:space="preserve">Pulse supports single-line comments only. A comment begins with the </w:t>
+      </w:r>
+      <w:r>
+        <w:rPr>
+          <w:rStyle w:val="CodeChar"/>
+        </w:rPr>
+        <w:t>#</w:t>
+      </w:r>
+      <w:r>
+        <w:rPr>
+          <w:rFonts w:asciiTheme="majorBidi" w:hAnsiTheme="majorBidi" w:cstheme="majorBidi"/>
+          <w:lang w:val="en-US"/>
+        </w:rPr>
+        <w:t xml:space="preserve"> character and extends to the end of the line. Everything from the </w:t>
+      </w:r>
+      <w:r>
+        <w:rPr>
+          <w:rStyle w:val="CodeChar"/>
+        </w:rPr>
+        <w:t>#</w:t>
+      </w:r>
+      <w:r>
+        <w:rPr>
+          <w:rFonts w:asciiTheme="majorBidi" w:hAnsiTheme="majorBidi" w:cstheme="majorBidi"/>
+          <w:lang w:val="en-US"/>
+        </w:rPr>
+        <w:t xml:space="preserve"> to the newline is ignored by the lexer and has no effect on program execution. There is no multi-line comment syntax – consecutive single-l</w:t>
+      </w:r>
+      <w:r>
+        <w:rPr>
+          <w:rFonts w:asciiTheme="majorBidi" w:hAnsiTheme="majorBidi" w:cstheme="majorBidi"/>
+          <w:lang w:val="en-US"/>
+        </w:rPr>
+        <w:t>i</w:t>
+      </w:r>
+      <w:r>
+        <w:rPr>
+          <w:rFonts w:asciiTheme="majorBidi" w:hAnsiTheme="majorBidi" w:cstheme="majorBidi"/>
+          <w:lang w:val="en-US"/>
+        </w:rPr>
+        <w:t>n</w:t>
+      </w:r>
+      <w:r>
+        <w:rPr>
+          <w:rFonts w:asciiTheme="majorBidi" w:hAnsiTheme="majorBidi" w:cstheme="majorBidi"/>
+          <w:lang w:val="en-US"/>
+        </w:rPr>
+        <w:t>e</w:t>
+      </w:r>
+      <w:r>
+        <w:rPr>
+          <w:rFonts w:asciiTheme="majorBidi" w:hAnsiTheme="majorBidi" w:cstheme="majorBidi"/>
+          <w:lang w:val="en-US"/>
+        </w:rPr>
+        <w:t xml:space="preserve"> comments are used for multi-line commentary instead.</w:t>
+      </w:r>
+    </w:p>
+    <w:p>
+      <w:pPr>
+        <w:pStyle w:val="Code"/>
+      </w:pPr>
+      <w:r>
+        <w:t># This is a comment</w:t>
+      </w:r>
+    </w:p>
+    <w:p>
+      <w:pPr>
+        <w:pStyle w:val="Code"/>
+      </w:pPr>
+      <w:r>
+        <w:t xml:space="preserve">x = 42 </w:t>
+      </w:r>
+      <w:r>
+        <w:t xml:space="preserve">  </w:t>
+      </w:r>
+      <w:r>
+        <w:t># This is an inline comment</w:t>
+      </w:r>
+    </w:p>
+    <w:p>
+      <w:pPr>
+        <w:pStyle w:val="ListParagraph"/>
+        <w:ind w:left="846"/>
+        <w:jc w:val="both"/>
+        <w:rPr>
+          <w:rFonts w:asciiTheme="majorBidi" w:hAnsiTheme="majorBidi" w:cstheme="majorBidi"/>
+          <w:lang w:val="en-US"/>
+        </w:rPr>
+      </w:pPr>
+    </w:p>
+    <w:p>
+      <w:pPr>
+        <w:pStyle w:val="ListParagraph"/>
+        <w:numPr>
+          <w:ilvl w:val="1"/>
+          <w:numId w:val="2"/>
+        </w:numPr>
+        <w:ind w:left="845"/>
+        <w:jc w:val="both"/>
+        <w:outlineLvl w:val="1"/>
+        <w:rPr>
+          <w:rFonts w:asciiTheme="majorBidi" w:hAnsiTheme="majorBidi" w:cstheme="majorBidi"/>
+          <w:lang w:val="en-US"/>
+        </w:rPr>
+      </w:pPr>
+      <w:r>
+        <w:rPr>
+          <w:rFonts w:asciiTheme="majorBidi" w:hAnsiTheme="majorBidi" w:cstheme="majorBidi"/>
+          <w:lang w:val="en-US"/>
+        </w:rPr>
+        <w:t>Indentation</w:t>
+      </w:r>
+    </w:p>
+    <w:p>
+      <w:pPr>
+        <w:pStyle w:val="ListParagraph"/>
+        <w:ind w:left="846"/>
+        <w:jc w:val="both"/>
+        <w:rPr>
+          <w:rFonts w:asciiTheme="majorBidi" w:hAnsiTheme="majorBidi" w:cstheme="majorBidi"/>
+          <w:lang w:val="en-US"/>
+        </w:rPr>
+      </w:pPr>
+      <w:r>
+        <w:rPr>
+          <w:rFonts w:asciiTheme="majorBidi" w:hAnsiTheme="majorBidi" w:cstheme="majorBidi"/>
+          <w:lang w:val="en-US"/>
+        </w:rPr>
+        <w:t xml:space="preserve">Pulse uses indentation to define block structure, similar to Python. Blocks are opened by a colon at the end of a statement and closed when the indentation level returns to the level of the enclosing block. The lexer </w:t>
+      </w:r>
+      <w:r>
+        <w:rPr>
+          <w:rFonts w:asciiTheme="majorBidi" w:hAnsiTheme="majorBidi" w:cstheme="majorBidi"/>
+          <w:lang w:val="en-US"/>
+        </w:rPr>
+        <w:t>automa</w:t>
+      </w:r>
+      <w:r>
+        <w:rPr>
+          <w:rFonts w:asciiTheme="majorBidi" w:hAnsiTheme="majorBidi" w:cstheme="majorBidi"/>
+          <w:lang w:val="en-US"/>
+        </w:rPr>
+        <w:t xml:space="preserve">tically generates </w:t>
+      </w:r>
+      <w:r>
+        <w:rPr>
+          <w:rStyle w:val="CodeChar"/>
+        </w:rPr>
+        <w:t>INDENT</w:t>
+      </w:r>
+      <w:r>
+        <w:rPr>
+          <w:rFonts w:asciiTheme="majorBidi" w:hAnsiTheme="majorBidi" w:cstheme="majorBidi"/>
+          <w:lang w:val="en-US"/>
+        </w:rPr>
+        <w:t xml:space="preserve"> and </w:t>
+      </w:r>
+      <w:r>
+        <w:rPr>
+          <w:rStyle w:val="CodeChar"/>
+        </w:rPr>
+        <w:t>DEDENT</w:t>
+      </w:r>
+      <w:r>
+        <w:rPr>
+          <w:rFonts w:asciiTheme="majorBidi" w:hAnsiTheme="majorBidi" w:cstheme="majorBidi"/>
+          <w:lang w:val="en-US"/>
+        </w:rPr>
+        <w:t xml:space="preserve"> tokens as indentation increases and decreases, which the parser uses to delimit blocks without requiring explicit braces or keywords.</w:t>
+      </w:r>
+    </w:p>
+    <w:p>
+      <w:pPr>
+        <w:pStyle w:val="ListParagraph"/>
+        <w:ind w:left="846"/>
+        <w:jc w:val="both"/>
+        <w:rPr>
+          <w:rFonts w:asciiTheme="majorBidi" w:hAnsiTheme="majorBidi" w:cstheme="majorBidi"/>
+          <w:lang w:val="en-US"/>
+        </w:rPr>
+      </w:pPr>
+      <w:r>
+        <w:rPr>
+          <w:rFonts w:asciiTheme="majorBidi" w:hAnsiTheme="majorBidi" w:cstheme="majorBidi"/>
+          <w:lang w:val="en-US"/>
+        </w:rPr>
+        <w:t>Only spaces are permitted for indentation. Each indentation level must be consistent within a block – mixing indentation widths within the same block is a lexical error.</w:t>
+      </w:r>
+    </w:p>
+    <w:p>
+      <w:pPr>
+        <w:pStyle w:val="Code"/>
+      </w:pPr>
+      <w:r>
+        <w:t>def greet(name):</w:t>
+      </w:r>
+    </w:p>
+    <w:p>
+      <w:pPr>
+        <w:pStyle w:val="Code"/>
+      </w:pPr>
+      <w:r>
+        <w:t xml:space="preserve">    if name == "world":</w:t>
+      </w:r>
+    </w:p>
+    <w:p>
+      <w:pPr>
+        <w:pStyle w:val="Code"/>
+      </w:pPr>
+      <w:r>
+        <w:t xml:space="preserve">        </w:t>
+      </w:r>
+      <w:proofErr w:type="gramStart"/>
+      <w:r>
+        <w:t>print(</w:t>
+      </w:r>
+      <w:proofErr w:type="gramEnd"/>
+      <w:r>
+        <w:t>"Hello, world!")</w:t>
+      </w:r>
+    </w:p>
+    <w:p>
+      <w:pPr>
+        <w:pStyle w:val="Code"/>
+      </w:pPr>
+      <w:r>
+        <w:t xml:space="preserve">    else:</w:t>
+      </w:r>
+    </w:p>
+    <w:p>
+      <w:pPr>
+        <w:pStyle w:val="Code"/>
+      </w:pPr>
+      <w:r>
+        <w:t xml:space="preserve">        </w:t>
+      </w:r>
+      <w:proofErr w:type="gramStart"/>
+      <w:r>
+        <w:t>print(</w:t>
+      </w:r>
+      <w:proofErr w:type="gramEnd"/>
+      <w:r>
+        <w:t>"Hello, " + name)</w:t>
+      </w:r>
+    </w:p>
+    <w:p>
+      <w:pPr>
+        <w:pStyle w:val="ListParagraph"/>
+        <w:ind w:left="846"/>
+        <w:jc w:val="both"/>
+        <w:rPr>
+          <w:rFonts w:asciiTheme="majorBidi" w:hAnsiTheme="majorBidi" w:cstheme="majorBidi"/>
+          <w:lang w:val="en-US"/>
+        </w:rPr>
+      </w:pPr>
+    </w:p>
+    <w:p>
+      <w:pPr>
+        <w:pStyle w:val="ListParagraph"/>
+        <w:numPr>
+          <w:ilvl w:val="1"/>
+          <w:numId w:val="2"/>
+        </w:numPr>
+        <w:jc w:val="both"/>
+        <w:rPr>
+          <w:rFonts w:asciiTheme="majorBidi" w:hAnsiTheme="majorBidi" w:cstheme="majorBidi"/>
+          <w:lang w:val="en-US"/>
+        </w:rPr>
+      </w:pPr>
+      <w:r>
+        <w:rPr>
+          <w:rFonts w:asciiTheme="majorBidi" w:hAnsiTheme="majorBidi" w:cstheme="majorBidi"/>
+          <w:lang w:val="en-US"/>
+        </w:rPr>
+        <w:t>Tokens</w:t>
+      </w:r>
+    </w:p>
+    <w:p>
+      <w:pPr>
+        <w:pStyle w:val="ListParagraph"/>
+        <w:numPr>
+          <w:ilvl w:val="1"/>
+          <w:numId w:val="2"/>
+        </w:numPr>
+        <w:ind w:left="845"/>
+        <w:jc w:val="both"/>
+        <w:outlineLvl w:val="1"/>
+        <w:rPr>
+          <w:rFonts w:asciiTheme="majorBidi" w:hAnsiTheme="majorBidi" w:cstheme="majorBidi"/>
+          <w:lang w:val="en-US"/>
+        </w:rPr>
+      </w:pPr>
+      <w:r>
+        <w:rPr>
+          <w:rFonts w:asciiTheme="majorBidi" w:hAnsiTheme="majorBidi" w:cstheme="majorBidi"/>
+          <w:lang w:val="en-US"/>
+        </w:rPr>
+        <w:t>Numeric Literals</w:t>
+      </w:r>
+    </w:p>
+    <w:p>
+      <w:pPr>
+        <w:pStyle w:val="ListParagraph"/>
+        <w:ind w:left="846"/>
+        <w:jc w:val="both"/>
+        <w:rPr>
+          <w:rFonts w:asciiTheme="majorBidi" w:hAnsiTheme="majorBidi" w:cstheme="majorBidi"/>
+          <w:lang w:val="en-US"/>
+        </w:rPr>
+      </w:pPr>
+      <w:r>
+        <w:rPr>
+          <w:rFonts w:asciiTheme="majorBidi" w:hAnsiTheme="majorBidi" w:cstheme="majorBidi"/>
+          <w:lang w:val="en-US"/>
+        </w:rPr>
+        <w:t>Pulse has a single numeric type that covers both integers and floating-point values. Numeric literals are written as standard decimal integers or floating-point numbers with an optional fractional part and optional exponent.</w:t>
+      </w:r>
+    </w:p>
+    <w:p>
+      <w:pPr>
+        <w:pStyle w:val="Code"/>
+      </w:pPr>
+      <w:r>
+        <w:t>42            # integer</w:t>
+      </w:r>
+    </w:p>
+    <w:p>
+      <w:pPr>
+        <w:pStyle w:val="Code"/>
+      </w:pPr>
+      <w:r>
+        <w:t>3.14         # float</w:t>
+      </w:r>
+    </w:p>
+    <w:p>
+      <w:pPr>
+        <w:pStyle w:val="Code"/>
+      </w:pPr>
+      <w:r>
+        <w:t>0.001       # small float</w:t>
+      </w:r>
+    </w:p>
+    <w:p>
+      <w:pPr>
+        <w:pStyle w:val="ListParagraph"/>
+        <w:ind w:left="846"/>
+        <w:jc w:val="both"/>
+        <w:rPr>
+          <w:rFonts w:asciiTheme="majorBidi" w:hAnsiTheme="majorBidi" w:cstheme="majorBidi"/>
+          <w:lang w:val="en-US"/>
+        </w:rPr>
+      </w:pPr>
+      <w:r>
+        <w:rPr>
+          <w:rFonts w:asciiTheme="majorBidi" w:hAnsiTheme="majorBidi" w:cstheme="majorBidi"/>
+          <w:lang w:val="en-US"/>
+        </w:rPr>
+        <w:t>Underscores in numeric literals are not supported in Pulse v1.0.</w:t>
+      </w:r>
+    </w:p>
+    <w:p>
+      <w:pPr>
+        <w:pStyle w:val="ListParagraph"/>
+        <w:ind w:left="846"/>
+        <w:jc w:val="both"/>
+        <w:rPr>
+          <w:rFonts w:asciiTheme="majorBidi" w:hAnsiTheme="majorBidi" w:cstheme="majorBidi"/>
+          <w:lang w:val="en-US"/>
+        </w:rPr>
+      </w:pPr>
+    </w:p>
+    <w:p>
+      <w:pPr>
+        <w:pStyle w:val="ListParagraph"/>
+        <w:numPr>
+          <w:ilvl w:val="1"/>
+          <w:numId w:val="2"/>
+        </w:numPr>
+        <w:ind w:left="845"/>
+        <w:jc w:val="both"/>
+        <w:outlineLvl w:val="1"/>
+        <w:rPr>
+          <w:rFonts w:asciiTheme="majorBidi" w:hAnsiTheme="majorBidi" w:cstheme="majorBidi"/>
+          <w:lang w:val="en-US"/>
+        </w:rPr>
+      </w:pPr>
+      <w:r>
+        <w:rPr>
+          <w:rFonts w:asciiTheme="majorBidi" w:hAnsiTheme="majorBidi" w:cstheme="majorBidi"/>
+          <w:lang w:val="en-US"/>
+        </w:rPr>
+        <w:t>String Literals</w:t>
+      </w:r>
+    </w:p>
+    <w:p>
+      <w:pPr>
+        <w:pStyle w:val="ListParagraph"/>
+        <w:ind w:left="846"/>
+        <w:jc w:val="both"/>
+        <w:rPr>
+          <w:rFonts w:asciiTheme="majorBidi" w:hAnsiTheme="majorBidi" w:cstheme="majorBidi"/>
+          <w:lang w:val="en-US"/>
+        </w:rPr>
+      </w:pPr>
+      <w:r>
+        <w:rPr>
+          <w:rFonts w:asciiTheme="majorBidi" w:hAnsiTheme="majorBidi" w:cstheme="majorBidi"/>
+          <w:lang w:val="en-US"/>
+        </w:rPr>
+        <w:t xml:space="preserve">Strings literals are enclosed in either single quotes or double quotes. Both forms are equivalent. Escape sequences inside string literals follow standard conventions - </w:t>
+      </w:r>
+      <w:r>
+        <w:rPr>
+          <w:rStyle w:val="CodeChar"/>
+        </w:rPr>
+        <w:t>\n</w:t>
+      </w:r>
+      <w:r>
+        <w:rPr>
+          <w:rFonts w:asciiTheme="majorBidi" w:hAnsiTheme="majorBidi" w:cstheme="majorBidi"/>
+          <w:lang w:val="en-US"/>
+        </w:rPr>
+        <w:t xml:space="preserve"> for newline, </w:t>
+      </w:r>
+      <w:r>
+        <w:rPr>
+          <w:rStyle w:val="CodeChar"/>
+        </w:rPr>
+        <w:t>\t</w:t>
+      </w:r>
+      <w:r>
+        <w:rPr>
+          <w:rFonts w:asciiTheme="majorBidi" w:hAnsiTheme="majorBidi" w:cstheme="majorBidi"/>
+          <w:lang w:val="en-US"/>
+        </w:rPr>
+        <w:t xml:space="preserve"> for tab, </w:t>
+      </w:r>
+      <w:r>
+        <w:rPr>
+          <w:rStyle w:val="CodeChar"/>
+        </w:rPr>
+        <w:t>\\</w:t>
+      </w:r>
+      <w:r>
+        <w:rPr>
+          <w:rFonts w:asciiTheme="majorBidi" w:hAnsiTheme="majorBidi" w:cstheme="majorBidi"/>
+          <w:lang w:val="en-US"/>
+        </w:rPr>
+        <w:t xml:space="preserve"> for literal backslash, </w:t>
+      </w:r>
+      <w:r>
+        <w:rPr>
+          <w:rStyle w:val="CodeChar"/>
+        </w:rPr>
+        <w:t>\"</w:t>
+      </w:r>
+      <w:r>
+        <w:rPr>
+          <w:rFonts w:asciiTheme="majorBidi" w:hAnsiTheme="majorBidi" w:cstheme="majorBidi"/>
+          <w:lang w:val="en-US"/>
+        </w:rPr>
+        <w:t xml:space="preserve"> or </w:t>
+      </w:r>
+      <w:r>
+        <w:rPr>
+          <w:rStyle w:val="CodeChar"/>
+        </w:rPr>
+        <w:t>\'</w:t>
+      </w:r>
+      <w:r>
+        <w:rPr>
+          <w:rFonts w:asciiTheme="majorBidi" w:hAnsiTheme="majorBidi" w:cstheme="majorBidi"/>
+          <w:lang w:val="en-US"/>
+        </w:rPr>
+        <w:t xml:space="preserve"> for quote characters.</w:t>
+      </w:r>
+    </w:p>
+    <w:p>
+      <w:pPr>
+        <w:pStyle w:val="Code"/>
+      </w:pPr>
+      <w:r>
+        <w:t>"hello"</w:t>
+      </w:r>
+    </w:p>
+    <w:p>
+      <w:pPr>
+        <w:pStyle w:val="Code"/>
+      </w:pPr>
+      <w:r>
+        <w:t>'world'</w:t>
+      </w:r>
+    </w:p>
+    <w:p>
+      <w:pPr>
+        <w:pStyle w:val="Code"/>
+      </w:pPr>
+      <w:r>
+        <w:t>"</w:t>
+      </w:r>
+      <w:proofErr w:type="gramStart"/>
+      <w:r>
+        <w:t>line</w:t>
+      </w:r>
+      <w:proofErr w:type="gramEnd"/>
+      <w:r>
+        <w:t xml:space="preserve"> one\</w:t>
+      </w:r>
+      <w:proofErr w:type="spellStart"/>
+      <w:r>
+        <w:t>nline</w:t>
+      </w:r>
+      <w:proofErr w:type="spellEnd"/>
+      <w:r>
+        <w:t xml:space="preserve"> two"</w:t>
+      </w:r>
+    </w:p>
+    <w:p>
+      <w:pPr>
+        <w:pStyle w:val="ListParagraph"/>
+        <w:ind w:left="846"/>
+        <w:jc w:val="both"/>
+        <w:rPr>
+          <w:rFonts w:asciiTheme="majorBidi" w:hAnsiTheme="majorBidi" w:cstheme="majorBidi"/>
+          <w:lang w:val="en-US"/>
+        </w:rPr>
+      </w:pPr>
+      <w:r>
+        <w:rPr>
+          <w:rFonts w:asciiTheme="majorBidi" w:hAnsiTheme="majorBidi" w:cstheme="majorBidi"/>
+          <w:lang w:val="en-US"/>
+        </w:rPr>
+        <w:t>Triple-quotes strings are also supported using either """ or '''</w:t>
+      </w:r>
+      <w:r>
+        <w:rPr>
+          <w:rFonts w:asciiTheme="majorBidi" w:hAnsiTheme="majorBidi" w:cstheme="majorBidi"/>
+          <w:lang w:val="en-US"/>
+        </w:rPr>
+        <w:t>. Triple-quoted strings may span multiple lines are preserver all whitespace and newlines between the delimiters. They are commonly used for multi-line text or documentation strings.</w:t>
+      </w:r>
+    </w:p>
+    <w:p>
+      <w:pPr>
+        <w:pStyle w:val="Code"/>
+      </w:pPr>
+      <w:r>
+        <w:t>"""</w:t>
+      </w:r>
+    </w:p>
+    <w:p>
+      <w:pPr>
+        <w:pStyle w:val="Code"/>
+      </w:pPr>
+      <w:r>
+        <w:t xml:space="preserve">This is a </w:t>
+      </w:r>
+    </w:p>
+    <w:p>
+      <w:pPr>
+        <w:pStyle w:val="Code"/>
+      </w:pPr>
+      <w:r>
+        <w:t>multi-line string</w:t>
+      </w:r>
+    </w:p>
+    <w:p>
+      <w:pPr>
+        <w:pStyle w:val="Code"/>
+      </w:pPr>
+      <w:r>
+        <w:t>"""</w:t>
+      </w:r>
+    </w:p>
+    <w:p>
+      <w:pPr>
+        <w:pStyle w:val="ListParagraph"/>
+        <w:ind w:left="846"/>
+        <w:jc w:val="both"/>
+        <w:rPr>
+          <w:rFonts w:asciiTheme="majorBidi" w:hAnsiTheme="majorBidi" w:cstheme="majorBidi"/>
+          <w:lang w:val="en-US"/>
+        </w:rPr>
+      </w:pPr>
+    </w:p>
+    <w:p>
+      <w:pPr>
+        <w:pStyle w:val="ListParagraph"/>
+        <w:numPr>
+          <w:ilvl w:val="1"/>
+          <w:numId w:val="2"/>
+        </w:numPr>
+        <w:jc w:val="both"/>
+        <w:rPr>
+          <w:rFonts w:asciiTheme="majorBidi" w:hAnsiTheme="majorBidi" w:cstheme="majorBidi"/>
+          <w:lang w:val="en-US"/>
+        </w:rPr>
+      </w:pPr>
+      <w:r>
+        <w:rPr>
+          <w:rFonts w:asciiTheme="majorBidi" w:hAnsiTheme="majorBidi" w:cstheme="majorBidi"/>
+          <w:lang w:val="en-US"/>
+        </w:rPr>
+        <w:t>F-Strings</w:t>
+      </w:r>
+    </w:p>
+    <w:p>
+      <w:pPr>
+        <w:pStyle w:val="ListParagraph"/>
+        <w:numPr>
+          <w:ilvl w:val="1"/>
+          <w:numId w:val="2"/>
+        </w:numPr>
+        <w:jc w:val="both"/>
+        <w:rPr>
+          <w:rFonts w:asciiTheme="majorBidi" w:hAnsiTheme="majorBidi" w:cstheme="majorBidi"/>
+          <w:lang w:val="en-US"/>
+        </w:rPr>
+      </w:pPr>
+      <w:r>
+        <w:rPr>
+          <w:rFonts w:asciiTheme="majorBidi" w:hAnsiTheme="majorBidi" w:cstheme="majorBidi"/>
+          <w:lang w:val="en-US"/>
+        </w:rPr>
+        <w:t>Tensor Literals</w:t>
+      </w:r>
+    </w:p>
+    <w:p>
+      <w:pPr>
+        <w:pStyle w:val="ListParagraph"/>
+        <w:numPr>
+          <w:ilvl w:val="1"/>
+          <w:numId w:val="2"/>
+        </w:numPr>
+        <w:jc w:val="both"/>
+        <w:rPr>
+          <w:rFonts w:asciiTheme="majorBidi" w:hAnsiTheme="majorBidi" w:cstheme="majorBidi"/>
+          <w:lang w:val="en-US"/>
+        </w:rPr>
+      </w:pPr>
+      <w:r>
+        <w:rPr>
+          <w:rFonts w:asciiTheme="majorBidi" w:hAnsiTheme="majorBidi" w:cstheme="majorBidi"/>
+          <w:lang w:val="en-US"/>
+        </w:rPr>
+        <w:t>Boolean and Null Literals</w:t>
+      </w:r>
+    </w:p>
+    <w:p>
+      <w:pPr>
+        <w:pStyle w:val="ListParagraph"/>
+        <w:ind w:left="426"/>
+        <w:jc w:val="both"/>
+        <w:rPr>
+          <w:rFonts w:asciiTheme="majorBidi" w:hAnsiTheme="majorBidi" w:cstheme="majorBidi"/>
+          <w:lang w:val="en-US"/>
+        </w:rPr>
+      </w:pPr>
+    </w:p>
+    <w:p>
+      <w:pPr>
+        <w:pStyle w:val="ListParagraph"/>
+        <w:numPr>
+          <w:ilvl w:val="0"/>
+          <w:numId w:val="2"/>
+        </w:numPr>
+        <w:ind w:left="425" w:hanging="425"/>
+        <w:jc w:val="both"/>
+        <w:outlineLvl w:val="0"/>
+        <w:rPr>
+          <w:rFonts w:asciiTheme="majorBidi" w:hAnsiTheme="majorBidi" w:cstheme="majorBidi"/>
+          <w:sz w:val="28"/>
+          <w:szCs w:val="28"/>
+          <w:lang w:val="en-US"/>
+        </w:rPr>
+      </w:pPr>
+      <w:bookmarkStart w:id="6" w:name="_Toc230027578"/>
+      <w:r>
+        <w:rPr>
+          <w:rFonts w:asciiTheme="majorBidi" w:hAnsiTheme="majorBidi" w:cstheme="majorBidi"/>
+          <w:sz w:val="28"/>
+          <w:szCs w:val="28"/>
+          <w:lang w:val="en-US"/>
+        </w:rPr>
+        <w:t>Types</w:t>
+      </w:r>
+      <w:bookmarkEnd w:id="6"/>
+    </w:p>
+    <w:p>
+      <w:pPr>
+        <w:pStyle w:val="ListParagraph"/>
+        <w:ind w:left="426"/>
+        <w:jc w:val="both"/>
+        <w:rPr>
+          <w:rFonts w:asciiTheme="majorBidi" w:hAnsiTheme="majorBidi" w:cstheme="majorBidi"/>
+          <w:sz w:val="28"/>
+          <w:szCs w:val="28"/>
+          <w:lang w:val="en-US"/>
+        </w:rPr>
+      </w:pPr>
+    </w:p>
+    <w:p>
+      <w:pPr>
+        <w:pStyle w:val="ListParagraph"/>
+        <w:ind w:left="426"/>
+        <w:jc w:val="both"/>
+        <w:rPr>
+          <w:rFonts w:asciiTheme="majorBidi" w:hAnsiTheme="majorBidi" w:cstheme="majorBidi"/>
+          <w:sz w:val="28"/>
+          <w:szCs w:val="28"/>
+          <w:lang w:val="en-US"/>
+        </w:rPr>
+      </w:pPr>
+    </w:p>
+    <w:p>
+      <w:pPr>
+        <w:pStyle w:val="ListParagraph"/>
+        <w:numPr>
+          <w:ilvl w:val="0"/>
+          <w:numId w:val="2"/>
+        </w:numPr>
+        <w:ind w:left="425" w:hanging="425"/>
+        <w:jc w:val="both"/>
+        <w:outlineLvl w:val="0"/>
+        <w:rPr>
+          <w:rFonts w:asciiTheme="majorBidi" w:hAnsiTheme="majorBidi" w:cstheme="majorBidi"/>
+          <w:sz w:val="28"/>
+          <w:szCs w:val="28"/>
+          <w:lang w:val="en-US"/>
+        </w:rPr>
+      </w:pPr>
+      <w:bookmarkStart w:id="7" w:name="_Toc230027579"/>
+      <w:r>
+        <w:rPr>
+          <w:rFonts w:asciiTheme="majorBidi" w:hAnsiTheme="majorBidi" w:cstheme="majorBidi"/>
+          <w:sz w:val="28"/>
+          <w:szCs w:val="28"/>
+          <w:lang w:val="en-US"/>
+        </w:rPr>
+        <w:t>Operators</w:t>
+      </w:r>
+      <w:bookmarkEnd w:id="7"/>
+    </w:p>
+    <w:p>
+      <w:pPr>
+        <w:pStyle w:val="ListParagraph"/>
+        <w:ind w:left="426"/>
+        <w:jc w:val="both"/>
+        <w:rPr>
+          <w:rFonts w:asciiTheme="majorBidi" w:hAnsiTheme="majorBidi" w:cstheme="majorBidi"/>
+          <w:sz w:val="28"/>
+          <w:szCs w:val="28"/>
+          <w:lang w:val="en-US"/>
+        </w:rPr>
+      </w:pPr>
+    </w:p>
+    <w:p>
+      <w:pPr>
+        <w:pStyle w:val="ListParagraph"/>
+        <w:ind w:left="426"/>
+        <w:jc w:val="both"/>
+        <w:rPr>
+          <w:rFonts w:asciiTheme="majorBidi" w:hAnsiTheme="majorBidi" w:cstheme="majorBidi"/>
+          <w:sz w:val="28"/>
+          <w:szCs w:val="28"/>
+          <w:lang w:val="en-US"/>
+        </w:rPr>
+      </w:pPr>
+    </w:p>
+    <w:p>
+      <w:pPr>
+        <w:pStyle w:val="ListParagraph"/>
+        <w:numPr>
+          <w:ilvl w:val="0"/>
+          <w:numId w:val="2"/>
+        </w:numPr>
+        <w:ind w:left="425" w:hanging="425"/>
+        <w:jc w:val="both"/>
+        <w:outlineLvl w:val="0"/>
+        <w:rPr>
+          <w:rFonts w:asciiTheme="majorBidi" w:hAnsiTheme="majorBidi" w:cstheme="majorBidi"/>
+          <w:sz w:val="28"/>
+          <w:szCs w:val="28"/>
+          <w:lang w:val="en-US"/>
+        </w:rPr>
+      </w:pPr>
+      <w:bookmarkStart w:id="8" w:name="_Toc230027580"/>
+      <w:r>
+        <w:rPr>
+          <w:rFonts w:asciiTheme="majorBidi" w:hAnsiTheme="majorBidi" w:cstheme="majorBidi"/>
+          <w:sz w:val="28"/>
+          <w:szCs w:val="28"/>
+          <w:lang w:val="en-US"/>
+        </w:rPr>
+        <w:t>Expressions</w:t>
+      </w:r>
+      <w:bookmarkEnd w:id="8"/>
+    </w:p>
+    <w:p>
+      <w:pPr>
+        <w:pStyle w:val="ListParagraph"/>
+        <w:ind w:left="426"/>
+        <w:jc w:val="both"/>
+        <w:rPr>
+          <w:rFonts w:asciiTheme="majorBidi" w:hAnsiTheme="majorBidi" w:cstheme="majorBidi"/>
+          <w:sz w:val="28"/>
+          <w:szCs w:val="28"/>
+          <w:lang w:val="en-US"/>
+        </w:rPr>
+      </w:pPr>
+    </w:p>
+    <w:p>
+      <w:pPr>
+        <w:pStyle w:val="ListParagraph"/>
+        <w:ind w:left="426"/>
+        <w:jc w:val="both"/>
+        <w:rPr>
+          <w:rFonts w:asciiTheme="majorBidi" w:hAnsiTheme="majorBidi" w:cstheme="majorBidi"/>
+          <w:sz w:val="28"/>
+          <w:szCs w:val="28"/>
+          <w:lang w:val="en-US"/>
+        </w:rPr>
+      </w:pPr>
+    </w:p>
+    <w:p>
+      <w:pPr>
+        <w:pStyle w:val="ListParagraph"/>
+        <w:numPr>
+          <w:ilvl w:val="0"/>
+          <w:numId w:val="2"/>
+        </w:numPr>
+        <w:ind w:left="425" w:hanging="425"/>
+        <w:jc w:val="both"/>
+        <w:outlineLvl w:val="0"/>
+        <w:rPr>
+          <w:rFonts w:asciiTheme="majorBidi" w:hAnsiTheme="majorBidi" w:cstheme="majorBidi"/>
+          <w:sz w:val="28"/>
+          <w:szCs w:val="28"/>
+          <w:lang w:val="en-US"/>
+        </w:rPr>
+      </w:pPr>
+      <w:bookmarkStart w:id="9" w:name="_Toc230027581"/>
+      <w:r>
+        <w:rPr>
+          <w:rFonts w:asciiTheme="majorBidi" w:hAnsiTheme="majorBidi" w:cstheme="majorBidi"/>
+          <w:sz w:val="28"/>
+          <w:szCs w:val="28"/>
+          <w:lang w:val="en-US"/>
+        </w:rPr>
+        <w:t>Statements</w:t>
+      </w:r>
+      <w:bookmarkEnd w:id="9"/>
+    </w:p>
+    <w:p>
+      <w:pPr>
+        <w:pStyle w:val="ListParagraph"/>
+        <w:ind w:left="426"/>
+        <w:jc w:val="both"/>
+        <w:rPr>
+          <w:rFonts w:asciiTheme="majorBidi" w:hAnsiTheme="majorBidi" w:cstheme="majorBidi"/>
+          <w:sz w:val="28"/>
+          <w:szCs w:val="28"/>
+          <w:lang w:val="en-US"/>
+        </w:rPr>
+      </w:pPr>
+    </w:p>
+    <w:p>
+      <w:pPr>
+        <w:pStyle w:val="ListParagraph"/>
+        <w:ind w:left="426"/>
+        <w:jc w:val="both"/>
+        <w:rPr>
+          <w:rFonts w:asciiTheme="majorBidi" w:hAnsiTheme="majorBidi" w:cstheme="majorBidi"/>
+          <w:sz w:val="28"/>
+          <w:szCs w:val="28"/>
+          <w:lang w:val="en-US"/>
+        </w:rPr>
+      </w:pPr>
+    </w:p>
+    <w:p>
+      <w:pPr>
+        <w:pStyle w:val="ListParagraph"/>
+        <w:numPr>
+          <w:ilvl w:val="0"/>
+          <w:numId w:val="2"/>
+        </w:numPr>
+        <w:ind w:left="425" w:hanging="425"/>
+        <w:jc w:val="both"/>
+        <w:outlineLvl w:val="0"/>
+        <w:rPr>
+          <w:rFonts w:asciiTheme="majorBidi" w:hAnsiTheme="majorBidi" w:cstheme="majorBidi"/>
+          <w:sz w:val="28"/>
+          <w:szCs w:val="28"/>
+          <w:lang w:val="en-US"/>
+        </w:rPr>
+      </w:pPr>
+      <w:bookmarkStart w:id="10" w:name="_Toc230027582"/>
+      <w:r>
+        <w:rPr>
+          <w:rFonts w:asciiTheme="majorBidi" w:hAnsiTheme="majorBidi" w:cstheme="majorBidi"/>
+          <w:sz w:val="28"/>
+          <w:szCs w:val="28"/>
+          <w:lang w:val="en-US"/>
+        </w:rPr>
+        <w:t>Functions</w:t>
+      </w:r>
+      <w:bookmarkEnd w:id="10"/>
+    </w:p>
+    <w:p>
+      <w:pPr>
+        <w:pStyle w:val="ListParagraph"/>
+        <w:ind w:left="426"/>
+        <w:jc w:val="both"/>
+        <w:rPr>
+          <w:rFonts w:asciiTheme="majorBidi" w:hAnsiTheme="majorBidi" w:cstheme="majorBidi"/>
+          <w:sz w:val="28"/>
+          <w:szCs w:val="28"/>
+          <w:lang w:val="en-US"/>
+        </w:rPr>
+      </w:pPr>
+    </w:p>
+    <w:p>
+      <w:pPr>
+        <w:pStyle w:val="ListParagraph"/>
+        <w:ind w:left="426"/>
+        <w:jc w:val="both"/>
+        <w:rPr>
+          <w:rFonts w:asciiTheme="majorBidi" w:hAnsiTheme="majorBidi" w:cstheme="majorBidi"/>
+          <w:sz w:val="28"/>
+          <w:szCs w:val="28"/>
+          <w:lang w:val="en-US"/>
+        </w:rPr>
+      </w:pPr>
+    </w:p>
+    <w:p>
+      <w:pPr>
+        <w:pStyle w:val="ListParagraph"/>
+        <w:numPr>
+          <w:ilvl w:val="0"/>
+          <w:numId w:val="2"/>
+        </w:numPr>
+        <w:ind w:left="425" w:hanging="425"/>
+        <w:jc w:val="both"/>
+        <w:outlineLvl w:val="0"/>
+        <w:rPr>
+          <w:rFonts w:asciiTheme="majorBidi" w:hAnsiTheme="majorBidi" w:cstheme="majorBidi"/>
+          <w:sz w:val="28"/>
+          <w:szCs w:val="28"/>
+          <w:lang w:val="en-US"/>
+        </w:rPr>
+      </w:pPr>
+      <w:bookmarkStart w:id="11" w:name="_Toc230027583"/>
+      <w:r>
+        <w:rPr>
+          <w:rFonts w:asciiTheme="majorBidi" w:hAnsiTheme="majorBidi" w:cstheme="majorBidi"/>
+          <w:sz w:val="28"/>
+          <w:szCs w:val="28"/>
+          <w:lang w:val="en-US"/>
+        </w:rPr>
+        <w:t>Classes</w:t>
+      </w:r>
+      <w:bookmarkEnd w:id="11"/>
+    </w:p>
+    <w:p>
+      <w:pPr>
+        <w:pStyle w:val="ListParagraph"/>
+        <w:ind w:left="426"/>
+        <w:jc w:val="both"/>
+        <w:rPr>
+          <w:rFonts w:asciiTheme="majorBidi" w:hAnsiTheme="majorBidi" w:cstheme="majorBidi"/>
+          <w:sz w:val="28"/>
+          <w:szCs w:val="28"/>
+          <w:lang w:val="en-US"/>
+        </w:rPr>
+      </w:pPr>
+    </w:p>
+    <w:p>
+      <w:pPr>
+        <w:pStyle w:val="ListParagraph"/>
+        <w:ind w:left="426"/>
+        <w:jc w:val="both"/>
+        <w:rPr>
+          <w:rFonts w:asciiTheme="majorBidi" w:hAnsiTheme="majorBidi" w:cstheme="majorBidi"/>
+          <w:sz w:val="28"/>
+          <w:szCs w:val="28"/>
+          <w:lang w:val="en-US"/>
+        </w:rPr>
+      </w:pPr>
+    </w:p>
+    <w:p>
+      <w:pPr>
+        <w:pStyle w:val="ListParagraph"/>
+        <w:numPr>
+          <w:ilvl w:val="0"/>
+          <w:numId w:val="2"/>
+        </w:numPr>
+        <w:ind w:left="425" w:hanging="425"/>
+        <w:jc w:val="both"/>
+        <w:outlineLvl w:val="0"/>
+        <w:rPr>
+          <w:rFonts w:asciiTheme="majorBidi" w:hAnsiTheme="majorBidi" w:cstheme="majorBidi"/>
+          <w:sz w:val="28"/>
+          <w:szCs w:val="28"/>
+          <w:lang w:val="en-US"/>
+        </w:rPr>
+      </w:pPr>
+      <w:bookmarkStart w:id="12" w:name="_Toc230027584"/>
+      <w:r>
+        <w:rPr>
+          <w:rFonts w:asciiTheme="majorBidi" w:hAnsiTheme="majorBidi" w:cstheme="majorBidi"/>
+          <w:sz w:val="28"/>
+          <w:szCs w:val="28"/>
+          <w:lang w:val="en-US"/>
+        </w:rPr>
+        <w:t>Error Handling</w:t>
+      </w:r>
+      <w:bookmarkEnd w:id="12"/>
+    </w:p>
+    <w:p>
+      <w:pPr>
+        <w:pStyle w:val="ListParagraph"/>
+        <w:ind w:left="426"/>
+        <w:jc w:val="both"/>
+        <w:rPr>
+          <w:rFonts w:asciiTheme="majorBidi" w:hAnsiTheme="majorBidi" w:cstheme="majorBidi"/>
+          <w:sz w:val="28"/>
+          <w:szCs w:val="28"/>
+          <w:lang w:val="en-US"/>
+        </w:rPr>
+      </w:pPr>
+    </w:p>
+    <w:p>
+      <w:pPr>
+        <w:pStyle w:val="ListParagraph"/>
+        <w:ind w:left="426"/>
+        <w:jc w:val="both"/>
+        <w:rPr>
+          <w:rFonts w:asciiTheme="majorBidi" w:hAnsiTheme="majorBidi" w:cstheme="majorBidi"/>
+          <w:sz w:val="28"/>
+          <w:szCs w:val="28"/>
+          <w:lang w:val="en-US"/>
+        </w:rPr>
+      </w:pPr>
+    </w:p>
+    <w:p>
+      <w:pPr>
+        <w:pStyle w:val="ListParagraph"/>
+        <w:numPr>
+          <w:ilvl w:val="0"/>
+          <w:numId w:val="2"/>
+        </w:numPr>
+        <w:ind w:left="425" w:hanging="425"/>
+        <w:jc w:val="both"/>
+        <w:outlineLvl w:val="0"/>
+        <w:rPr>
+          <w:rFonts w:asciiTheme="majorBidi" w:hAnsiTheme="majorBidi" w:cstheme="majorBidi"/>
+          <w:sz w:val="28"/>
+          <w:szCs w:val="28"/>
+          <w:lang w:val="en-US"/>
+        </w:rPr>
+      </w:pPr>
+      <w:bookmarkStart w:id="13" w:name="_Toc230027585"/>
+      <w:r>
+        <w:rPr>
+          <w:rFonts w:asciiTheme="majorBidi" w:hAnsiTheme="majorBidi" w:cstheme="majorBidi"/>
+          <w:sz w:val="28"/>
+          <w:szCs w:val="28"/>
+          <w:lang w:val="en-US"/>
+        </w:rPr>
+        <w:t>Modules</w:t>
+      </w:r>
+      <w:bookmarkEnd w:id="13"/>
+    </w:p>
+    <w:p>
+      <w:pPr>
+        <w:pStyle w:val="ListParagraph"/>
+        <w:ind w:left="426"/>
+        <w:jc w:val="both"/>
+        <w:rPr>
+          <w:rFonts w:asciiTheme="majorBidi" w:hAnsiTheme="majorBidi" w:cstheme="majorBidi"/>
+          <w:sz w:val="28"/>
+          <w:szCs w:val="28"/>
+          <w:lang w:val="en-US"/>
+        </w:rPr>
+      </w:pPr>
+    </w:p>
+    <w:p>
+      <w:pPr>
+        <w:pStyle w:val="ListParagraph"/>
+        <w:ind w:left="426"/>
+        <w:jc w:val="both"/>
+        <w:rPr>
+          <w:rFonts w:asciiTheme="majorBidi" w:hAnsiTheme="majorBidi" w:cstheme="majorBidi"/>
+          <w:sz w:val="28"/>
+          <w:szCs w:val="28"/>
+          <w:lang w:val="en-US"/>
+        </w:rPr>
+      </w:pPr>
+    </w:p>
+    <w:p>
+      <w:pPr>
+        <w:pStyle w:val="ListParagraph"/>
+        <w:numPr>
+          <w:ilvl w:val="0"/>
+          <w:numId w:val="2"/>
+        </w:numPr>
+        <w:ind w:left="425" w:hanging="425"/>
+        <w:jc w:val="both"/>
+        <w:outlineLvl w:val="0"/>
+        <w:rPr>
+          <w:rFonts w:asciiTheme="majorBidi" w:hAnsiTheme="majorBidi" w:cstheme="majorBidi"/>
+          <w:sz w:val="28"/>
+          <w:szCs w:val="28"/>
+          <w:lang w:val="en-US"/>
+        </w:rPr>
+      </w:pPr>
+      <w:bookmarkStart w:id="14" w:name="_Toc230027586"/>
+      <w:r>
+        <w:rPr>
+          <w:rFonts w:asciiTheme="majorBidi" w:hAnsiTheme="majorBidi" w:cstheme="majorBidi"/>
+          <w:sz w:val="28"/>
+          <w:szCs w:val="28"/>
+          <w:lang w:val="en-US"/>
+        </w:rPr>
+        <w:t>Standard Library Reference</w:t>
+      </w:r>
+      <w:bookmarkEnd w:id="14"/>
+    </w:p>
+    <w:p>
+      <w:pPr>
+        <w:pStyle w:val="ListParagraph"/>
+        <w:ind w:left="426"/>
+        <w:jc w:val="both"/>
+        <w:rPr>
+          <w:rFonts w:asciiTheme="majorBidi" w:hAnsiTheme="majorBidi" w:cstheme="majorBidi"/>
+          <w:sz w:val="28"/>
+          <w:szCs w:val="28"/>
+          <w:lang w:val="en-US"/>
+        </w:rPr>
+      </w:pPr>
+    </w:p>
+    <w:p>
+      <w:pPr>
+        <w:pStyle w:val="ListParagraph"/>
+        <w:ind w:left="426"/>
+        <w:jc w:val="both"/>
+        <w:rPr>
+          <w:rFonts w:asciiTheme="majorBidi" w:hAnsiTheme="majorBidi" w:cstheme="majorBidi"/>
+          <w:sz w:val="28"/>
+          <w:szCs w:val="28"/>
+          <w:lang w:val="en-US"/>
+        </w:rPr>
+      </w:pPr>
+    </w:p>
+    <w:p>
+      <w:pPr>
+        <w:pStyle w:val="ListParagraph"/>
+        <w:numPr>
+          <w:ilvl w:val="0"/>
+          <w:numId w:val="2"/>
+        </w:numPr>
+        <w:ind w:left="425" w:hanging="425"/>
+        <w:jc w:val="both"/>
+        <w:outlineLvl w:val="0"/>
+        <w:rPr>
+          <w:rFonts w:asciiTheme="majorBidi" w:hAnsiTheme="majorBidi" w:cstheme="majorBidi"/>
+          <w:sz w:val="28"/>
+          <w:szCs w:val="28"/>
+          <w:lang w:val="en-US"/>
+        </w:rPr>
+      </w:pPr>
+      <w:bookmarkStart w:id="15" w:name="_Toc230027587"/>
+      <w:r>
+        <w:rPr>
+          <w:rFonts w:asciiTheme="majorBidi" w:hAnsiTheme="majorBidi" w:cstheme="majorBidi"/>
+          <w:sz w:val="28"/>
+          <w:szCs w:val="28"/>
+          <w:lang w:val="en-US"/>
+        </w:rPr>
+        <w:t>The ML Pipeline</w:t>
+      </w:r>
+      <w:bookmarkEnd w:id="15"/>
+    </w:p>
+    <w:p>
+      <w:pPr>
+        <w:pStyle w:val="ListParagraph"/>
+        <w:ind w:left="426"/>
+        <w:jc w:val="both"/>
+        <w:rPr>
+          <w:rFonts w:asciiTheme="majorBidi" w:hAnsiTheme="majorBidi" w:cstheme="majorBidi"/>
+          <w:sz w:val="28"/>
+          <w:szCs w:val="28"/>
+          <w:lang w:val="en-US"/>
+        </w:rPr>
+      </w:pPr>
+    </w:p>
+    <w:p>
+      <w:pPr>
+        <w:pStyle w:val="ListParagraph"/>
+        <w:ind w:left="426"/>
+        <w:jc w:val="both"/>
+        <w:rPr>
+          <w:rFonts w:asciiTheme="majorBidi" w:hAnsiTheme="majorBidi" w:cstheme="majorBidi"/>
+          <w:sz w:val="28"/>
+          <w:szCs w:val="28"/>
+          <w:lang w:val="en-US"/>
+        </w:rPr>
+      </w:pPr>
+    </w:p>
+    <w:p>
+      <w:pPr>
+        <w:pStyle w:val="ListParagraph"/>
+        <w:numPr>
+          <w:ilvl w:val="0"/>
+          <w:numId w:val="2"/>
+        </w:numPr>
+        <w:ind w:left="425" w:hanging="425"/>
+        <w:jc w:val="both"/>
+        <w:outlineLvl w:val="0"/>
+        <w:rPr>
+          <w:rFonts w:asciiTheme="majorBidi" w:hAnsiTheme="majorBidi" w:cstheme="majorBidi"/>
+          <w:sz w:val="28"/>
+          <w:szCs w:val="28"/>
+          <w:lang w:val="en-US"/>
+        </w:rPr>
+      </w:pPr>
+      <w:bookmarkStart w:id="16" w:name="_Toc230027588"/>
+      <w:r>
+        <w:rPr>
+          <w:rFonts w:asciiTheme="majorBidi" w:hAnsiTheme="majorBidi" w:cstheme="majorBidi"/>
+          <w:sz w:val="28"/>
+          <w:szCs w:val="28"/>
+          <w:lang w:val="en-US"/>
+        </w:rPr>
+        <w:t>Grammar Reference</w:t>
+      </w:r>
+      <w:bookmarkEnd w:id="16"/>
+    </w:p>
+    <w:p>
+      <w:pPr>
+        <w:pStyle w:val="ListParagraph"/>
+        <w:ind w:left="426"/>
+        <w:jc w:val="both"/>
+        <w:rPr>
+          <w:rFonts w:asciiTheme="majorBidi" w:hAnsiTheme="majorBidi" w:cstheme="majorBidi"/>
+          <w:sz w:val="28"/>
+          <w:szCs w:val="28"/>
           <w:lang w:val="en-US"/>
         </w:rPr>
       </w:pPr>
@@ -860,6 +3662,124 @@
 <file path=word/numbering.xml><?xml version="1.0" encoding="utf-8"?>
 <w:numbering xmlns:wpc="http://schemas.microsoft.com/office/word/2010/wordprocessingCanvas" xmlns:cx="http://schemas.microsoft.com/office/drawing/2014/chartex" xmlns:cx1="http://schemas.microsoft.com/office/drawing/2015/9/8/chartex" xmlns:cx2="http://schemas.microsoft.com/office/drawing/2015/10/21/chartex" xmlns:cx3="http://schemas.microsoft.com/office/drawing/2016/5/9/chartex" xmlns:cx4="http://schemas.microsoft.com/office/drawing/2016/5/10/chartex" xmlns:cx5="http://schemas.microsoft.com/office/drawing/2016/5/11/chartex" xmlns:cx6="http://schemas.microsoft.com/office/drawing/2016/5/12/chartex" xmlns:cx7="http://schemas.microsoft.com/office/drawing/2016/5/13/chartex" xmlns:cx8="http://schemas.microsoft.com/office/drawing/2016/5/14/chartex" xmlns:mc="http://schemas.openxmlformats.org/markup-compatibility/2006" xmlns:aink="http://schemas.microsoft.com/office/drawing/2016/ink" xmlns:am3d="http://schemas.microsoft.com/office/drawing/2017/model3d" xmlns:o="urn:schemas-microsoft-com:office:office" xmlns:oel="http://schemas.microsoft.com/office/2019/extlst" xmlns:r="http://schemas.openxmlformats.org/officeDocument/2006/relationships" xmlns:m="http://schemas.openxmlformats.org/officeDocument/2006/math" xmlns:v="urn:schemas-microsoft-com:vml" xmlns:wp14="http://schemas.microsoft.com/office/word/2010/wordprocessingDrawing" xmlns:wp="http://schemas.openxmlformats.org/drawingml/2006/wordprocessingDrawing" xmlns:w10="urn:schemas-microsoft-com:office:word" xmlns:w="http://schemas.openxmlformats.org/wordprocessingml/2006/main" xmlns:w14="http://schemas.microsoft.com/office/word/2010/wordml" xmlns:w15="http://schemas.microsoft.com/office/word/2012/wordml" xmlns:w16cex="http://schemas.microsoft.com/office/word/2018/wordml/cex" xmlns:w16cid="http://schemas.microsoft.com/office/word/2016/wordml/cid" xmlns:w16="http://schemas.microsoft.com/office/word/2018/wordml" xmlns:w16du="http://schemas.microsoft.com/office/word/2023/wordml/word16du" xmlns:w16sdtdh="http://schemas.microsoft.com/office/word/2020/wordml/sdtdatahash" xmlns:w16sdtfl="http://schemas.microsoft.com/office/word/2024/wordml/sdtformatlock" xmlns:w16se="http://schemas.microsoft.com/office/word/2015/wordml/symex" xmlns:wpg="http://schemas.microsoft.com/office/word/2010/wordprocessingGroup" xmlns:wpi="http://schemas.microsoft.com/office/word/2010/wordprocessingInk" xmlns:wne="http://schemas.microsoft.com/office/word/2006/wordml" xmlns:wps="http://schemas.microsoft.com/office/word/2010/wordprocessingShape" mc:Ignorable="w14 w15 w16se w16cid w16 w16cex w16sdtdh w16sdtfl w16du wp14">
   <w:abstractNum w:abstractNumId="0" w15:restartNumberingAfterBreak="0">
+    <w:nsid w:val="1AC10DA0"/>
+    <w:multiLevelType w:val="multilevel"/>
+    <w:tmpl w:val="3D6A6E60"/>
+    <w:lvl w:ilvl="0">
+      <w:start w:val="1"/>
+      <w:numFmt w:val="decimal"/>
+      <w:lvlText w:val="%1."/>
+      <w:lvlJc w:val="left"/>
+      <w:pPr>
+        <w:ind w:left="360" w:hanging="360"/>
+      </w:pPr>
+    </w:lvl>
+    <w:lvl w:ilvl="1">
+      <w:start w:val="1"/>
+      <w:numFmt w:val="decimal"/>
+      <w:isLgl/>
+      <w:lvlText w:val="%1.%2"/>
+      <w:lvlJc w:val="left"/>
+      <w:pPr>
+        <w:ind w:left="846" w:hanging="420"/>
+      </w:pPr>
+      <w:rPr>
+        <w:rFonts w:hint="default"/>
+      </w:rPr>
+    </w:lvl>
+    <w:lvl w:ilvl="2">
+      <w:start w:val="1"/>
+      <w:numFmt w:val="decimal"/>
+      <w:isLgl/>
+      <w:lvlText w:val="%1.%2.%3"/>
+      <w:lvlJc w:val="left"/>
+      <w:pPr>
+        <w:ind w:left="1572" w:hanging="720"/>
+      </w:pPr>
+      <w:rPr>
+        <w:rFonts w:hint="default"/>
+      </w:rPr>
+    </w:lvl>
+    <w:lvl w:ilvl="3">
+      <w:start w:val="1"/>
+      <w:numFmt w:val="decimal"/>
+      <w:isLgl/>
+      <w:lvlText w:val="%1.%2.%3.%4"/>
+      <w:lvlJc w:val="left"/>
+      <w:pPr>
+        <w:ind w:left="2358" w:hanging="1080"/>
+      </w:pPr>
+      <w:rPr>
+        <w:rFonts w:hint="default"/>
+      </w:rPr>
+    </w:lvl>
+    <w:lvl w:ilvl="4">
+      <w:start w:val="1"/>
+      <w:numFmt w:val="decimal"/>
+      <w:isLgl/>
+      <w:lvlText w:val="%1.%2.%3.%4.%5"/>
+      <w:lvlJc w:val="left"/>
+      <w:pPr>
+        <w:ind w:left="2784" w:hanging="1080"/>
+      </w:pPr>
+      <w:rPr>
+        <w:rFonts w:hint="default"/>
+      </w:rPr>
+    </w:lvl>
+    <w:lvl w:ilvl="5">
+      <w:start w:val="1"/>
+      <w:numFmt w:val="decimal"/>
+      <w:isLgl/>
+      <w:lvlText w:val="%1.%2.%3.%4.%5.%6"/>
+      <w:lvlJc w:val="left"/>
+      <w:pPr>
+        <w:ind w:left="3570" w:hanging="1440"/>
+      </w:pPr>
+      <w:rPr>
+        <w:rFonts w:hint="default"/>
+      </w:rPr>
+    </w:lvl>
+    <w:lvl w:ilvl="6">
+      <w:start w:val="1"/>
+      <w:numFmt w:val="decimal"/>
+      <w:isLgl/>
+      <w:lvlText w:val="%1.%2.%3.%4.%5.%6.%7"/>
+      <w:lvlJc w:val="left"/>
+      <w:pPr>
+        <w:ind w:left="3996" w:hanging="1440"/>
+      </w:pPr>
+      <w:rPr>
+        <w:rFonts w:hint="default"/>
+      </w:rPr>
+    </w:lvl>
+    <w:lvl w:ilvl="7">
+      <w:start w:val="1"/>
+      <w:numFmt w:val="decimal"/>
+      <w:isLgl/>
+      <w:lvlText w:val="%1.%2.%3.%4.%5.%6.%7.%8"/>
+      <w:lvlJc w:val="left"/>
+      <w:pPr>
+        <w:ind w:left="4782" w:hanging="1800"/>
+      </w:pPr>
+      <w:rPr>
+        <w:rFonts w:hint="default"/>
+      </w:rPr>
+    </w:lvl>
+    <w:lvl w:ilvl="8">
+      <w:start w:val="1"/>
+      <w:numFmt w:val="decimal"/>
+      <w:isLgl/>
+      <w:lvlText w:val="%1.%2.%3.%4.%5.%6.%7.%8.%9"/>
+      <w:lvlJc w:val="left"/>
+      <w:pPr>
+        <w:ind w:left="5568" w:hanging="2160"/>
+      </w:pPr>
+      <w:rPr>
+        <w:rFonts w:hint="default"/>
+      </w:rPr>
+    </w:lvl>
+  </w:abstractNum>
+  <w:abstractNum w:abstractNumId="1" w15:restartNumberingAfterBreak="0">
     <w:nsid w:val="2D00085D"/>
     <w:multiLevelType w:val="multilevel"/>
     <w:tmpl w:val="0554CBA6"/>
@@ -973,6 +3893,9 @@
     </w:lvl>
   </w:abstractNum>
   <w:num w:numId="1" w16cid:durableId="186062004">
+    <w:abstractNumId w:val="1"/>
+  </w:num>
+  <w:num w:numId="2" w16cid:durableId="256866195">
     <w:abstractNumId w:val="0"/>
   </w:num>
 </w:numbering>
@@ -1826,6 +4749,7 @@
   <w:style w:type="paragraph" w:styleId="ListParagraph">
     <w:name w:val="List Paragraph"/>
     <w:basedOn w:val="Normal"/>
+    <w:link w:val="ListParagraphChar"/>
     <w:uiPriority w:val="34"/>
     <w:qFormat/>
     <w:rsid w:val="00FC3915"/>
@@ -1950,6 +4874,42 @@
       <w:spacing w:after="100"/>
       <w:ind w:left="240"/>
     </w:pPr>
+  </w:style>
+  <w:style w:type="paragraph" w:customStyle="1" w:styleId="Code">
+    <w:name w:val="Code"/>
+    <w:basedOn w:val="ListParagraph"/>
+    <w:link w:val="CodeChar"/>
+    <w:qFormat/>
+    <w:rsid w:val="00525544"/>
+    <w:pPr>
+      <w:shd w:val="clear" w:color="auto" w:fill="D9D9D9" w:themeFill="background1" w:themeFillShade="D9"/>
+      <w:ind w:left="846"/>
+      <w:jc w:val="both"/>
+    </w:pPr>
+    <w:rPr>
+      <w:rFonts w:ascii="Consolas" w:hAnsi="Consolas" w:cstheme="majorBidi"/>
+      <w:sz w:val="22"/>
+      <w:lang w:val="en-US"/>
+    </w:rPr>
+  </w:style>
+  <w:style w:type="character" w:customStyle="1" w:styleId="ListParagraphChar">
+    <w:name w:val="List Paragraph Char"/>
+    <w:basedOn w:val="DefaultParagraphFont"/>
+    <w:link w:val="ListParagraph"/>
+    <w:uiPriority w:val="34"/>
+    <w:rsid w:val="00525544"/>
+  </w:style>
+  <w:style w:type="character" w:customStyle="1" w:styleId="CodeChar">
+    <w:name w:val="Code Char"/>
+    <w:basedOn w:val="ListParagraphChar"/>
+    <w:link w:val="Code"/>
+    <w:rsid w:val="00525544"/>
+    <w:rPr>
+      <w:rFonts w:ascii="Consolas" w:hAnsi="Consolas" w:cstheme="majorBidi"/>
+      <w:sz w:val="22"/>
+      <w:shd w:val="clear" w:color="auto" w:fill="D9D9D9" w:themeFill="background1" w:themeFillShade="D9"/>
+      <w:lang w:val="en-US"/>
+    </w:rPr>
   </w:style>
 </w:styles>
 </file>

</xml_diff>

<commit_message>
docs: section 5 expressions added to LSD
</commit_message>
<xml_diff>
--- a/spec/LSD.docx
+++ b/spec/LSD.docx
@@ -4683,12 +4683,14 @@
         </w:rPr>
         <w:t xml:space="preserve">, </w:t>
       </w:r>
+      <w:proofErr w:type="spellStart"/>
       <w:r>
         <w:rPr>
           <w:rStyle w:val="CodeChar"/>
         </w:rPr>
         <w:t>my_var</w:t>
       </w:r>
+      <w:proofErr w:type="spellEnd"/>
       <w:r>
         <w:rPr>
           <w:rFonts w:asciiTheme="majorBidi" w:hAnsiTheme="majorBidi" w:cstheme="majorBidi"/>
@@ -5145,12 +5147,14 @@
         </w:rPr>
         <w:t xml:space="preserve">, </w:t>
       </w:r>
+      <w:proofErr w:type="spellStart"/>
       <w:r>
         <w:rPr>
           <w:rStyle w:val="CodeChar"/>
         </w:rPr>
         <w:t>NaN</w:t>
       </w:r>
+      <w:proofErr w:type="spellEnd"/>
       <w:r>
         <w:rPr>
           <w:rFonts w:asciiTheme="majorBidi" w:hAnsiTheme="majorBidi" w:cstheme="majorBidi"/>
@@ -5654,7 +5658,15 @@
         <w:pStyle w:val="Code"/>
       </w:pPr>
       <w:r>
-        <w:t>"line one\nline two"</w:t>
+        <w:t>"line one\</w:t>
+      </w:r>
+      <w:proofErr w:type="spellStart"/>
+      <w:r>
+        <w:t>nline</w:t>
+      </w:r>
+      <w:proofErr w:type="spellEnd"/>
+      <w:r>
+        <w:t xml:space="preserve"> two"</w:t>
       </w:r>
     </w:p>
     <w:p>
@@ -5815,7 +5827,15 @@
         <w:pStyle w:val="Code"/>
       </w:pPr>
       <w:r>
-        <w:t>msg = f"Welcome to {name} v{version}"</w:t>
+        <w:t xml:space="preserve">msg = </w:t>
+      </w:r>
+      <w:proofErr w:type="spellStart"/>
+      <w:r>
+        <w:t>f"Welcome</w:t>
+      </w:r>
+      <w:proofErr w:type="spellEnd"/>
+      <w:r>
+        <w:t xml:space="preserve"> to {name} v{version}"</w:t>
       </w:r>
     </w:p>
     <w:p>
@@ -6370,11 +6390,19 @@
         </w:rPr>
         <w:t xml:space="preserve"> Strings are immutable – indexed assignment is a runtime error. The built-in </w:t>
       </w:r>
+      <w:proofErr w:type="spellStart"/>
       <w:r>
         <w:rPr>
           <w:rStyle w:val="CodeChar"/>
         </w:rPr>
-        <w:t>len()</w:t>
+        <w:t>len</w:t>
+      </w:r>
+      <w:proofErr w:type="spellEnd"/>
+      <w:r>
+        <w:rPr>
+          <w:rStyle w:val="CodeChar"/>
+        </w:rPr>
+        <w:t>()</w:t>
       </w:r>
       <w:r>
         <w:rPr>
@@ -6413,7 +6441,15 @@
         <w:pStyle w:val="Code"/>
       </w:pPr>
       <w:r>
-        <w:t>n = len(s)</w:t>
+        <w:t xml:space="preserve">n = </w:t>
+      </w:r>
+      <w:proofErr w:type="spellStart"/>
+      <w:r>
+        <w:t>len</w:t>
+      </w:r>
+      <w:proofErr w:type="spellEnd"/>
+      <w:r>
+        <w:t>(s)</w:t>
       </w:r>
     </w:p>
     <w:p>
@@ -6786,12 +6822,14 @@
         </w:rPr>
         <w:t xml:space="preserve"> value is a runtime </w:t>
       </w:r>
+      <w:proofErr w:type="spellStart"/>
       <w:r>
         <w:rPr>
           <w:rStyle w:val="CodeChar"/>
         </w:rPr>
         <w:t>AttributeError</w:t>
       </w:r>
+      <w:proofErr w:type="spellEnd"/>
       <w:r>
         <w:rPr>
           <w:rFonts w:asciiTheme="majorBidi" w:hAnsiTheme="majorBidi" w:cstheme="majorBidi"/>
@@ -6914,11 +6952,19 @@
         </w:rPr>
         <w:t xml:space="preserve">The List type represents ordered, mutable sequence of values. Lists are written using square bracket syntax with comma-separated elements. Elements can be of any type and a single list can contain values of mixed types. Lists are zero-indexed and support negative indexing from the end. The built in </w:t>
       </w:r>
+      <w:proofErr w:type="spellStart"/>
       <w:r>
         <w:rPr>
           <w:rStyle w:val="CodeChar"/>
         </w:rPr>
-        <w:t>len()</w:t>
+        <w:t>len</w:t>
+      </w:r>
+      <w:proofErr w:type="spellEnd"/>
+      <w:r>
+        <w:rPr>
+          <w:rStyle w:val="CodeChar"/>
+        </w:rPr>
+        <w:t>()</w:t>
       </w:r>
       <w:r>
         <w:rPr>
@@ -6932,9 +6978,14 @@
       <w:pPr>
         <w:pStyle w:val="Code"/>
       </w:pPr>
+      <w:proofErr w:type="spellStart"/>
       <w:r>
         <w:lastRenderedPageBreak/>
-        <w:t>nums = [1, 2, 3, 4, 5]</w:t>
+        <w:t>nums</w:t>
+      </w:r>
+      <w:proofErr w:type="spellEnd"/>
+      <w:r>
+        <w:t xml:space="preserve"> = [1, 2, 3, 4, 5]</w:t>
       </w:r>
     </w:p>
     <w:p>
@@ -6950,23 +7001,44 @@
         <w:pStyle w:val="Code"/>
       </w:pPr>
       <w:r>
-        <w:t>first = nums[0]</w:t>
-      </w:r>
-    </w:p>
-    <w:p>
-      <w:pPr>
-        <w:pStyle w:val="Code"/>
-      </w:pPr>
-      <w:r>
-        <w:t>last = nums[-1]</w:t>
-      </w:r>
-    </w:p>
-    <w:p>
-      <w:pPr>
-        <w:pStyle w:val="Code"/>
-      </w:pPr>
-      <w:r>
-        <w:t>nums[0] = 99</w:t>
+        <w:t xml:space="preserve">first = </w:t>
+      </w:r>
+      <w:proofErr w:type="spellStart"/>
+      <w:r>
+        <w:t>nums</w:t>
+      </w:r>
+      <w:proofErr w:type="spellEnd"/>
+      <w:r>
+        <w:t>[0]</w:t>
+      </w:r>
+    </w:p>
+    <w:p>
+      <w:pPr>
+        <w:pStyle w:val="Code"/>
+      </w:pPr>
+      <w:r>
+        <w:t xml:space="preserve">last = </w:t>
+      </w:r>
+      <w:proofErr w:type="spellStart"/>
+      <w:r>
+        <w:t>nums</w:t>
+      </w:r>
+      <w:proofErr w:type="spellEnd"/>
+      <w:r>
+        <w:t>[-1]</w:t>
+      </w:r>
+    </w:p>
+    <w:p>
+      <w:pPr>
+        <w:pStyle w:val="Code"/>
+      </w:pPr>
+      <w:proofErr w:type="spellStart"/>
+      <w:r>
+        <w:t>nums</w:t>
+      </w:r>
+      <w:proofErr w:type="spellEnd"/>
+      <w:r>
+        <w:t>[0] = 99</w:t>
       </w:r>
     </w:p>
     <w:p>
@@ -7022,12 +7094,14 @@
         </w:rPr>
         <w:t xml:space="preserve">The Dict type represents mutable mappings from keys to values. Dict literals are written using curly brace syntax with comma-separated key-value pairs separated by colons. Keys must be strings, numbers, or boolean – any hashable Pulse value. Values can be of any type. Dict access uses square bracket syntax, and assigning to a key that does not exist create a new entry. Accessing a key that does not exist raises a </w:t>
       </w:r>
+      <w:proofErr w:type="spellStart"/>
       <w:r>
         <w:rPr>
           <w:rStyle w:val="CodeChar"/>
         </w:rPr>
         <w:t>KeyError</w:t>
       </w:r>
+      <w:proofErr w:type="spellEnd"/>
       <w:r>
         <w:rPr>
           <w:rFonts w:asciiTheme="majorBidi" w:hAnsiTheme="majorBidi" w:cstheme="majorBidi"/>
@@ -7326,23 +7400,47 @@
         <w:pStyle w:val="Code"/>
       </w:pPr>
       <w:r>
-        <w:t>print(m.shape)</w:t>
-      </w:r>
-    </w:p>
-    <w:p>
-      <w:pPr>
-        <w:pStyle w:val="Code"/>
-      </w:pPr>
-      <w:r>
-        <w:t>print(m.T)</w:t>
-      </w:r>
-    </w:p>
-    <w:p>
-      <w:pPr>
-        <w:pStyle w:val="Code"/>
-      </w:pPr>
-      <w:r>
-        <w:t>print(v.mean())</w:t>
+        <w:t>print(</w:t>
+      </w:r>
+      <w:proofErr w:type="spellStart"/>
+      <w:r>
+        <w:t>m.shape</w:t>
+      </w:r>
+      <w:proofErr w:type="spellEnd"/>
+      <w:r>
+        <w:t>)</w:t>
+      </w:r>
+    </w:p>
+    <w:p>
+      <w:pPr>
+        <w:pStyle w:val="Code"/>
+      </w:pPr>
+      <w:r>
+        <w:t>print(</w:t>
+      </w:r>
+      <w:proofErr w:type="spellStart"/>
+      <w:r>
+        <w:t>m.T</w:t>
+      </w:r>
+      <w:proofErr w:type="spellEnd"/>
+      <w:r>
+        <w:t>)</w:t>
+      </w:r>
+    </w:p>
+    <w:p>
+      <w:pPr>
+        <w:pStyle w:val="Code"/>
+      </w:pPr>
+      <w:r>
+        <w:t>print(</w:t>
+      </w:r>
+      <w:proofErr w:type="spellStart"/>
+      <w:r>
+        <w:t>v.mean</w:t>
+      </w:r>
+      <w:proofErr w:type="spellEnd"/>
+      <w:r>
+        <w:t>())</w:t>
       </w:r>
     </w:p>
     <w:p>
@@ -7564,15 +7662,31 @@
         <w:pStyle w:val="Code"/>
       </w:pPr>
       <w:r>
-        <w:t xml:space="preserve">        self.x = x</w:t>
-      </w:r>
-    </w:p>
-    <w:p>
-      <w:pPr>
-        <w:pStyle w:val="Code"/>
-      </w:pPr>
-      <w:r>
-        <w:t xml:space="preserve">        self.y = y</w:t>
+        <w:t xml:space="preserve">        </w:t>
+      </w:r>
+      <w:proofErr w:type="spellStart"/>
+      <w:r>
+        <w:t>self.x</w:t>
+      </w:r>
+      <w:proofErr w:type="spellEnd"/>
+      <w:r>
+        <w:t xml:space="preserve"> = x</w:t>
+      </w:r>
+    </w:p>
+    <w:p>
+      <w:pPr>
+        <w:pStyle w:val="Code"/>
+      </w:pPr>
+      <w:r>
+        <w:t xml:space="preserve">        </w:t>
+      </w:r>
+      <w:proofErr w:type="spellStart"/>
+      <w:r>
+        <w:t>self.y</w:t>
+      </w:r>
+      <w:proofErr w:type="spellEnd"/>
+      <w:r>
+        <w:t xml:space="preserve"> = y</w:t>
       </w:r>
     </w:p>
     <w:p>
@@ -7593,7 +7707,15 @@
         <w:pStyle w:val="Code"/>
       </w:pPr>
       <w:r>
-        <w:t>print(p.x)</w:t>
+        <w:t>print(</w:t>
+      </w:r>
+      <w:proofErr w:type="spellStart"/>
+      <w:r>
+        <w:t>p.x</w:t>
+      </w:r>
+      <w:proofErr w:type="spellEnd"/>
+      <w:r>
+        <w:t>)</w:t>
       </w:r>
     </w:p>
     <w:p>
@@ -7714,11 +7836,19 @@
         </w:rPr>
         <w:t xml:space="preserve">, and </w:t>
       </w:r>
+      <w:proofErr w:type="spellStart"/>
       <w:r>
         <w:rPr>
           <w:rStyle w:val="CodeChar"/>
         </w:rPr>
-        <w:t>is_trained()</w:t>
+        <w:t>is_trained</w:t>
+      </w:r>
+      <w:proofErr w:type="spellEnd"/>
+      <w:r>
+        <w:rPr>
+          <w:rStyle w:val="CodeChar"/>
+        </w:rPr>
+        <w:t>()</w:t>
       </w:r>
       <w:r>
         <w:rPr>
@@ -7747,31 +7877,89 @@
         <w:pStyle w:val="Code"/>
       </w:pPr>
       <w:r>
-        <w:t>model = models.LinearRegression()</w:t>
-      </w:r>
-    </w:p>
-    <w:p>
-      <w:pPr>
-        <w:pStyle w:val="Code"/>
-      </w:pPr>
-      <w:r>
-        <w:t>model.train(X_train, y_train)</w:t>
-      </w:r>
-    </w:p>
-    <w:p>
-      <w:pPr>
-        <w:pStyle w:val="Code"/>
-      </w:pPr>
-      <w:r>
-        <w:t>print(model.score(X_test, y_test))</w:t>
-      </w:r>
-    </w:p>
-    <w:p>
-      <w:pPr>
-        <w:pStyle w:val="Code"/>
-      </w:pPr>
-      <w:r>
-        <w:t>model.explain()</w:t>
+        <w:t xml:space="preserve">model = </w:t>
+      </w:r>
+      <w:proofErr w:type="spellStart"/>
+      <w:r>
+        <w:t>models.LinearRegression</w:t>
+      </w:r>
+      <w:proofErr w:type="spellEnd"/>
+      <w:r>
+        <w:t>()</w:t>
+      </w:r>
+    </w:p>
+    <w:p>
+      <w:pPr>
+        <w:pStyle w:val="Code"/>
+      </w:pPr>
+      <w:proofErr w:type="spellStart"/>
+      <w:r>
+        <w:t>model.train</w:t>
+      </w:r>
+      <w:proofErr w:type="spellEnd"/>
+      <w:r>
+        <w:t>(</w:t>
+      </w:r>
+      <w:proofErr w:type="spellStart"/>
+      <w:r>
+        <w:t>X_train</w:t>
+      </w:r>
+      <w:proofErr w:type="spellEnd"/>
+      <w:r>
+        <w:t xml:space="preserve">, </w:t>
+      </w:r>
+      <w:proofErr w:type="spellStart"/>
+      <w:r>
+        <w:t>y_train</w:t>
+      </w:r>
+      <w:proofErr w:type="spellEnd"/>
+      <w:r>
+        <w:t>)</w:t>
+      </w:r>
+    </w:p>
+    <w:p>
+      <w:pPr>
+        <w:pStyle w:val="Code"/>
+      </w:pPr>
+      <w:r>
+        <w:t>print(</w:t>
+      </w:r>
+      <w:proofErr w:type="spellStart"/>
+      <w:r>
+        <w:t>model.score</w:t>
+      </w:r>
+      <w:proofErr w:type="spellEnd"/>
+      <w:r>
+        <w:t>(</w:t>
+      </w:r>
+      <w:proofErr w:type="spellStart"/>
+      <w:r>
+        <w:t>X_test</w:t>
+      </w:r>
+      <w:proofErr w:type="spellEnd"/>
+      <w:r>
+        <w:t xml:space="preserve">, </w:t>
+      </w:r>
+      <w:proofErr w:type="spellStart"/>
+      <w:r>
+        <w:t>y_test</w:t>
+      </w:r>
+      <w:proofErr w:type="spellEnd"/>
+      <w:r>
+        <w:t>))</w:t>
+      </w:r>
+    </w:p>
+    <w:p>
+      <w:pPr>
+        <w:pStyle w:val="Code"/>
+      </w:pPr>
+      <w:proofErr w:type="spellStart"/>
+      <w:r>
+        <w:t>model.explain</w:t>
+      </w:r>
+      <w:proofErr w:type="spellEnd"/>
+      <w:r>
+        <w:t>()</w:t>
       </w:r>
     </w:p>
     <w:p>
@@ -7970,39 +8158,70 @@
         <w:pStyle w:val="Code"/>
       </w:pPr>
       <w:r>
-        <w:t>ds = datasets.iris()</w:t>
-      </w:r>
-    </w:p>
-    <w:p>
-      <w:pPr>
-        <w:pStyle w:val="Code"/>
-      </w:pPr>
-      <w:r>
-        <w:t>ds.describe()</w:t>
-      </w:r>
-    </w:p>
-    <w:p>
-      <w:pPr>
-        <w:pStyle w:val="Code"/>
-      </w:pPr>
-      <w:r>
-        <w:t>split = ds.shuffle(42).normalize("standard").split(0.8)</w:t>
-      </w:r>
-    </w:p>
-    <w:p>
-      <w:pPr>
-        <w:pStyle w:val="Code"/>
-      </w:pPr>
-      <w:r>
-        <w:t>X_train = split["train"].features()</w:t>
-      </w:r>
-    </w:p>
-    <w:p>
-      <w:pPr>
-        <w:pStyle w:val="Code"/>
-      </w:pPr>
-      <w:r>
-        <w:t>y_train = split["train"].labels()</w:t>
+        <w:t xml:space="preserve">ds = </w:t>
+      </w:r>
+      <w:proofErr w:type="spellStart"/>
+      <w:r>
+        <w:t>datasets.iris</w:t>
+      </w:r>
+      <w:proofErr w:type="spellEnd"/>
+      <w:r>
+        <w:t>()</w:t>
+      </w:r>
+    </w:p>
+    <w:p>
+      <w:pPr>
+        <w:pStyle w:val="Code"/>
+      </w:pPr>
+      <w:proofErr w:type="spellStart"/>
+      <w:r>
+        <w:t>ds.describe</w:t>
+      </w:r>
+      <w:proofErr w:type="spellEnd"/>
+      <w:r>
+        <w:t>()</w:t>
+      </w:r>
+    </w:p>
+    <w:p>
+      <w:pPr>
+        <w:pStyle w:val="Code"/>
+      </w:pPr>
+      <w:r>
+        <w:t xml:space="preserve">split = </w:t>
+      </w:r>
+      <w:proofErr w:type="spellStart"/>
+      <w:r>
+        <w:t>ds.shuffle</w:t>
+      </w:r>
+      <w:proofErr w:type="spellEnd"/>
+      <w:r>
+        <w:t>(42).normalize("standard").split(0.8)</w:t>
+      </w:r>
+    </w:p>
+    <w:p>
+      <w:pPr>
+        <w:pStyle w:val="Code"/>
+      </w:pPr>
+      <w:proofErr w:type="spellStart"/>
+      <w:r>
+        <w:t>X_train</w:t>
+      </w:r>
+      <w:proofErr w:type="spellEnd"/>
+      <w:r>
+        <w:t xml:space="preserve"> = split["train"].features()</w:t>
+      </w:r>
+    </w:p>
+    <w:p>
+      <w:pPr>
+        <w:pStyle w:val="Code"/>
+      </w:pPr>
+      <w:proofErr w:type="spellStart"/>
+      <w:r>
+        <w:t>y_train</w:t>
+      </w:r>
+      <w:proofErr w:type="spellEnd"/>
+      <w:r>
+        <w:t xml:space="preserve"> = split["train"].labels()</w:t>
       </w:r>
     </w:p>
     <w:p>
@@ -8137,12 +8356,14 @@
         </w:rPr>
         <w:t xml:space="preserve">Arithmetic operators work on Number values. Applying an arithmetic operator to a non-numeric value raises a </w:t>
       </w:r>
+      <w:proofErr w:type="spellStart"/>
       <w:r>
         <w:rPr>
           <w:rStyle w:val="CodeChar"/>
         </w:rPr>
         <w:t>TypeError</w:t>
       </w:r>
+      <w:proofErr w:type="spellEnd"/>
       <w:r>
         <w:rPr>
           <w:rFonts w:asciiTheme="majorBidi" w:hAnsiTheme="majorBidi" w:cstheme="majorBidi"/>
@@ -8919,6 +9140,97 @@
           </w:p>
         </w:tc>
       </w:tr>
+      <w:tr>
+        <w:tc>
+          <w:tcPr>
+            <w:tcW w:w="1984" w:type="dxa"/>
+          </w:tcPr>
+          <w:p>
+            <w:pPr>
+              <w:pStyle w:val="ListParagraph"/>
+              <w:ind w:left="0"/>
+              <w:jc w:val="both"/>
+              <w:rPr>
+                <w:rStyle w:val="CodeChar"/>
+              </w:rPr>
+            </w:pPr>
+            <w:r>
+              <w:rPr>
+                <w:rStyle w:val="CodeChar"/>
+              </w:rPr>
+              <w:t>**</w:t>
+            </w:r>
+          </w:p>
+        </w:tc>
+        <w:tc>
+          <w:tcPr>
+            <w:tcW w:w="3402" w:type="dxa"/>
+          </w:tcPr>
+          <w:p>
+            <w:pPr>
+              <w:pStyle w:val="ListParagraph"/>
+              <w:ind w:left="0"/>
+              <w:jc w:val="both"/>
+              <w:rPr>
+                <w:rFonts w:asciiTheme="majorBidi" w:hAnsiTheme="majorBidi" w:cstheme="majorBidi"/>
+                <w:lang w:val="en-US"/>
+              </w:rPr>
+            </w:pPr>
+            <w:r>
+              <w:rPr>
+                <w:rFonts w:asciiTheme="majorBidi" w:hAnsiTheme="majorBidi" w:cstheme="majorBidi"/>
+                <w:lang w:val="en-US"/>
+              </w:rPr>
+              <w:t>Exponentiation</w:t>
+            </w:r>
+          </w:p>
+        </w:tc>
+        <w:tc>
+          <w:tcPr>
+            <w:tcW w:w="3504" w:type="dxa"/>
+          </w:tcPr>
+          <w:p>
+            <w:pPr>
+              <w:pStyle w:val="ListParagraph"/>
+              <w:ind w:left="0"/>
+              <w:jc w:val="both"/>
+              <w:rPr>
+                <w:rStyle w:val="CodeChar"/>
+              </w:rPr>
+            </w:pPr>
+            <w:r>
+              <w:rPr>
+                <w:rStyle w:val="CodeChar"/>
+              </w:rPr>
+              <w:t>2 ** 10</w:t>
+            </w:r>
+            <w:r>
+              <w:t xml:space="preserve"> </w:t>
+            </w:r>
+            <m:oMath>
+              <m:r>
+                <m:rPr>
+                  <m:sty m:val="p"/>
+                </m:rPr>
+                <w:rPr>
+                  <w:rFonts w:ascii="Cambria Math" w:hAnsi="Cambria Math"/>
+                </w:rPr>
+                <m:t>→</m:t>
+              </m:r>
+            </m:oMath>
+            <w:r>
+              <w:t xml:space="preserve"> </w:t>
+            </w:r>
+            <w:r>
+              <w:rPr>
+                <w:rStyle w:val="CodeChar"/>
+                <w:rFonts w:eastAsiaTheme="minorEastAsia"/>
+              </w:rPr>
+              <w:t>1024</w:t>
+            </w:r>
+          </w:p>
+        </w:tc>
+      </w:tr>
     </w:tbl>
     <w:p>
       <w:pPr>
@@ -9041,12 +9353,14 @@
         </w:rPr>
         <w:t xml:space="preserve">Comparison operators compare two values and return a Boolean result. Numeric comparisons follow standard mathematical ordering. String comparisons follow lexicographic ordering. Comparing values of incompatible types raises a </w:t>
       </w:r>
+      <w:proofErr w:type="spellStart"/>
       <w:r>
         <w:rPr>
           <w:rStyle w:val="CodeChar"/>
         </w:rPr>
         <w:t>TypeError</w:t>
       </w:r>
+      <w:proofErr w:type="spellEnd"/>
       <w:r>
         <w:rPr>
           <w:rFonts w:asciiTheme="majorBidi" w:hAnsiTheme="majorBidi" w:cstheme="majorBidi"/>
@@ -10177,7 +10491,23 @@
           <w:rFonts w:asciiTheme="majorBidi" w:hAnsiTheme="majorBidi" w:cstheme="majorBidi"/>
           <w:lang w:val="en-US"/>
         </w:rPr>
-        <w:t xml:space="preserve"> and </w:t>
+        <w:t xml:space="preserve"> </w:t>
+      </w:r>
+      <w:proofErr w:type="spellStart"/>
+      <w:r>
+        <w:rPr>
+          <w:rFonts w:asciiTheme="majorBidi" w:hAnsiTheme="majorBidi" w:cstheme="majorBidi"/>
+          <w:lang w:val="en-US"/>
+        </w:rPr>
+        <w:t>and</w:t>
+      </w:r>
+      <w:proofErr w:type="spellEnd"/>
+      <w:r>
+        <w:rPr>
+          <w:rFonts w:asciiTheme="majorBidi" w:hAnsiTheme="majorBidi" w:cstheme="majorBidi"/>
+          <w:lang w:val="en-US"/>
+        </w:rPr>
+        <w:t xml:space="preserve"> </w:t>
       </w:r>
       <w:r>
         <w:rPr>
@@ -10405,6 +10735,7 @@
               </w:rPr>
               <w:t xml:space="preserve"> </w:t>
             </w:r>
+            <w:proofErr w:type="spellStart"/>
             <w:r>
               <w:rPr>
                 <w:rFonts w:ascii="Consolas" w:hAnsi="Consolas" w:cstheme="majorBidi"/>
@@ -10414,6 +10745,7 @@
               </w:rPr>
               <w:t>False</w:t>
             </w:r>
+            <w:proofErr w:type="spellEnd"/>
           </w:p>
         </w:tc>
       </w:tr>
@@ -10519,6 +10851,7 @@
               </w:rPr>
               <w:t xml:space="preserve"> </w:t>
             </w:r>
+            <w:proofErr w:type="spellStart"/>
             <w:r>
               <w:rPr>
                 <w:rFonts w:ascii="Consolas" w:hAnsi="Consolas" w:cstheme="majorBidi"/>
@@ -10528,6 +10861,7 @@
               </w:rPr>
               <w:t>True</w:t>
             </w:r>
+            <w:proofErr w:type="spellEnd"/>
           </w:p>
         </w:tc>
       </w:tr>
@@ -13095,14 +13429,14 @@
         <w:tblLook w:val="04A0" w:firstRow="1" w:lastRow="0" w:firstColumn="1" w:lastColumn="0" w:noHBand="0" w:noVBand="1"/>
       </w:tblPr>
       <w:tblGrid>
-        <w:gridCol w:w="2945"/>
-        <w:gridCol w:w="2947"/>
-        <w:gridCol w:w="2998"/>
+        <w:gridCol w:w="2126"/>
+        <w:gridCol w:w="3119"/>
+        <w:gridCol w:w="3645"/>
       </w:tblGrid>
       <w:tr>
         <w:tc>
           <w:tcPr>
-            <w:tcW w:w="3245" w:type="dxa"/>
+            <w:tcW w:w="2126" w:type="dxa"/>
           </w:tcPr>
           <w:p>
             <w:pPr>
@@ -13125,7 +13459,7 @@
         </w:tc>
         <w:tc>
           <w:tcPr>
-            <w:tcW w:w="3245" w:type="dxa"/>
+            <w:tcW w:w="3119" w:type="dxa"/>
           </w:tcPr>
           <w:p>
             <w:pPr>
@@ -13148,7 +13482,7 @@
         </w:tc>
         <w:tc>
           <w:tcPr>
-            <w:tcW w:w="3246" w:type="dxa"/>
+            <w:tcW w:w="3645" w:type="dxa"/>
           </w:tcPr>
           <w:p>
             <w:pPr>
@@ -13173,7 +13507,7 @@
       <w:tr>
         <w:tc>
           <w:tcPr>
-            <w:tcW w:w="3245" w:type="dxa"/>
+            <w:tcW w:w="2126" w:type="dxa"/>
           </w:tcPr>
           <w:p>
             <w:pPr>
@@ -13196,7 +13530,7 @@
         </w:tc>
         <w:tc>
           <w:tcPr>
-            <w:tcW w:w="3245" w:type="dxa"/>
+            <w:tcW w:w="3119" w:type="dxa"/>
           </w:tcPr>
           <w:p>
             <w:pPr>
@@ -13225,7 +13559,7 @@
         </w:tc>
         <w:tc>
           <w:tcPr>
-            <w:tcW w:w="3246" w:type="dxa"/>
+            <w:tcW w:w="3645" w:type="dxa"/>
           </w:tcPr>
           <w:p>
             <w:pPr>
@@ -13250,7 +13584,7 @@
       <w:tr>
         <w:tc>
           <w:tcPr>
-            <w:tcW w:w="3245" w:type="dxa"/>
+            <w:tcW w:w="2126" w:type="dxa"/>
           </w:tcPr>
           <w:p>
             <w:pPr>
@@ -13273,7 +13607,7 @@
         </w:tc>
         <w:tc>
           <w:tcPr>
-            <w:tcW w:w="3245" w:type="dxa"/>
+            <w:tcW w:w="3119" w:type="dxa"/>
           </w:tcPr>
           <w:p>
             <w:pPr>
@@ -13302,7 +13636,7 @@
         </w:tc>
         <w:tc>
           <w:tcPr>
-            <w:tcW w:w="3246" w:type="dxa"/>
+            <w:tcW w:w="3645" w:type="dxa"/>
           </w:tcPr>
           <w:p>
             <w:pPr>
@@ -13327,7 +13661,7 @@
       <w:tr>
         <w:tc>
           <w:tcPr>
-            <w:tcW w:w="3245" w:type="dxa"/>
+            <w:tcW w:w="2126" w:type="dxa"/>
           </w:tcPr>
           <w:p>
             <w:pPr>
@@ -13350,7 +13684,7 @@
         </w:tc>
         <w:tc>
           <w:tcPr>
-            <w:tcW w:w="3245" w:type="dxa"/>
+            <w:tcW w:w="3119" w:type="dxa"/>
           </w:tcPr>
           <w:p>
             <w:pPr>
@@ -13379,7 +13713,7 @@
         </w:tc>
         <w:tc>
           <w:tcPr>
-            <w:tcW w:w="3246" w:type="dxa"/>
+            <w:tcW w:w="3645" w:type="dxa"/>
           </w:tcPr>
           <w:p>
             <w:pPr>
@@ -13404,7 +13738,7 @@
       <w:tr>
         <w:tc>
           <w:tcPr>
-            <w:tcW w:w="3245" w:type="dxa"/>
+            <w:tcW w:w="2126" w:type="dxa"/>
           </w:tcPr>
           <w:p>
             <w:pPr>
@@ -13427,7 +13761,7 @@
         </w:tc>
         <w:tc>
           <w:tcPr>
-            <w:tcW w:w="3245" w:type="dxa"/>
+            <w:tcW w:w="3119" w:type="dxa"/>
           </w:tcPr>
           <w:p>
             <w:pPr>
@@ -13488,7 +13822,7 @@
         </w:tc>
         <w:tc>
           <w:tcPr>
-            <w:tcW w:w="3246" w:type="dxa"/>
+            <w:tcW w:w="3645" w:type="dxa"/>
           </w:tcPr>
           <w:p>
             <w:pPr>
@@ -13513,7 +13847,7 @@
       <w:tr>
         <w:tc>
           <w:tcPr>
-            <w:tcW w:w="3245" w:type="dxa"/>
+            <w:tcW w:w="2126" w:type="dxa"/>
           </w:tcPr>
           <w:p>
             <w:pPr>
@@ -13536,7 +13870,7 @@
         </w:tc>
         <w:tc>
           <w:tcPr>
-            <w:tcW w:w="3245" w:type="dxa"/>
+            <w:tcW w:w="3119" w:type="dxa"/>
           </w:tcPr>
           <w:p>
             <w:pPr>
@@ -13623,7 +13957,7 @@
         </w:tc>
         <w:tc>
           <w:tcPr>
-            <w:tcW w:w="3246" w:type="dxa"/>
+            <w:tcW w:w="3645" w:type="dxa"/>
           </w:tcPr>
           <w:p>
             <w:pPr>
@@ -13648,7 +13982,7 @@
       <w:tr>
         <w:tc>
           <w:tcPr>
-            <w:tcW w:w="3245" w:type="dxa"/>
+            <w:tcW w:w="2126" w:type="dxa"/>
           </w:tcPr>
           <w:p>
             <w:pPr>
@@ -13671,7 +14005,7 @@
         </w:tc>
         <w:tc>
           <w:tcPr>
-            <w:tcW w:w="3245" w:type="dxa"/>
+            <w:tcW w:w="3119" w:type="dxa"/>
           </w:tcPr>
           <w:p>
             <w:pPr>
@@ -13706,7 +14040,7 @@
         </w:tc>
         <w:tc>
           <w:tcPr>
-            <w:tcW w:w="3246" w:type="dxa"/>
+            <w:tcW w:w="3645" w:type="dxa"/>
           </w:tcPr>
           <w:p>
             <w:pPr>
@@ -13731,7 +14065,7 @@
       <w:tr>
         <w:tc>
           <w:tcPr>
-            <w:tcW w:w="3245" w:type="dxa"/>
+            <w:tcW w:w="2126" w:type="dxa"/>
           </w:tcPr>
           <w:p>
             <w:pPr>
@@ -13754,7 +14088,7 @@
         </w:tc>
         <w:tc>
           <w:tcPr>
-            <w:tcW w:w="3245" w:type="dxa"/>
+            <w:tcW w:w="3119" w:type="dxa"/>
           </w:tcPr>
           <w:p>
             <w:pPr>
@@ -13815,7 +14149,7 @@
         </w:tc>
         <w:tc>
           <w:tcPr>
-            <w:tcW w:w="3246" w:type="dxa"/>
+            <w:tcW w:w="3645" w:type="dxa"/>
           </w:tcPr>
           <w:p>
             <w:pPr>
@@ -13840,7 +14174,7 @@
       <w:tr>
         <w:tc>
           <w:tcPr>
-            <w:tcW w:w="3245" w:type="dxa"/>
+            <w:tcW w:w="2126" w:type="dxa"/>
           </w:tcPr>
           <w:p>
             <w:pPr>
@@ -13863,7 +14197,7 @@
         </w:tc>
         <w:tc>
           <w:tcPr>
-            <w:tcW w:w="3245" w:type="dxa"/>
+            <w:tcW w:w="3119" w:type="dxa"/>
           </w:tcPr>
           <w:p>
             <w:pPr>
@@ -13871,28 +14205,44 @@
               <w:ind w:left="0"/>
               <w:jc w:val="both"/>
               <w:rPr>
-                <w:rFonts w:asciiTheme="majorBidi" w:hAnsiTheme="majorBidi" w:cstheme="majorBidi"/>
-                <w:lang w:val="en-US"/>
+                <w:rStyle w:val="CodeChar"/>
               </w:rPr>
             </w:pPr>
             <w:r>
               <w:rPr>
                 <w:rStyle w:val="CodeChar"/>
               </w:rPr>
-              <w:t>@</w:t>
-            </w:r>
-            <w:r>
-              <w:rPr>
-                <w:rFonts w:asciiTheme="majorBidi" w:hAnsiTheme="majorBidi" w:cstheme="majorBidi"/>
-                <w:lang w:val="en-US"/>
-              </w:rPr>
-              <w:t xml:space="preserve"> </w:t>
+              <w:t>**</w:t>
             </w:r>
           </w:p>
         </w:tc>
         <w:tc>
           <w:tcPr>
-            <w:tcW w:w="3246" w:type="dxa"/>
+            <w:tcW w:w="3645" w:type="dxa"/>
+          </w:tcPr>
+          <w:p>
+            <w:pPr>
+              <w:pStyle w:val="ListParagraph"/>
+              <w:ind w:left="0"/>
+              <w:rPr>
+                <w:rFonts w:asciiTheme="majorBidi" w:hAnsiTheme="majorBidi" w:cstheme="majorBidi"/>
+                <w:lang w:val="en-US"/>
+              </w:rPr>
+            </w:pPr>
+            <w:r>
+              <w:rPr>
+                <w:rFonts w:asciiTheme="majorBidi" w:hAnsiTheme="majorBidi" w:cstheme="majorBidi"/>
+                <w:lang w:val="en-US"/>
+              </w:rPr>
+              <w:t>Exponentiation (right-associative)</w:t>
+            </w:r>
+          </w:p>
+        </w:tc>
+      </w:tr>
+      <w:tr>
+        <w:tc>
+          <w:tcPr>
+            <w:tcW w:w="2126" w:type="dxa"/>
           </w:tcPr>
           <w:p>
             <w:pPr>
@@ -13909,6 +14259,58 @@
                 <w:rFonts w:asciiTheme="majorBidi" w:hAnsiTheme="majorBidi" w:cstheme="majorBidi"/>
                 <w:lang w:val="en-US"/>
               </w:rPr>
+              <w:t>9</w:t>
+            </w:r>
+          </w:p>
+        </w:tc>
+        <w:tc>
+          <w:tcPr>
+            <w:tcW w:w="3119" w:type="dxa"/>
+          </w:tcPr>
+          <w:p>
+            <w:pPr>
+              <w:pStyle w:val="ListParagraph"/>
+              <w:ind w:left="0"/>
+              <w:jc w:val="both"/>
+              <w:rPr>
+                <w:rFonts w:asciiTheme="majorBidi" w:hAnsiTheme="majorBidi" w:cstheme="majorBidi"/>
+                <w:lang w:val="en-US"/>
+              </w:rPr>
+            </w:pPr>
+            <w:r>
+              <w:rPr>
+                <w:rStyle w:val="CodeChar"/>
+              </w:rPr>
+              <w:t>@</w:t>
+            </w:r>
+            <w:r>
+              <w:rPr>
+                <w:rFonts w:asciiTheme="majorBidi" w:hAnsiTheme="majorBidi" w:cstheme="majorBidi"/>
+                <w:lang w:val="en-US"/>
+              </w:rPr>
+              <w:t xml:space="preserve"> </w:t>
+            </w:r>
+          </w:p>
+        </w:tc>
+        <w:tc>
+          <w:tcPr>
+            <w:tcW w:w="3645" w:type="dxa"/>
+          </w:tcPr>
+          <w:p>
+            <w:pPr>
+              <w:pStyle w:val="ListParagraph"/>
+              <w:ind w:left="0"/>
+              <w:jc w:val="both"/>
+              <w:rPr>
+                <w:rFonts w:asciiTheme="majorBidi" w:hAnsiTheme="majorBidi" w:cstheme="majorBidi"/>
+                <w:lang w:val="en-US"/>
+              </w:rPr>
+            </w:pPr>
+            <w:r>
+              <w:rPr>
+                <w:rFonts w:asciiTheme="majorBidi" w:hAnsiTheme="majorBidi" w:cstheme="majorBidi"/>
+                <w:lang w:val="en-US"/>
+              </w:rPr>
               <w:t>Matrix multiplication</w:t>
             </w:r>
           </w:p>
@@ -13917,7 +14319,7 @@
       <w:tr>
         <w:tc>
           <w:tcPr>
-            <w:tcW w:w="3245" w:type="dxa"/>
+            <w:tcW w:w="2126" w:type="dxa"/>
           </w:tcPr>
           <w:p>
             <w:pPr>
@@ -13934,13 +14336,13 @@
                 <w:rFonts w:asciiTheme="majorBidi" w:hAnsiTheme="majorBidi" w:cstheme="majorBidi"/>
                 <w:lang w:val="en-US"/>
               </w:rPr>
-              <w:t>9</w:t>
+              <w:t>10</w:t>
             </w:r>
           </w:p>
         </w:tc>
         <w:tc>
           <w:tcPr>
-            <w:tcW w:w="3245" w:type="dxa"/>
+            <w:tcW w:w="3119" w:type="dxa"/>
           </w:tcPr>
           <w:p>
             <w:pPr>
@@ -13982,7 +14384,7 @@
         </w:tc>
         <w:tc>
           <w:tcPr>
-            <w:tcW w:w="3246" w:type="dxa"/>
+            <w:tcW w:w="3645" w:type="dxa"/>
           </w:tcPr>
           <w:p>
             <w:pPr>
@@ -14007,7 +14409,7 @@
       <w:tr>
         <w:tc>
           <w:tcPr>
-            <w:tcW w:w="3245" w:type="dxa"/>
+            <w:tcW w:w="2126" w:type="dxa"/>
           </w:tcPr>
           <w:p>
             <w:pPr>
@@ -14024,13 +14426,20 @@
                 <w:rFonts w:asciiTheme="majorBidi" w:hAnsiTheme="majorBidi" w:cstheme="majorBidi"/>
                 <w:lang w:val="en-US"/>
               </w:rPr>
-              <w:t>10</w:t>
+              <w:t>1</w:t>
+            </w:r>
+            <w:r>
+              <w:rPr>
+                <w:rFonts w:asciiTheme="majorBidi" w:hAnsiTheme="majorBidi" w:cstheme="majorBidi"/>
+                <w:lang w:val="en-US"/>
+              </w:rPr>
+              <w:t>1</w:t>
             </w:r>
           </w:p>
         </w:tc>
         <w:tc>
           <w:tcPr>
-            <w:tcW w:w="3245" w:type="dxa"/>
+            <w:tcW w:w="3119" w:type="dxa"/>
           </w:tcPr>
           <w:p>
             <w:pPr>
@@ -14059,7 +14468,7 @@
         </w:tc>
         <w:tc>
           <w:tcPr>
-            <w:tcW w:w="3246" w:type="dxa"/>
+            <w:tcW w:w="3645" w:type="dxa"/>
           </w:tcPr>
           <w:p>
             <w:pPr>
@@ -14084,7 +14493,7 @@
       <w:tr>
         <w:tc>
           <w:tcPr>
-            <w:tcW w:w="3245" w:type="dxa"/>
+            <w:tcW w:w="2126" w:type="dxa"/>
           </w:tcPr>
           <w:p>
             <w:pPr>
@@ -14101,7 +14510,14 @@
                 <w:rFonts w:asciiTheme="majorBidi" w:hAnsiTheme="majorBidi" w:cstheme="majorBidi"/>
                 <w:lang w:val="en-US"/>
               </w:rPr>
-              <w:t>11</w:t>
+              <w:t>1</w:t>
+            </w:r>
+            <w:r>
+              <w:rPr>
+                <w:rFonts w:asciiTheme="majorBidi" w:hAnsiTheme="majorBidi" w:cstheme="majorBidi"/>
+                <w:lang w:val="en-US"/>
+              </w:rPr>
+              <w:t>2</w:t>
             </w:r>
             <w:r>
               <w:rPr>
@@ -14114,7 +14530,7 @@
         </w:tc>
         <w:tc>
           <w:tcPr>
-            <w:tcW w:w="3245" w:type="dxa"/>
+            <w:tcW w:w="3119" w:type="dxa"/>
           </w:tcPr>
           <w:p>
             <w:pPr>
@@ -14162,7 +14578,7 @@
         </w:tc>
         <w:tc>
           <w:tcPr>
-            <w:tcW w:w="3246" w:type="dxa"/>
+            <w:tcW w:w="3645" w:type="dxa"/>
           </w:tcPr>
           <w:p>
             <w:pPr>
@@ -14228,25 +14644,3030 @@
     <w:p>
       <w:pPr>
         <w:pStyle w:val="ListParagraph"/>
+        <w:numPr>
+          <w:ilvl w:val="1"/>
+          <w:numId w:val="2"/>
+        </w:numPr>
+        <w:ind w:left="845"/>
+        <w:jc w:val="both"/>
+        <w:outlineLvl w:val="1"/>
+        <w:rPr>
+          <w:rFonts w:asciiTheme="majorBidi" w:hAnsiTheme="majorBidi" w:cstheme="majorBidi"/>
+          <w:lang w:val="en-US"/>
+        </w:rPr>
+      </w:pPr>
+      <w:r>
+        <w:rPr>
+          <w:rFonts w:asciiTheme="majorBidi" w:hAnsiTheme="majorBidi" w:cstheme="majorBidi"/>
+          <w:lang w:val="en-US"/>
+        </w:rPr>
+        <w:t>Overview</w:t>
+      </w:r>
+    </w:p>
+    <w:p>
+      <w:pPr>
+        <w:pStyle w:val="ListParagraph"/>
+        <w:ind w:left="846"/>
+        <w:jc w:val="both"/>
+        <w:rPr>
+          <w:rFonts w:asciiTheme="majorBidi" w:hAnsiTheme="majorBidi" w:cstheme="majorBidi"/>
+          <w:lang w:val="en-US"/>
+        </w:rPr>
+      </w:pPr>
+      <w:r>
+        <w:rPr>
+          <w:rFonts w:asciiTheme="majorBidi" w:hAnsiTheme="majorBidi" w:cstheme="majorBidi"/>
+          <w:lang w:val="en-US"/>
+        </w:rPr>
+        <w:t>An expression is any construct that evaluated to a value at runtime. Pulse supports a rich set of expressions forms including literals, variable references, arithmetic and logical operations, function calls, member access, indexing, list comprehensions, ternary expressions, lambda expressions, and the pipe operator. Every expression produces a value of one of the runtime types defined in Section 3. Expressions can be nested arbitrarily, any expression can appear as a subexpression of another expression, subject to the precedence rules defined in Section 4.</w:t>
+      </w:r>
+    </w:p>
+    <w:p>
+      <w:pPr>
+        <w:pStyle w:val="ListParagraph"/>
+        <w:ind w:left="846"/>
+        <w:jc w:val="both"/>
+        <w:rPr>
+          <w:rFonts w:asciiTheme="majorBidi" w:hAnsiTheme="majorBidi" w:cstheme="majorBidi"/>
+          <w:lang w:val="en-US"/>
+        </w:rPr>
+      </w:pPr>
+    </w:p>
+    <w:p>
+      <w:pPr>
+        <w:pStyle w:val="ListParagraph"/>
+        <w:numPr>
+          <w:ilvl w:val="1"/>
+          <w:numId w:val="2"/>
+        </w:numPr>
+        <w:ind w:left="845"/>
+        <w:jc w:val="both"/>
+        <w:outlineLvl w:val="1"/>
+        <w:rPr>
+          <w:rFonts w:asciiTheme="majorBidi" w:hAnsiTheme="majorBidi" w:cstheme="majorBidi"/>
+          <w:lang w:val="en-US"/>
+        </w:rPr>
+      </w:pPr>
+      <w:r>
+        <w:rPr>
+          <w:rFonts w:asciiTheme="majorBidi" w:hAnsiTheme="majorBidi" w:cstheme="majorBidi"/>
+          <w:lang w:val="en-US"/>
+        </w:rPr>
+        <w:t>Literal Expressions</w:t>
+      </w:r>
+    </w:p>
+    <w:p>
+      <w:pPr>
+        <w:pStyle w:val="ListParagraph"/>
+        <w:ind w:left="846"/>
+        <w:jc w:val="both"/>
+        <w:rPr>
+          <w:rFonts w:asciiTheme="majorBidi" w:hAnsiTheme="majorBidi" w:cstheme="majorBidi"/>
+          <w:lang w:val="en-US"/>
+        </w:rPr>
+      </w:pPr>
+      <w:r>
+        <w:rPr>
+          <w:rFonts w:asciiTheme="majorBidi" w:hAnsiTheme="majorBidi" w:cstheme="majorBidi"/>
+          <w:lang w:val="en-US"/>
+        </w:rPr>
+        <w:t>Literal expressions produce a fixed value directly from source code. The literal forms supported by Pulse are numeric literals, string literals, f-string literals, boolean literals, the null literal, list literals, dict literals, and tensor literals. Each literal form is described in detail in Section 2 and produces a value of its corresponding runtime type.</w:t>
+      </w:r>
+    </w:p>
+    <w:p>
+      <w:pPr>
+        <w:pStyle w:val="Code"/>
+      </w:pPr>
+      <w:r>
+        <w:t>42</w:t>
+      </w:r>
+      <w:r>
+        <w:tab/>
+      </w:r>
+      <w:r>
+        <w:tab/>
+      </w:r>
+      <w:r>
+        <w:tab/>
+        <w:t># Number</w:t>
+      </w:r>
+    </w:p>
+    <w:p>
+      <w:pPr>
+        <w:pStyle w:val="Code"/>
+      </w:pPr>
+      <w:r>
+        <w:t>"hello"</w:t>
+      </w:r>
+      <w:r>
+        <w:tab/>
+      </w:r>
+      <w:r>
+        <w:tab/>
+        <w:t># String</w:t>
+      </w:r>
+    </w:p>
+    <w:p>
+      <w:pPr>
+        <w:pStyle w:val="Code"/>
+      </w:pPr>
+      <w:proofErr w:type="spellStart"/>
+      <w:r>
+        <w:t>f"value</w:t>
+      </w:r>
+      <w:proofErr w:type="spellEnd"/>
+      <w:r>
+        <w:t xml:space="preserve"> if {x}"</w:t>
+      </w:r>
+      <w:r>
+        <w:tab/>
+        <w:t># String (interpolated)</w:t>
+      </w:r>
+    </w:p>
+    <w:p>
+      <w:pPr>
+        <w:pStyle w:val="Code"/>
+      </w:pPr>
+      <w:r>
+        <w:t>True</w:t>
+      </w:r>
+      <w:r>
+        <w:tab/>
+      </w:r>
+      <w:r>
+        <w:tab/>
+      </w:r>
+      <w:r>
+        <w:tab/>
+        <w:t># Boolean</w:t>
+      </w:r>
+    </w:p>
+    <w:p>
+      <w:pPr>
+        <w:pStyle w:val="Code"/>
+      </w:pPr>
+      <w:r>
+        <w:t>null</w:t>
+      </w:r>
+      <w:r>
+        <w:tab/>
+      </w:r>
+      <w:r>
+        <w:tab/>
+      </w:r>
+      <w:r>
+        <w:tab/>
+        <w:t># Null</w:t>
+      </w:r>
+    </w:p>
+    <w:p>
+      <w:pPr>
+        <w:pStyle w:val="Code"/>
+      </w:pPr>
+      <w:r>
+        <w:t>[1, 2, 3]</w:t>
+      </w:r>
+      <w:r>
+        <w:tab/>
+      </w:r>
+      <w:r>
+        <w:tab/>
+        <w:t># List</w:t>
+      </w:r>
+    </w:p>
+    <w:p>
+      <w:pPr>
+        <w:pStyle w:val="Code"/>
+      </w:pPr>
+      <w:r>
+        <w:t>{"key": "value"}</w:t>
+      </w:r>
+      <w:r>
+        <w:tab/>
+        <w:t># Dict</w:t>
+      </w:r>
+    </w:p>
+    <w:p>
+      <w:pPr>
+        <w:pStyle w:val="Code"/>
+      </w:pPr>
+      <w:r>
+        <w:t>@[1.0, 2.0, 3.0]</w:t>
+      </w:r>
+      <w:r>
+        <w:tab/>
+        <w:t># Tensor</w:t>
+      </w:r>
+    </w:p>
+    <w:p>
+      <w:pPr>
+        <w:pStyle w:val="ListParagraph"/>
+        <w:ind w:left="846"/>
+        <w:jc w:val="both"/>
+        <w:rPr>
+          <w:rFonts w:asciiTheme="majorBidi" w:hAnsiTheme="majorBidi" w:cstheme="majorBidi"/>
+          <w:lang w:val="en-US"/>
+        </w:rPr>
+      </w:pPr>
+    </w:p>
+    <w:p>
+      <w:pPr>
+        <w:pStyle w:val="ListParagraph"/>
+        <w:numPr>
+          <w:ilvl w:val="1"/>
+          <w:numId w:val="2"/>
+        </w:numPr>
+        <w:ind w:left="845"/>
+        <w:jc w:val="both"/>
+        <w:outlineLvl w:val="1"/>
+        <w:rPr>
+          <w:rFonts w:asciiTheme="majorBidi" w:hAnsiTheme="majorBidi" w:cstheme="majorBidi"/>
+          <w:lang w:val="en-US"/>
+        </w:rPr>
+      </w:pPr>
+      <w:r>
+        <w:rPr>
+          <w:rFonts w:asciiTheme="majorBidi" w:hAnsiTheme="majorBidi" w:cstheme="majorBidi"/>
+          <w:lang w:val="en-US"/>
+        </w:rPr>
+        <w:t>Variable Expressions</w:t>
+      </w:r>
+    </w:p>
+    <w:p>
+      <w:pPr>
+        <w:pStyle w:val="ListParagraph"/>
+        <w:ind w:left="846"/>
+        <w:jc w:val="both"/>
+        <w:rPr>
+          <w:rFonts w:asciiTheme="majorBidi" w:hAnsiTheme="majorBidi" w:cstheme="majorBidi"/>
+          <w:lang w:val="en-US"/>
+        </w:rPr>
+      </w:pPr>
+      <w:r>
+        <w:rPr>
+          <w:rFonts w:asciiTheme="majorBidi" w:hAnsiTheme="majorBidi" w:cstheme="majorBidi"/>
+          <w:lang w:val="en-US"/>
+        </w:rPr>
+        <w:t>A variable expression is a bare identifier that refers to a variable in the current scope. The resolver performs a static scope analysis pass before interpretation and records the exact lexical depth at which each variable is defined. At runtime the interpreter uses this depth information to look up the variable directly in the correct environment without searching. If a variable is referenced before it is defined the resolver reports a use-before-definition error at compile time rather than at runtime.</w:t>
+      </w:r>
+    </w:p>
+    <w:p>
+      <w:pPr>
+        <w:pStyle w:val="Code"/>
+      </w:pPr>
+      <w:r>
+        <w:t>x = 10</w:t>
+      </w:r>
+    </w:p>
+    <w:p>
+      <w:pPr>
+        <w:pStyle w:val="Code"/>
+      </w:pPr>
+      <w:r>
+        <w:t>print(x)</w:t>
+      </w:r>
+      <w:r>
+        <w:tab/>
+      </w:r>
+      <w:r>
+        <w:tab/>
+      </w:r>
+      <w:r>
+        <w:tab/>
+        <w:t># 10</w:t>
+      </w:r>
+    </w:p>
+    <w:p>
+      <w:pPr>
+        <w:pStyle w:val="Code"/>
+      </w:pPr>
+    </w:p>
+    <w:p>
+      <w:pPr>
+        <w:pStyle w:val="Code"/>
+      </w:pPr>
+      <w:r>
+        <w:t>def make():</w:t>
+      </w:r>
+    </w:p>
+    <w:p>
+      <w:pPr>
+        <w:pStyle w:val="Code"/>
+      </w:pPr>
+      <w:r>
+        <w:t xml:space="preserve">    value = 42</w:t>
+      </w:r>
+    </w:p>
+    <w:p>
+      <w:pPr>
+        <w:pStyle w:val="Code"/>
+      </w:pPr>
+      <w:r>
+        <w:t xml:space="preserve">    return value</w:t>
+      </w:r>
+    </w:p>
+    <w:p>
+      <w:pPr>
+        <w:pStyle w:val="Code"/>
+      </w:pPr>
+    </w:p>
+    <w:p>
+      <w:pPr>
+        <w:pStyle w:val="Code"/>
+      </w:pPr>
+      <w:r>
+        <w:t>result = make()</w:t>
+      </w:r>
+    </w:p>
+    <w:p>
+      <w:pPr>
+        <w:pStyle w:val="Code"/>
+      </w:pPr>
+      <w:r>
+        <w:t>print(result)</w:t>
+      </w:r>
+      <w:r>
+        <w:tab/>
+      </w:r>
+      <w:r>
+        <w:tab/>
+        <w:t># 42</w:t>
+      </w:r>
+    </w:p>
+    <w:p>
+      <w:pPr>
+        <w:pStyle w:val="ListParagraph"/>
+        <w:ind w:left="846"/>
+        <w:jc w:val="both"/>
+        <w:rPr>
+          <w:rFonts w:asciiTheme="majorBidi" w:hAnsiTheme="majorBidi" w:cstheme="majorBidi"/>
+          <w:lang w:val="en-US"/>
+        </w:rPr>
+      </w:pPr>
+    </w:p>
+    <w:p>
+      <w:pPr>
+        <w:pStyle w:val="ListParagraph"/>
+        <w:numPr>
+          <w:ilvl w:val="1"/>
+          <w:numId w:val="2"/>
+        </w:numPr>
+        <w:ind w:left="845"/>
+        <w:jc w:val="both"/>
+        <w:outlineLvl w:val="1"/>
+        <w:rPr>
+          <w:rFonts w:asciiTheme="majorBidi" w:hAnsiTheme="majorBidi" w:cstheme="majorBidi"/>
+          <w:lang w:val="en-US"/>
+        </w:rPr>
+      </w:pPr>
+      <w:r>
+        <w:rPr>
+          <w:rFonts w:asciiTheme="majorBidi" w:hAnsiTheme="majorBidi" w:cstheme="majorBidi"/>
+          <w:lang w:val="en-US"/>
+        </w:rPr>
+        <w:t>Assignment Expressions</w:t>
+      </w:r>
+    </w:p>
+    <w:p>
+      <w:pPr>
+        <w:pStyle w:val="ListParagraph"/>
+        <w:ind w:left="846"/>
+        <w:jc w:val="both"/>
+        <w:rPr>
+          <w:rFonts w:asciiTheme="majorBidi" w:hAnsiTheme="majorBidi" w:cstheme="majorBidi"/>
+          <w:lang w:val="en-US"/>
+        </w:rPr>
+      </w:pPr>
+      <w:r>
+        <w:rPr>
+          <w:rFonts w:asciiTheme="majorBidi" w:hAnsiTheme="majorBidi" w:cstheme="majorBidi"/>
+          <w:lang w:val="en-US"/>
+        </w:rPr>
+        <w:t>An assignment expression binds a value to a name in the current scope. If the name already exists in the current scope or any enclosing scope, the existing binding is updated. If the name does not exist anywhere in the scope chain, a new binding is created in the current scope.</w:t>
+      </w:r>
+      <w:r>
+        <w:rPr>
+          <w:rFonts w:asciiTheme="majorBidi" w:hAnsiTheme="majorBidi" w:cstheme="majorBidi"/>
+          <w:lang w:val="en-US"/>
+        </w:rPr>
+        <w:t xml:space="preserve"> Augmented assignments such as </w:t>
+      </w:r>
+      <w:r>
+        <w:rPr>
+          <w:rStyle w:val="CodeChar"/>
+        </w:rPr>
+        <w:t>+=</w:t>
+      </w:r>
+      <w:r>
+        <w:rPr>
+          <w:rFonts w:asciiTheme="majorBidi" w:hAnsiTheme="majorBidi" w:cstheme="majorBidi"/>
+          <w:lang w:val="en-US"/>
+        </w:rPr>
+        <w:t xml:space="preserve"> and </w:t>
+      </w:r>
+      <w:r>
+        <w:rPr>
+          <w:rStyle w:val="CodeChar"/>
+        </w:rPr>
+        <w:t>–=</w:t>
+      </w:r>
+      <w:r>
+        <w:rPr>
+          <w:rFonts w:asciiTheme="majorBidi" w:hAnsiTheme="majorBidi" w:cstheme="majorBidi"/>
+          <w:lang w:val="en-US"/>
+        </w:rPr>
+        <w:t xml:space="preserve"> are </w:t>
+      </w:r>
+      <w:r>
+        <w:rPr>
+          <w:rFonts w:asciiTheme="majorBidi" w:hAnsiTheme="majorBidi" w:cstheme="majorBidi"/>
+          <w:lang w:val="en-US"/>
+        </w:rPr>
+        <w:t>desugared into a binary expression followed by an assignment during parsing and are not a separate expression form at the interpreter level.</w:t>
+      </w:r>
+    </w:p>
+    <w:p>
+      <w:pPr>
+        <w:pStyle w:val="Code"/>
+      </w:pPr>
+      <w:r>
+        <w:t>x = 10</w:t>
+      </w:r>
+      <w:r>
+        <w:tab/>
+        <w:t># new binding</w:t>
+      </w:r>
+    </w:p>
+    <w:p>
+      <w:pPr>
+        <w:pStyle w:val="Code"/>
+      </w:pPr>
+      <w:r>
+        <w:t>x = x + 1</w:t>
+      </w:r>
+      <w:r>
+        <w:tab/>
+        <w:t># update existing binding</w:t>
+      </w:r>
+    </w:p>
+    <w:p>
+      <w:pPr>
+        <w:pStyle w:val="Code"/>
+      </w:pPr>
+      <w:r>
+        <w:t>x += 5</w:t>
+      </w:r>
+      <w:r>
+        <w:tab/>
+        <w:t># desugared to x = x + 5</w:t>
+      </w:r>
+    </w:p>
+    <w:p>
+      <w:pPr>
+        <w:pStyle w:val="ListParagraph"/>
+        <w:ind w:left="846"/>
+        <w:jc w:val="both"/>
+        <w:rPr>
+          <w:rFonts w:asciiTheme="majorBidi" w:hAnsiTheme="majorBidi" w:cstheme="majorBidi"/>
+          <w:lang w:val="en-US"/>
+        </w:rPr>
+      </w:pPr>
+    </w:p>
+    <w:p>
+      <w:pPr>
+        <w:pStyle w:val="ListParagraph"/>
+        <w:numPr>
+          <w:ilvl w:val="1"/>
+          <w:numId w:val="2"/>
+        </w:numPr>
+        <w:ind w:left="845"/>
+        <w:jc w:val="both"/>
+        <w:outlineLvl w:val="1"/>
+        <w:rPr>
+          <w:rFonts w:asciiTheme="majorBidi" w:hAnsiTheme="majorBidi" w:cstheme="majorBidi"/>
+          <w:lang w:val="en-US"/>
+        </w:rPr>
+      </w:pPr>
+      <w:r>
+        <w:rPr>
+          <w:rFonts w:asciiTheme="majorBidi" w:hAnsiTheme="majorBidi" w:cstheme="majorBidi"/>
+          <w:lang w:val="en-US"/>
+        </w:rPr>
+        <w:lastRenderedPageBreak/>
+        <w:t>Unary Expressions</w:t>
+      </w:r>
+    </w:p>
+    <w:p>
+      <w:pPr>
+        <w:pStyle w:val="ListParagraph"/>
+        <w:ind w:left="846"/>
+        <w:jc w:val="both"/>
+        <w:rPr>
+          <w:rFonts w:asciiTheme="majorBidi" w:hAnsiTheme="majorBidi" w:cstheme="majorBidi"/>
+          <w:lang w:val="en-US"/>
+        </w:rPr>
+      </w:pPr>
+      <w:r>
+        <w:rPr>
+          <w:rFonts w:asciiTheme="majorBidi" w:hAnsiTheme="majorBidi" w:cstheme="majorBidi"/>
+          <w:lang w:val="en-US"/>
+        </w:rPr>
+        <w:t xml:space="preserve">A unary expression applies an operator to a single operand. Pulse supports two unary operators. The unary minus operator </w:t>
+      </w:r>
+      <w:r>
+        <w:rPr>
+          <w:rStyle w:val="CodeChar"/>
+        </w:rPr>
+        <w:t>–</w:t>
+      </w:r>
+      <w:r>
+        <w:rPr>
+          <w:rFonts w:asciiTheme="majorBidi" w:hAnsiTheme="majorBidi" w:cstheme="majorBidi"/>
+          <w:lang w:val="en-US"/>
+        </w:rPr>
+        <w:t xml:space="preserve"> negates a numeric value and raises a </w:t>
+      </w:r>
+      <w:proofErr w:type="spellStart"/>
+      <w:r>
+        <w:rPr>
+          <w:rStyle w:val="CodeChar"/>
+        </w:rPr>
+        <w:t>TypeError</w:t>
+      </w:r>
+      <w:proofErr w:type="spellEnd"/>
+      <w:r>
+        <w:rPr>
+          <w:rFonts w:asciiTheme="majorBidi" w:hAnsiTheme="majorBidi" w:cstheme="majorBidi"/>
+          <w:lang w:val="en-US"/>
+        </w:rPr>
+        <w:t xml:space="preserve"> if the operand is not a Number. </w:t>
+      </w:r>
+      <w:r>
+        <w:rPr>
+          <w:rFonts w:asciiTheme="majorBidi" w:hAnsiTheme="majorBidi" w:cstheme="majorBidi"/>
+          <w:lang w:val="en-US"/>
+        </w:rPr>
+        <w:t xml:space="preserve">The unary </w:t>
+      </w:r>
+      <w:r>
+        <w:rPr>
+          <w:rStyle w:val="CodeChar"/>
+        </w:rPr>
+        <w:t>not</w:t>
+      </w:r>
+      <w:r>
+        <w:rPr>
+          <w:rFonts w:asciiTheme="majorBidi" w:hAnsiTheme="majorBidi" w:cstheme="majorBidi"/>
+          <w:lang w:val="en-US"/>
+        </w:rPr>
+        <w:t xml:space="preserve"> operator inverts the truthiness of any value and always returns a Boolean, applying the truthiness rules defined in Section 3.4.</w:t>
+      </w:r>
+    </w:p>
+    <w:p>
+      <w:pPr>
+        <w:pStyle w:val="Code"/>
+      </w:pPr>
+      <w:r>
+        <w:t>x = –5</w:t>
+      </w:r>
+      <w:r>
+        <w:tab/>
+      </w:r>
+      <w:r>
+        <w:tab/>
+      </w:r>
+      <w:r>
+        <w:t># unary minus</w:t>
+      </w:r>
+    </w:p>
+    <w:p>
+      <w:pPr>
+        <w:pStyle w:val="Code"/>
+      </w:pPr>
+      <w:r>
+        <w:t>y = not True</w:t>
+      </w:r>
+      <w:r>
+        <w:tab/>
+        <w:t># False</w:t>
+      </w:r>
+    </w:p>
+    <w:p>
+      <w:pPr>
+        <w:pStyle w:val="Code"/>
+      </w:pPr>
+      <w:r>
+        <w:t>z = not null</w:t>
+      </w:r>
+      <w:r>
+        <w:tab/>
+        <w:t># True (null is falsy)</w:t>
+      </w:r>
+    </w:p>
+    <w:p>
+      <w:pPr>
+        <w:pStyle w:val="Code"/>
+      </w:pPr>
+      <w:r>
+        <w:t>w = not 0</w:t>
+      </w:r>
+      <w:r>
+        <w:tab/>
+      </w:r>
+      <w:r>
+        <w:tab/>
+      </w:r>
+      <w:r>
+        <w:t># True (0 is falsy)</w:t>
+      </w:r>
+    </w:p>
+    <w:p>
+      <w:pPr>
+        <w:pStyle w:val="ListParagraph"/>
+        <w:ind w:left="846"/>
+        <w:jc w:val="both"/>
+        <w:rPr>
+          <w:rFonts w:asciiTheme="majorBidi" w:hAnsiTheme="majorBidi" w:cstheme="majorBidi"/>
+          <w:lang w:val="en-US"/>
+        </w:rPr>
+      </w:pPr>
+    </w:p>
+    <w:p>
+      <w:pPr>
+        <w:pStyle w:val="ListParagraph"/>
+        <w:numPr>
+          <w:ilvl w:val="1"/>
+          <w:numId w:val="2"/>
+        </w:numPr>
+        <w:ind w:left="845"/>
+        <w:jc w:val="both"/>
+        <w:outlineLvl w:val="1"/>
+        <w:rPr>
+          <w:rFonts w:asciiTheme="majorBidi" w:hAnsiTheme="majorBidi" w:cstheme="majorBidi"/>
+          <w:lang w:val="en-US"/>
+        </w:rPr>
+      </w:pPr>
+      <w:r>
+        <w:rPr>
+          <w:rFonts w:asciiTheme="majorBidi" w:hAnsiTheme="majorBidi" w:cstheme="majorBidi"/>
+          <w:lang w:val="en-US"/>
+        </w:rPr>
+        <w:t>Binary Expressions</w:t>
+      </w:r>
+    </w:p>
+    <w:p>
+      <w:pPr>
+        <w:pStyle w:val="ListParagraph"/>
+        <w:ind w:left="846"/>
+        <w:jc w:val="both"/>
+        <w:rPr>
+          <w:rFonts w:asciiTheme="majorBidi" w:hAnsiTheme="majorBidi" w:cstheme="majorBidi"/>
+          <w:lang w:val="en-US"/>
+        </w:rPr>
+      </w:pPr>
+      <w:r>
+        <w:rPr>
+          <w:rFonts w:asciiTheme="majorBidi" w:hAnsiTheme="majorBidi" w:cstheme="majorBidi"/>
+          <w:lang w:val="en-US"/>
+        </w:rPr>
+        <w:t>A binary expression applies an operator to two operands. The full set of binary operators and their semantics are defined in Section 4. At the expression level, binary expressions are left-associative and evaluated in precedence order. The operands of a binary expression are fully evaluated before the operator is applied</w:t>
+      </w:r>
+      <w:r>
+        <w:rPr>
+          <w:rFonts w:asciiTheme="majorBidi" w:hAnsiTheme="majorBidi" w:cstheme="majorBidi"/>
+          <w:lang w:val="en-US"/>
+        </w:rPr>
+        <w:t>,</w:t>
+      </w:r>
+      <w:r>
+        <w:rPr>
+          <w:rFonts w:asciiTheme="majorBidi" w:hAnsiTheme="majorBidi" w:cstheme="majorBidi"/>
+          <w:lang w:val="en-US"/>
+        </w:rPr>
+        <w:t xml:space="preserve"> there is no lazy evaluation for arithmetic or comparison operators, only for </w:t>
+      </w:r>
+      <w:r>
+        <w:rPr>
+          <w:rStyle w:val="CodeChar"/>
+        </w:rPr>
+        <w:t>and</w:t>
+      </w:r>
+      <w:r>
+        <w:rPr>
+          <w:rFonts w:asciiTheme="majorBidi" w:hAnsiTheme="majorBidi" w:cstheme="majorBidi"/>
+          <w:lang w:val="en-US"/>
+        </w:rPr>
+        <w:t xml:space="preserve"> </w:t>
+      </w:r>
+      <w:proofErr w:type="spellStart"/>
+      <w:r>
+        <w:rPr>
+          <w:rFonts w:asciiTheme="majorBidi" w:hAnsiTheme="majorBidi" w:cstheme="majorBidi"/>
+          <w:lang w:val="en-US"/>
+        </w:rPr>
+        <w:t>and</w:t>
+      </w:r>
+      <w:proofErr w:type="spellEnd"/>
+      <w:r>
+        <w:rPr>
+          <w:rFonts w:asciiTheme="majorBidi" w:hAnsiTheme="majorBidi" w:cstheme="majorBidi"/>
+          <w:lang w:val="en-US"/>
+        </w:rPr>
+        <w:t xml:space="preserve"> </w:t>
+      </w:r>
+      <w:r>
+        <w:rPr>
+          <w:rStyle w:val="CodeChar"/>
+        </w:rPr>
+        <w:t>or</w:t>
+      </w:r>
+      <w:r>
+        <w:rPr>
+          <w:rFonts w:asciiTheme="majorBidi" w:hAnsiTheme="majorBidi" w:cstheme="majorBidi"/>
+          <w:lang w:val="en-US"/>
+        </w:rPr>
+        <w:t xml:space="preserve"> which short-circuit as described in Section 4.4.</w:t>
+      </w:r>
+    </w:p>
+    <w:p>
+      <w:pPr>
+        <w:pStyle w:val="Code"/>
+      </w:pPr>
+      <w:r>
+        <w:t>result = 2 + 3 * 4</w:t>
+      </w:r>
+      <w:r>
+        <w:tab/>
+      </w:r>
+      <w:r>
+        <w:tab/>
+        <w:t># 14 (precedence: * before +)</w:t>
+      </w:r>
+    </w:p>
+    <w:p>
+      <w:pPr>
+        <w:pStyle w:val="Code"/>
+      </w:pPr>
+      <w:r>
+        <w:t>flag = x &gt; 0 and x &lt; 10</w:t>
+      </w:r>
+    </w:p>
+    <w:p>
+      <w:pPr>
+        <w:pStyle w:val="Code"/>
+      </w:pPr>
+      <w:r>
+        <w:t>text = "hello" + " " + "world"</w:t>
+      </w:r>
+    </w:p>
+    <w:p>
+      <w:pPr>
+        <w:pStyle w:val="ListParagraph"/>
+        <w:ind w:left="846"/>
+        <w:jc w:val="both"/>
+        <w:rPr>
+          <w:rFonts w:asciiTheme="majorBidi" w:hAnsiTheme="majorBidi" w:cstheme="majorBidi"/>
+          <w:lang w:val="en-US"/>
+        </w:rPr>
+      </w:pPr>
+    </w:p>
+    <w:p>
+      <w:pPr>
+        <w:pStyle w:val="ListParagraph"/>
+        <w:numPr>
+          <w:ilvl w:val="1"/>
+          <w:numId w:val="2"/>
+        </w:numPr>
+        <w:ind w:left="845"/>
+        <w:jc w:val="both"/>
+        <w:outlineLvl w:val="1"/>
+        <w:rPr>
+          <w:rFonts w:asciiTheme="majorBidi" w:hAnsiTheme="majorBidi" w:cstheme="majorBidi"/>
+          <w:lang w:val="en-US"/>
+        </w:rPr>
+      </w:pPr>
+      <w:r>
+        <w:rPr>
+          <w:rFonts w:asciiTheme="majorBidi" w:hAnsiTheme="majorBidi" w:cstheme="majorBidi"/>
+          <w:lang w:val="en-US"/>
+        </w:rPr>
+        <w:t>Logical Expressions</w:t>
+      </w:r>
+    </w:p>
+    <w:p>
+      <w:pPr>
+        <w:pStyle w:val="ListParagraph"/>
+        <w:ind w:left="846"/>
+        <w:jc w:val="both"/>
+        <w:rPr>
+          <w:rFonts w:asciiTheme="majorBidi" w:hAnsiTheme="majorBidi" w:cstheme="majorBidi"/>
+          <w:lang w:val="en-US"/>
+        </w:rPr>
+      </w:pPr>
+      <w:r>
+        <w:rPr>
+          <w:rFonts w:asciiTheme="majorBidi" w:hAnsiTheme="majorBidi" w:cstheme="majorBidi"/>
+          <w:lang w:val="en-US"/>
+        </w:rPr>
+        <w:t xml:space="preserve">Logical expressions using </w:t>
+      </w:r>
+      <w:r>
+        <w:rPr>
+          <w:rStyle w:val="CodeChar"/>
+        </w:rPr>
+        <w:t>and</w:t>
+      </w:r>
+      <w:r>
+        <w:rPr>
+          <w:rFonts w:asciiTheme="majorBidi" w:hAnsiTheme="majorBidi" w:cstheme="majorBidi"/>
+          <w:lang w:val="en-US"/>
+        </w:rPr>
+        <w:t xml:space="preserve"> </w:t>
+      </w:r>
+      <w:proofErr w:type="spellStart"/>
+      <w:r>
+        <w:rPr>
+          <w:rFonts w:asciiTheme="majorBidi" w:hAnsiTheme="majorBidi" w:cstheme="majorBidi"/>
+          <w:lang w:val="en-US"/>
+        </w:rPr>
+        <w:t>and</w:t>
+      </w:r>
+      <w:proofErr w:type="spellEnd"/>
+      <w:r>
+        <w:rPr>
+          <w:rFonts w:asciiTheme="majorBidi" w:hAnsiTheme="majorBidi" w:cstheme="majorBidi"/>
+          <w:lang w:val="en-US"/>
+        </w:rPr>
+        <w:t xml:space="preserve"> </w:t>
+      </w:r>
+      <w:r>
+        <w:rPr>
+          <w:rStyle w:val="CodeChar"/>
+        </w:rPr>
+        <w:t>or</w:t>
+      </w:r>
+      <w:r>
+        <w:rPr>
+          <w:rFonts w:asciiTheme="majorBidi" w:hAnsiTheme="majorBidi" w:cstheme="majorBidi"/>
+          <w:lang w:val="en-US"/>
+        </w:rPr>
+        <w:t xml:space="preserve"> are short-circuit evaluated. For </w:t>
+      </w:r>
+      <w:r>
+        <w:rPr>
+          <w:rStyle w:val="CodeChar"/>
+        </w:rPr>
+        <w:t>and</w:t>
+      </w:r>
+      <w:r>
+        <w:rPr>
+          <w:rFonts w:asciiTheme="majorBidi" w:hAnsiTheme="majorBidi" w:cstheme="majorBidi"/>
+          <w:lang w:val="en-US"/>
+        </w:rPr>
+        <w:t xml:space="preserve">, if the left operand is falsy, the right operand is never evaluated and the left operand's value is returned. For </w:t>
+      </w:r>
+      <w:r>
+        <w:rPr>
+          <w:rStyle w:val="CodeChar"/>
+        </w:rPr>
+        <w:t>or</w:t>
+      </w:r>
+      <w:r>
+        <w:rPr>
+          <w:rFonts w:asciiTheme="majorBidi" w:hAnsiTheme="majorBidi" w:cstheme="majorBidi"/>
+          <w:lang w:val="en-US"/>
+        </w:rPr>
+        <w:t xml:space="preserve">, if the left operand is truthy, the right operand is never evaluated and the left operand's value is returned. This means that </w:t>
+      </w:r>
+      <w:r>
+        <w:rPr>
+          <w:rStyle w:val="CodeChar"/>
+        </w:rPr>
+        <w:t>and</w:t>
+      </w:r>
+      <w:r>
+        <w:rPr>
+          <w:rFonts w:asciiTheme="majorBidi" w:hAnsiTheme="majorBidi" w:cstheme="majorBidi"/>
+          <w:lang w:val="en-US"/>
+        </w:rPr>
+        <w:t xml:space="preserve"> </w:t>
+      </w:r>
+      <w:proofErr w:type="spellStart"/>
+      <w:r>
+        <w:rPr>
+          <w:rFonts w:asciiTheme="majorBidi" w:hAnsiTheme="majorBidi" w:cstheme="majorBidi"/>
+          <w:lang w:val="en-US"/>
+        </w:rPr>
+        <w:t>and</w:t>
+      </w:r>
+      <w:proofErr w:type="spellEnd"/>
+      <w:r>
+        <w:rPr>
+          <w:rFonts w:asciiTheme="majorBidi" w:hAnsiTheme="majorBidi" w:cstheme="majorBidi"/>
+          <w:lang w:val="en-US"/>
+        </w:rPr>
+        <w:t xml:space="preserve"> </w:t>
+      </w:r>
+      <w:r>
+        <w:rPr>
+          <w:rStyle w:val="CodeChar"/>
+        </w:rPr>
+        <w:t>or</w:t>
+      </w:r>
+      <w:r>
+        <w:rPr>
+          <w:rFonts w:asciiTheme="majorBidi" w:hAnsiTheme="majorBidi" w:cstheme="majorBidi"/>
+          <w:lang w:val="en-US"/>
+        </w:rPr>
+        <w:t xml:space="preserve"> do not necessarily return a Boolean</w:t>
+      </w:r>
+      <w:r>
+        <w:rPr>
+          <w:rFonts w:asciiTheme="majorBidi" w:hAnsiTheme="majorBidi" w:cstheme="majorBidi"/>
+          <w:lang w:val="en-US"/>
+        </w:rPr>
+        <w:t>,</w:t>
+      </w:r>
+      <w:r>
+        <w:rPr>
+          <w:rFonts w:asciiTheme="majorBidi" w:hAnsiTheme="majorBidi" w:cstheme="majorBidi"/>
+          <w:lang w:val="en-US"/>
+        </w:rPr>
+        <w:t xml:space="preserve"> they return the value that determined the result.</w:t>
+      </w:r>
+    </w:p>
+    <w:p>
+      <w:pPr>
+        <w:pStyle w:val="Code"/>
+      </w:pPr>
+      <w:r>
+        <w:t>x = null or "default"</w:t>
+      </w:r>
+      <w:r>
+        <w:tab/>
+      </w:r>
+      <w:r>
+        <w:tab/>
+        <w:t># "default"</w:t>
+      </w:r>
+    </w:p>
+    <w:p>
+      <w:pPr>
+        <w:pStyle w:val="Code"/>
+      </w:pPr>
+      <w:r>
+        <w:t>y = "found" and "also"</w:t>
+      </w:r>
+      <w:r>
+        <w:tab/>
+      </w:r>
+      <w:r>
+        <w:tab/>
+      </w:r>
+      <w:r>
+        <w:t># "also"</w:t>
+      </w:r>
+    </w:p>
+    <w:p>
+      <w:pPr>
+        <w:pStyle w:val="Code"/>
+      </w:pPr>
+      <w:r>
+        <w:t>z = null and error()</w:t>
+      </w:r>
+      <w:r>
+        <w:tab/>
+      </w:r>
+      <w:r>
+        <w:tab/>
+        <w:t># null (error() never called)</w:t>
+      </w:r>
+    </w:p>
+    <w:p>
+      <w:pPr>
+        <w:pStyle w:val="ListParagraph"/>
+        <w:ind w:left="846"/>
+        <w:jc w:val="both"/>
+        <w:rPr>
+          <w:rFonts w:asciiTheme="majorBidi" w:hAnsiTheme="majorBidi" w:cstheme="majorBidi"/>
+          <w:lang w:val="en-US"/>
+        </w:rPr>
+      </w:pPr>
+    </w:p>
+    <w:p>
+      <w:pPr>
+        <w:pStyle w:val="ListParagraph"/>
+        <w:numPr>
+          <w:ilvl w:val="1"/>
+          <w:numId w:val="2"/>
+        </w:numPr>
+        <w:ind w:left="845"/>
+        <w:jc w:val="both"/>
+        <w:outlineLvl w:val="1"/>
+        <w:rPr>
+          <w:rFonts w:asciiTheme="majorBidi" w:hAnsiTheme="majorBidi" w:cstheme="majorBidi"/>
+          <w:lang w:val="en-US"/>
+        </w:rPr>
+      </w:pPr>
+      <w:r>
+        <w:rPr>
+          <w:rFonts w:asciiTheme="majorBidi" w:hAnsiTheme="majorBidi" w:cstheme="majorBidi"/>
+          <w:lang w:val="en-US"/>
+        </w:rPr>
+        <w:t>Comparison Expressions</w:t>
+      </w:r>
+    </w:p>
+    <w:p>
+      <w:pPr>
+        <w:pStyle w:val="ListParagraph"/>
+        <w:ind w:left="846"/>
+        <w:jc w:val="both"/>
+        <w:rPr>
+          <w:rFonts w:asciiTheme="majorBidi" w:hAnsiTheme="majorBidi" w:cstheme="majorBidi"/>
+          <w:lang w:val="en-US"/>
+        </w:rPr>
+      </w:pPr>
+      <w:r>
+        <w:rPr>
+          <w:rFonts w:asciiTheme="majorBidi" w:hAnsiTheme="majorBidi" w:cstheme="majorBidi"/>
+          <w:lang w:val="en-US"/>
+        </w:rPr>
+        <w:t xml:space="preserve">Comparison expressions compare two values and return a Boolean. Pulse supports chained comparisons where multiple comparison operators appear in sequence. A chained comparison </w:t>
+      </w:r>
+      <w:r>
+        <w:rPr>
+          <w:rStyle w:val="CodeChar"/>
+        </w:rPr>
+        <w:t>a &lt; b &lt; c</w:t>
+      </w:r>
+      <w:r>
+        <w:rPr>
+          <w:rFonts w:asciiTheme="majorBidi" w:hAnsiTheme="majorBidi" w:cstheme="majorBidi"/>
+          <w:lang w:val="en-US"/>
+        </w:rPr>
+        <w:t xml:space="preserve"> is evaluated as </w:t>
+      </w:r>
+      <w:r>
+        <w:rPr>
+          <w:rStyle w:val="CodeChar"/>
+        </w:rPr>
+        <w:t>a &lt; b and b &lt; c</w:t>
+      </w:r>
+      <w:r>
+        <w:rPr>
+          <w:rFonts w:asciiTheme="majorBidi" w:hAnsiTheme="majorBidi" w:cstheme="majorBidi"/>
+          <w:lang w:val="en-US"/>
+        </w:rPr>
+        <w:t xml:space="preserve"> with </w:t>
+      </w:r>
+      <w:r>
+        <w:rPr>
+          <w:rStyle w:val="CodeChar"/>
+        </w:rPr>
+        <w:t>b</w:t>
+      </w:r>
+      <w:r>
+        <w:rPr>
+          <w:rFonts w:asciiTheme="majorBidi" w:hAnsiTheme="majorBidi" w:cstheme="majorBidi"/>
+          <w:lang w:val="en-US"/>
+        </w:rPr>
+        <w:t xml:space="preserve"> evaluated only once. Chaining can involve any mix of comparison operators.</w:t>
+      </w:r>
+    </w:p>
+    <w:p>
+      <w:pPr>
+        <w:pStyle w:val="Code"/>
+      </w:pPr>
+      <w:r>
+        <w:t>x = 5</w:t>
+      </w:r>
+    </w:p>
+    <w:p>
+      <w:pPr>
+        <w:pStyle w:val="Code"/>
+      </w:pPr>
+      <w:r>
+        <w:t>print(0 &lt; x &lt; 10)</w:t>
+      </w:r>
+      <w:r>
+        <w:tab/>
+        <w:t># True</w:t>
+      </w:r>
+    </w:p>
+    <w:p>
+      <w:pPr>
+        <w:pStyle w:val="Code"/>
+      </w:pPr>
+      <w:r>
+        <w:t>print(1 &lt;= x &lt;= 5)</w:t>
+      </w:r>
+      <w:r>
+        <w:tab/>
+        <w:t># True</w:t>
+      </w:r>
+    </w:p>
+    <w:p>
+      <w:pPr>
+        <w:pStyle w:val="Code"/>
+      </w:pPr>
+      <w:r>
+        <w:t>print(x == 5 != 6)</w:t>
+      </w:r>
+      <w:r>
+        <w:tab/>
+        <w:t># True</w:t>
+      </w:r>
+    </w:p>
+    <w:p>
+      <w:pPr>
+        <w:pStyle w:val="ListParagraph"/>
+        <w:ind w:left="846"/>
+        <w:jc w:val="both"/>
+        <w:rPr>
+          <w:rFonts w:asciiTheme="majorBidi" w:hAnsiTheme="majorBidi" w:cstheme="majorBidi"/>
+          <w:lang w:val="en-US"/>
+        </w:rPr>
+      </w:pPr>
+    </w:p>
+    <w:p>
+      <w:pPr>
+        <w:pStyle w:val="ListParagraph"/>
+        <w:numPr>
+          <w:ilvl w:val="1"/>
+          <w:numId w:val="2"/>
+        </w:numPr>
+        <w:ind w:left="845"/>
+        <w:jc w:val="both"/>
+        <w:outlineLvl w:val="1"/>
+        <w:rPr>
+          <w:rFonts w:asciiTheme="majorBidi" w:hAnsiTheme="majorBidi" w:cstheme="majorBidi"/>
+          <w:lang w:val="en-US"/>
+        </w:rPr>
+      </w:pPr>
+      <w:r>
+        <w:rPr>
+          <w:rFonts w:asciiTheme="majorBidi" w:hAnsiTheme="majorBidi" w:cstheme="majorBidi"/>
+          <w:lang w:val="en-US"/>
+        </w:rPr>
+        <w:lastRenderedPageBreak/>
+        <w:t>Call Expressions</w:t>
+      </w:r>
+    </w:p>
+    <w:p>
+      <w:pPr>
+        <w:pStyle w:val="ListParagraph"/>
+        <w:ind w:left="846"/>
+        <w:jc w:val="both"/>
+        <w:rPr>
+          <w:rFonts w:asciiTheme="majorBidi" w:hAnsiTheme="majorBidi" w:cstheme="majorBidi"/>
+          <w:lang w:val="en-US"/>
+        </w:rPr>
+      </w:pPr>
+      <w:r>
+        <w:rPr>
+          <w:rFonts w:asciiTheme="majorBidi" w:hAnsiTheme="majorBidi" w:cstheme="majorBidi"/>
+          <w:lang w:val="en-US"/>
+        </w:rPr>
+        <w:t>A call expression invokes a callable value</w:t>
+      </w:r>
+      <w:r>
+        <w:rPr>
+          <w:rFonts w:asciiTheme="majorBidi" w:hAnsiTheme="majorBidi" w:cstheme="majorBidi"/>
+          <w:lang w:val="en-US"/>
+        </w:rPr>
+        <w:t>;</w:t>
+      </w:r>
+      <w:r>
+        <w:rPr>
+          <w:rFonts w:asciiTheme="majorBidi" w:hAnsiTheme="majorBidi" w:cstheme="majorBidi"/>
+          <w:lang w:val="en-US"/>
+        </w:rPr>
+        <w:t xml:space="preserve"> a function, lambda, native function, or class</w:t>
+      </w:r>
+      <w:r>
+        <w:rPr>
+          <w:rFonts w:asciiTheme="majorBidi" w:hAnsiTheme="majorBidi" w:cstheme="majorBidi"/>
+          <w:lang w:val="en-US"/>
+        </w:rPr>
+        <w:t>,</w:t>
+      </w:r>
+      <w:r>
+        <w:rPr>
+          <w:rFonts w:asciiTheme="majorBidi" w:hAnsiTheme="majorBidi" w:cstheme="majorBidi"/>
+          <w:lang w:val="en-US"/>
+        </w:rPr>
+        <w:t xml:space="preserve"> with a list of arguments. Arguments are evaluated left to right before the call is made. Pulse supports both positional arguments and keyword arguments. Keyword arguments are passed by name and can appear in any order after positional arguments. Calling a non-callable value raises a </w:t>
+      </w:r>
+      <w:proofErr w:type="spellStart"/>
+      <w:r>
+        <w:rPr>
+          <w:rStyle w:val="CodeChar"/>
+        </w:rPr>
+        <w:t>TypeError</w:t>
+      </w:r>
+      <w:proofErr w:type="spellEnd"/>
+      <w:r>
+        <w:rPr>
+          <w:rFonts w:asciiTheme="majorBidi" w:hAnsiTheme="majorBidi" w:cstheme="majorBidi"/>
+          <w:lang w:val="en-US"/>
+        </w:rPr>
+        <w:t xml:space="preserve">. Exceeding the maximum recursion depth of 1000 raises a </w:t>
+      </w:r>
+      <w:proofErr w:type="spellStart"/>
+      <w:r>
+        <w:rPr>
+          <w:rStyle w:val="CodeChar"/>
+        </w:rPr>
+        <w:t>RuntimeError</w:t>
+      </w:r>
+      <w:proofErr w:type="spellEnd"/>
+      <w:r>
+        <w:rPr>
+          <w:rFonts w:asciiTheme="majorBidi" w:hAnsiTheme="majorBidi" w:cstheme="majorBidi"/>
+          <w:lang w:val="en-US"/>
+        </w:rPr>
+        <w:t>.</w:t>
+      </w:r>
+    </w:p>
+    <w:p>
+      <w:pPr>
+        <w:pStyle w:val="Code"/>
+      </w:pPr>
+      <w:r>
+        <w:t>print("hello</w:t>
+      </w:r>
+      <w:r>
+        <w:t>"</w:t>
+      </w:r>
+      <w:r>
+        <w:t>)</w:t>
+      </w:r>
+      <w:r>
+        <w:tab/>
+      </w:r>
+      <w:r>
+        <w:tab/>
+      </w:r>
+      <w:r>
+        <w:tab/>
+      </w:r>
+      <w:r>
+        <w:tab/>
+      </w:r>
+      <w:r>
+        <w:t># positional</w:t>
+      </w:r>
+    </w:p>
+    <w:p>
+      <w:pPr>
+        <w:pStyle w:val="Code"/>
+      </w:pPr>
+      <w:r>
+        <w:t>print(</w:t>
+      </w:r>
+      <w:r>
+        <w:t>"</w:t>
+      </w:r>
+      <w:r>
+        <w:t>a</w:t>
+      </w:r>
+      <w:r>
+        <w:t>"</w:t>
+      </w:r>
+      <w:r>
+        <w:t xml:space="preserve">, </w:t>
+      </w:r>
+      <w:r>
+        <w:t>"</w:t>
+      </w:r>
+      <w:r>
+        <w:t>b</w:t>
+      </w:r>
+      <w:r>
+        <w:t>"</w:t>
+      </w:r>
+      <w:r>
+        <w:t xml:space="preserve">, </w:t>
+      </w:r>
+      <w:proofErr w:type="spellStart"/>
+      <w:r>
+        <w:t>sep</w:t>
+      </w:r>
+      <w:proofErr w:type="spellEnd"/>
+      <w:r>
+        <w:t>=</w:t>
+      </w:r>
+      <w:r>
+        <w:t>"</w:t>
+      </w:r>
+      <w:r>
+        <w:t>-</w:t>
+      </w:r>
+      <w:r>
+        <w:t>"</w:t>
+      </w:r>
+      <w:r>
+        <w:t>)</w:t>
+      </w:r>
+      <w:r>
+        <w:tab/>
+      </w:r>
+      <w:r>
+        <w:tab/>
+        <w:t># keyword argument</w:t>
+      </w:r>
+    </w:p>
+    <w:p>
+      <w:pPr>
+        <w:pStyle w:val="Code"/>
+      </w:pPr>
+      <w:r>
+        <w:t>range(0, 10, 2)</w:t>
+      </w:r>
+      <w:r>
+        <w:tab/>
+      </w:r>
+      <w:r>
+        <w:tab/>
+      </w:r>
+      <w:r>
+        <w:tab/>
+      </w:r>
+      <w:r>
+        <w:tab/>
+        <w:t># multiple positional</w:t>
+      </w:r>
+    </w:p>
+    <w:p>
+      <w:pPr>
+        <w:pStyle w:val="Code"/>
+      </w:pPr>
+    </w:p>
+    <w:p>
+      <w:pPr>
+        <w:pStyle w:val="Code"/>
+      </w:pPr>
+      <w:r>
+        <w:t>def greet(name, greeting=</w:t>
+      </w:r>
+      <w:r>
+        <w:t>"</w:t>
+      </w:r>
+      <w:r>
+        <w:t>Hello</w:t>
+      </w:r>
+      <w:r>
+        <w:t>"</w:t>
+      </w:r>
+      <w:r>
+        <w:t>):</w:t>
+      </w:r>
+    </w:p>
+    <w:p>
+      <w:pPr>
+        <w:pStyle w:val="Code"/>
+      </w:pPr>
+      <w:r>
+        <w:t xml:space="preserve">    print(f</w:t>
+      </w:r>
+      <w:r>
+        <w:t>"</w:t>
+      </w:r>
+      <w:r>
+        <w:t>{greeting}, {name}!</w:t>
+      </w:r>
+      <w:r>
+        <w:t>"</w:t>
+      </w:r>
+      <w:r>
+        <w:t>)</w:t>
+      </w:r>
+    </w:p>
+    <w:p>
+      <w:pPr>
+        <w:pStyle w:val="Code"/>
+      </w:pPr>
+    </w:p>
+    <w:p>
+      <w:pPr>
+        <w:pStyle w:val="Code"/>
+      </w:pPr>
+      <w:r>
+        <w:t>greet(</w:t>
+      </w:r>
+      <w:r>
+        <w:t>"</w:t>
+      </w:r>
+      <w:r>
+        <w:t>Alice</w:t>
+      </w:r>
+      <w:r>
+        <w:t>"</w:t>
+      </w:r>
+      <w:r>
+        <w:t>)</w:t>
+      </w:r>
+      <w:r>
+        <w:tab/>
+      </w:r>
+      <w:r>
+        <w:tab/>
+      </w:r>
+      <w:r>
+        <w:tab/>
+      </w:r>
+      <w:r>
+        <w:tab/>
+        <w:t># Hello, Alice!</w:t>
+      </w:r>
+    </w:p>
+    <w:p>
+      <w:pPr>
+        <w:pStyle w:val="Code"/>
+      </w:pPr>
+      <w:r>
+        <w:t>greet(</w:t>
+      </w:r>
+      <w:r>
+        <w:t>"</w:t>
+      </w:r>
+      <w:r>
+        <w:t>Bob</w:t>
+      </w:r>
+      <w:r>
+        <w:t>"</w:t>
+      </w:r>
+      <w:r>
+        <w:t>, greeting=</w:t>
+      </w:r>
+      <w:r>
+        <w:t>"</w:t>
+      </w:r>
+      <w:r>
+        <w:t>Hi</w:t>
+      </w:r>
+      <w:r>
+        <w:t>"</w:t>
+      </w:r>
+      <w:r>
+        <w:t>)</w:t>
+      </w:r>
+      <w:r>
+        <w:tab/>
+      </w:r>
+      <w:r>
+        <w:tab/>
+        <w:t># Hi, Bob!</w:t>
+      </w:r>
+    </w:p>
+    <w:p>
+      <w:pPr>
+        <w:pStyle w:val="ListParagraph"/>
+        <w:ind w:left="846"/>
+        <w:jc w:val="both"/>
+        <w:rPr>
+          <w:rFonts w:asciiTheme="majorBidi" w:hAnsiTheme="majorBidi" w:cstheme="majorBidi"/>
+          <w:lang w:val="en-US"/>
+        </w:rPr>
+      </w:pPr>
+    </w:p>
+    <w:p>
+      <w:pPr>
+        <w:pStyle w:val="ListParagraph"/>
+        <w:numPr>
+          <w:ilvl w:val="1"/>
+          <w:numId w:val="2"/>
+        </w:numPr>
+        <w:ind w:left="845"/>
+        <w:jc w:val="both"/>
+        <w:outlineLvl w:val="1"/>
+        <w:rPr>
+          <w:rFonts w:asciiTheme="majorBidi" w:hAnsiTheme="majorBidi" w:cstheme="majorBidi"/>
+          <w:lang w:val="en-US"/>
+        </w:rPr>
+      </w:pPr>
+      <w:r>
+        <w:rPr>
+          <w:rFonts w:asciiTheme="majorBidi" w:hAnsiTheme="majorBidi" w:cstheme="majorBidi"/>
+          <w:lang w:val="en-US"/>
+        </w:rPr>
+        <w:t>Member Access Expressions</w:t>
+      </w:r>
+    </w:p>
+    <w:p>
+      <w:pPr>
+        <w:pStyle w:val="ListParagraph"/>
+        <w:ind w:left="846"/>
+        <w:jc w:val="both"/>
+        <w:rPr>
+          <w:rFonts w:asciiTheme="majorBidi" w:hAnsiTheme="majorBidi" w:cstheme="majorBidi"/>
+          <w:lang w:val="en-US"/>
+        </w:rPr>
+      </w:pPr>
+      <w:r>
+        <w:rPr>
+          <w:rFonts w:asciiTheme="majorBidi" w:hAnsiTheme="majorBidi" w:cstheme="majorBidi"/>
+          <w:lang w:val="en-US"/>
+        </w:rPr>
+        <w:t xml:space="preserve">A member access expression retrieves a named attribute from a value using dot notation. Member access is supported on instances, classes, modules, namespaces, datasets, models, and the built-in collection types. Accessing a member that does not exist raises an </w:t>
+      </w:r>
+      <w:proofErr w:type="spellStart"/>
+      <w:r>
+        <w:rPr>
+          <w:rStyle w:val="CodeChar"/>
+        </w:rPr>
+        <w:t>AttributeError</w:t>
+      </w:r>
+      <w:proofErr w:type="spellEnd"/>
+      <w:r>
+        <w:rPr>
+          <w:rFonts w:asciiTheme="majorBidi" w:hAnsiTheme="majorBidi" w:cstheme="majorBidi"/>
+          <w:lang w:val="en-US"/>
+        </w:rPr>
+        <w:t xml:space="preserve">. Accessing any member on a </w:t>
+      </w:r>
+      <w:r>
+        <w:rPr>
+          <w:rStyle w:val="CodeChar"/>
+        </w:rPr>
+        <w:t>null</w:t>
+      </w:r>
+      <w:r>
+        <w:rPr>
+          <w:rFonts w:asciiTheme="majorBidi" w:hAnsiTheme="majorBidi" w:cstheme="majorBidi"/>
+          <w:lang w:val="en-US"/>
+        </w:rPr>
+        <w:t xml:space="preserve"> value raises an </w:t>
+      </w:r>
+      <w:proofErr w:type="spellStart"/>
+      <w:r>
+        <w:rPr>
+          <w:rStyle w:val="CodeChar"/>
+        </w:rPr>
+        <w:t>AttributeError</w:t>
+      </w:r>
+      <w:proofErr w:type="spellEnd"/>
+      <w:r>
+        <w:rPr>
+          <w:rFonts w:asciiTheme="majorBidi" w:hAnsiTheme="majorBidi" w:cstheme="majorBidi"/>
+          <w:lang w:val="en-US"/>
+        </w:rPr>
+        <w:t xml:space="preserve"> immediately.</w:t>
+      </w:r>
+    </w:p>
+    <w:p>
+      <w:pPr>
+        <w:pStyle w:val="Code"/>
+      </w:pPr>
+      <w:r>
+        <w:t>import math</w:t>
+      </w:r>
+    </w:p>
+    <w:p>
+      <w:pPr>
+        <w:pStyle w:val="Code"/>
+      </w:pPr>
+    </w:p>
+    <w:p>
+      <w:pPr>
+        <w:pStyle w:val="Code"/>
+      </w:pPr>
+      <w:r>
+        <w:t xml:space="preserve">x = </w:t>
+      </w:r>
+      <w:proofErr w:type="spellStart"/>
+      <w:r>
+        <w:t>math.pi</w:t>
+      </w:r>
+      <w:proofErr w:type="spellEnd"/>
+      <w:r>
+        <w:tab/>
+      </w:r>
+      <w:r>
+        <w:tab/>
+        <w:t># module member</w:t>
+      </w:r>
+    </w:p>
+    <w:p>
+      <w:pPr>
+        <w:pStyle w:val="Code"/>
+      </w:pPr>
+      <w:r>
+        <w:t xml:space="preserve">s = </w:t>
+      </w:r>
+      <w:r>
+        <w:t>"</w:t>
+      </w:r>
+      <w:proofErr w:type="spellStart"/>
+      <w:r>
+        <w:t>hello</w:t>
+      </w:r>
+      <w:r>
+        <w:t>"</w:t>
+      </w:r>
+      <w:r>
+        <w:t>.upper</w:t>
+      </w:r>
+      <w:proofErr w:type="spellEnd"/>
+      <w:r>
+        <w:t>()</w:t>
+      </w:r>
+      <w:r>
+        <w:tab/>
+        <w:t># string method</w:t>
+      </w:r>
+    </w:p>
+    <w:p>
+      <w:pPr>
+        <w:pStyle w:val="Code"/>
+      </w:pPr>
+      <w:r>
+        <w:t xml:space="preserve">ds = </w:t>
+      </w:r>
+      <w:proofErr w:type="spellStart"/>
+      <w:r>
+        <w:t>datasets.iris</w:t>
+      </w:r>
+      <w:proofErr w:type="spellEnd"/>
+      <w:r>
+        <w:t>()</w:t>
+      </w:r>
+    </w:p>
+    <w:p>
+      <w:pPr>
+        <w:pStyle w:val="Code"/>
+      </w:pPr>
+      <w:proofErr w:type="spellStart"/>
+      <w:r>
+        <w:t>ds.describe</w:t>
+      </w:r>
+      <w:proofErr w:type="spellEnd"/>
+      <w:r>
+        <w:t>()</w:t>
+      </w:r>
+      <w:r>
+        <w:tab/>
+      </w:r>
+      <w:r>
+        <w:tab/>
+        <w:t># dataset method</w:t>
+      </w:r>
+    </w:p>
+    <w:p>
+      <w:pPr>
+        <w:pStyle w:val="Code"/>
+      </w:pPr>
+      <w:proofErr w:type="spellStart"/>
+      <w:r>
+        <w:t>model.explain</w:t>
+      </w:r>
+      <w:proofErr w:type="spellEnd"/>
+      <w:r>
+        <w:t>()</w:t>
+      </w:r>
+      <w:r>
+        <w:tab/>
+      </w:r>
+      <w:r>
+        <w:tab/>
+      </w:r>
+      <w:r>
+        <w:t># model method</w:t>
+      </w:r>
+    </w:p>
+    <w:p>
+      <w:pPr>
+        <w:pStyle w:val="ListParagraph"/>
+        <w:ind w:left="846"/>
+        <w:jc w:val="both"/>
+        <w:rPr>
+          <w:rFonts w:asciiTheme="majorBidi" w:hAnsiTheme="majorBidi" w:cstheme="majorBidi"/>
+          <w:lang w:val="en-US"/>
+        </w:rPr>
+      </w:pPr>
+    </w:p>
+    <w:p>
+      <w:pPr>
+        <w:pStyle w:val="ListParagraph"/>
+        <w:numPr>
+          <w:ilvl w:val="1"/>
+          <w:numId w:val="2"/>
+        </w:numPr>
+        <w:ind w:left="845"/>
+        <w:jc w:val="both"/>
+        <w:outlineLvl w:val="1"/>
+        <w:rPr>
+          <w:rFonts w:asciiTheme="majorBidi" w:hAnsiTheme="majorBidi" w:cstheme="majorBidi"/>
+          <w:lang w:val="en-US"/>
+        </w:rPr>
+      </w:pPr>
+      <w:r>
+        <w:rPr>
+          <w:rFonts w:asciiTheme="majorBidi" w:hAnsiTheme="majorBidi" w:cstheme="majorBidi"/>
+          <w:lang w:val="en-US"/>
+        </w:rPr>
+        <w:t>Index Expressions</w:t>
+      </w:r>
+    </w:p>
+    <w:p>
+      <w:pPr>
+        <w:pStyle w:val="ListParagraph"/>
+        <w:ind w:left="846"/>
+        <w:jc w:val="both"/>
+        <w:rPr>
+          <w:rFonts w:asciiTheme="majorBidi" w:hAnsiTheme="majorBidi" w:cstheme="majorBidi"/>
+          <w:lang w:val="en-US"/>
+        </w:rPr>
+      </w:pPr>
+      <w:r>
+        <w:rPr>
+          <w:rFonts w:asciiTheme="majorBidi" w:hAnsiTheme="majorBidi" w:cstheme="majorBidi"/>
+          <w:lang w:val="en-US"/>
+        </w:rPr>
+        <w:t xml:space="preserve">An index expression retrieves a value from a list, dict, string, or tensor using square bracket syntax. For lists and strings, the index must be a Number and supports negative indexing from the end. Accessing an out-of-range index on a list or string raises an </w:t>
+      </w:r>
+      <w:proofErr w:type="spellStart"/>
+      <w:r>
+        <w:rPr>
+          <w:rStyle w:val="CodeChar"/>
+        </w:rPr>
+        <w:t>IndexError</w:t>
+      </w:r>
+      <w:proofErr w:type="spellEnd"/>
+      <w:r>
+        <w:rPr>
+          <w:rFonts w:asciiTheme="majorBidi" w:hAnsiTheme="majorBidi" w:cstheme="majorBidi"/>
+          <w:lang w:val="en-US"/>
+        </w:rPr>
+        <w:t xml:space="preserve">. For dicts, the index is a key and accessing a key that does not exist raises a </w:t>
+      </w:r>
+      <w:proofErr w:type="spellStart"/>
+      <w:r>
+        <w:rPr>
+          <w:rStyle w:val="CodeChar"/>
+        </w:rPr>
+        <w:t>KeyError</w:t>
+      </w:r>
+      <w:proofErr w:type="spellEnd"/>
+      <w:r>
+        <w:rPr>
+          <w:rFonts w:asciiTheme="majorBidi" w:hAnsiTheme="majorBidi" w:cstheme="majorBidi"/>
+          <w:lang w:val="en-US"/>
+        </w:rPr>
+        <w:t>. Tensors support both single-dimensional indexing and multi-dimensional indexing with multiple comma-separated indices.</w:t>
+      </w:r>
+    </w:p>
+    <w:p>
+      <w:pPr>
+        <w:pStyle w:val="Code"/>
+      </w:pPr>
+      <w:proofErr w:type="spellStart"/>
+      <w:r>
+        <w:t>lst</w:t>
+      </w:r>
+      <w:proofErr w:type="spellEnd"/>
+      <w:r>
+        <w:t xml:space="preserve"> = [10, 20, 30]</w:t>
+      </w:r>
+    </w:p>
+    <w:p>
+      <w:pPr>
+        <w:pStyle w:val="Code"/>
+      </w:pPr>
+      <w:r>
+        <w:t>print(</w:t>
+      </w:r>
+      <w:proofErr w:type="spellStart"/>
+      <w:r>
+        <w:t>lst</w:t>
+      </w:r>
+      <w:proofErr w:type="spellEnd"/>
+      <w:r>
+        <w:t>[0])</w:t>
+      </w:r>
+      <w:r>
+        <w:tab/>
+      </w:r>
+      <w:r>
+        <w:tab/>
+      </w:r>
+      <w:r>
+        <w:tab/>
+        <w:t># 10</w:t>
+      </w:r>
+    </w:p>
+    <w:p>
+      <w:pPr>
+        <w:pStyle w:val="Code"/>
+      </w:pPr>
+      <w:r>
+        <w:t>print(</w:t>
+      </w:r>
+      <w:proofErr w:type="spellStart"/>
+      <w:r>
+        <w:t>lst</w:t>
+      </w:r>
+      <w:proofErr w:type="spellEnd"/>
+      <w:r>
+        <w:t>[–1])</w:t>
+      </w:r>
+      <w:r>
+        <w:tab/>
+      </w:r>
+      <w:r>
+        <w:tab/>
+      </w:r>
+      <w:r>
+        <w:tab/>
+        <w:t># 30</w:t>
+      </w:r>
+    </w:p>
+    <w:p>
+      <w:pPr>
+        <w:pStyle w:val="Code"/>
+      </w:pPr>
+    </w:p>
+    <w:p>
+      <w:pPr>
+        <w:pStyle w:val="Code"/>
+      </w:pPr>
+      <w:r>
+        <w:t>d = {</w:t>
+      </w:r>
+      <w:r>
+        <w:t>"</w:t>
+      </w:r>
+      <w:r>
+        <w:t>a</w:t>
+      </w:r>
+      <w:r>
+        <w:t>"</w:t>
+      </w:r>
+      <w:r>
+        <w:t xml:space="preserve">: 1, </w:t>
+      </w:r>
+      <w:r>
+        <w:t>"</w:t>
+      </w:r>
+      <w:r>
+        <w:t>b</w:t>
+      </w:r>
+      <w:r>
+        <w:t>"</w:t>
+      </w:r>
+      <w:r>
+        <w:t>: 2}</w:t>
+      </w:r>
+    </w:p>
+    <w:p>
+      <w:pPr>
+        <w:pStyle w:val="Code"/>
+      </w:pPr>
+      <w:r>
+        <w:lastRenderedPageBreak/>
+        <w:t>print(d[</w:t>
+      </w:r>
+      <w:r>
+        <w:t>"</w:t>
+      </w:r>
+      <w:r>
+        <w:t>a</w:t>
+      </w:r>
+      <w:r>
+        <w:t>"</w:t>
+      </w:r>
+      <w:r>
+        <w:t>])</w:t>
+      </w:r>
+      <w:r>
+        <w:tab/>
+      </w:r>
+      <w:r>
+        <w:tab/>
+      </w:r>
+      <w:r>
+        <w:tab/>
+        <w:t># 1</w:t>
+      </w:r>
+    </w:p>
+    <w:p>
+      <w:pPr>
+        <w:pStyle w:val="Code"/>
+      </w:pPr>
+    </w:p>
+    <w:p>
+      <w:pPr>
+        <w:pStyle w:val="Code"/>
+      </w:pPr>
+      <w:r>
+        <w:t xml:space="preserve">s = </w:t>
+      </w:r>
+      <w:r>
+        <w:t>"</w:t>
+      </w:r>
+      <w:r>
+        <w:t>hello</w:t>
+      </w:r>
+      <w:r>
+        <w:t>"</w:t>
+      </w:r>
+    </w:p>
+    <w:p>
+      <w:pPr>
+        <w:pStyle w:val="Code"/>
+      </w:pPr>
+      <w:r>
+        <w:t>print(s[1])</w:t>
+      </w:r>
+      <w:r>
+        <w:tab/>
+      </w:r>
+      <w:r>
+        <w:tab/>
+      </w:r>
+      <w:r>
+        <w:tab/>
+        <w:t xml:space="preserve"># </w:t>
+      </w:r>
+      <w:r>
+        <w:t>"</w:t>
+      </w:r>
+      <w:r>
+        <w:t>e</w:t>
+      </w:r>
+      <w:r>
+        <w:t>"</w:t>
+      </w:r>
+    </w:p>
+    <w:p>
+      <w:pPr>
+        <w:pStyle w:val="Code"/>
+      </w:pPr>
+    </w:p>
+    <w:p>
+      <w:pPr>
+        <w:pStyle w:val="Code"/>
+      </w:pPr>
+      <w:r>
+        <w:t>m = @[[1, 2], [3, 4]]</w:t>
+      </w:r>
+    </w:p>
+    <w:p>
+      <w:pPr>
+        <w:pStyle w:val="Code"/>
+      </w:pPr>
+      <w:r>
+        <w:t>print(m[0])</w:t>
+      </w:r>
+      <w:r>
+        <w:tab/>
+      </w:r>
+      <w:r>
+        <w:tab/>
+      </w:r>
+      <w:r>
+        <w:tab/>
+        <w:t># @[1, 2]</w:t>
+      </w:r>
+    </w:p>
+    <w:p>
+      <w:pPr>
+        <w:pStyle w:val="ListParagraph"/>
+        <w:ind w:left="846"/>
+        <w:jc w:val="both"/>
+        <w:rPr>
+          <w:rFonts w:asciiTheme="majorBidi" w:hAnsiTheme="majorBidi" w:cstheme="majorBidi"/>
+          <w:lang w:val="en-US"/>
+        </w:rPr>
+      </w:pPr>
+    </w:p>
+    <w:p>
+      <w:pPr>
+        <w:pStyle w:val="ListParagraph"/>
+        <w:numPr>
+          <w:ilvl w:val="1"/>
+          <w:numId w:val="2"/>
+        </w:numPr>
+        <w:ind w:left="845"/>
+        <w:jc w:val="both"/>
+        <w:outlineLvl w:val="1"/>
+        <w:rPr>
+          <w:rFonts w:asciiTheme="majorBidi" w:hAnsiTheme="majorBidi" w:cstheme="majorBidi"/>
+          <w:lang w:val="en-US"/>
+        </w:rPr>
+      </w:pPr>
+      <w:r>
+        <w:rPr>
+          <w:rFonts w:asciiTheme="majorBidi" w:hAnsiTheme="majorBidi" w:cstheme="majorBidi"/>
+          <w:lang w:val="en-US"/>
+        </w:rPr>
+        <w:t>Slice Expressions</w:t>
+      </w:r>
+    </w:p>
+    <w:p>
+      <w:pPr>
+        <w:pStyle w:val="ListParagraph"/>
+        <w:ind w:left="846"/>
+        <w:jc w:val="both"/>
+        <w:rPr>
+          <w:rFonts w:asciiTheme="majorBidi" w:hAnsiTheme="majorBidi" w:cstheme="majorBidi"/>
+          <w:lang w:val="en-US"/>
+        </w:rPr>
+      </w:pPr>
+      <w:r>
+        <w:rPr>
+          <w:rFonts w:asciiTheme="majorBidi" w:hAnsiTheme="majorBidi" w:cstheme="majorBidi"/>
+          <w:lang w:val="en-US"/>
+        </w:rPr>
+        <w:t xml:space="preserve">Slice expressions extract a contiguous subsequence from a list or string using the </w:t>
+      </w:r>
+      <w:r>
+        <w:rPr>
+          <w:rStyle w:val="CodeChar"/>
+        </w:rPr>
+        <w:t>[</w:t>
+      </w:r>
+      <w:proofErr w:type="spellStart"/>
+      <w:r>
+        <w:rPr>
+          <w:rStyle w:val="CodeChar"/>
+        </w:rPr>
+        <w:t>start:end</w:t>
+      </w:r>
+      <w:proofErr w:type="spellEnd"/>
+      <w:r>
+        <w:rPr>
+          <w:rStyle w:val="CodeChar"/>
+        </w:rPr>
+        <w:t>]</w:t>
+      </w:r>
+      <w:r>
+        <w:rPr>
+          <w:rFonts w:asciiTheme="majorBidi" w:hAnsiTheme="majorBidi" w:cstheme="majorBidi"/>
+          <w:lang w:val="en-US"/>
+        </w:rPr>
+        <w:t xml:space="preserve"> syntax. The start index is inclusive and the end index is exclusive. Either bound can be omitted</w:t>
+      </w:r>
+      <w:r>
+        <w:rPr>
+          <w:rFonts w:asciiTheme="majorBidi" w:hAnsiTheme="majorBidi" w:cstheme="majorBidi"/>
+          <w:lang w:val="en-US"/>
+        </w:rPr>
+        <w:t>,</w:t>
+      </w:r>
+      <w:r>
+        <w:rPr>
+          <w:rFonts w:asciiTheme="majorBidi" w:hAnsiTheme="majorBidi" w:cstheme="majorBidi"/>
+          <w:lang w:val="en-US"/>
+        </w:rPr>
+        <w:t xml:space="preserve"> omitting start defaults to the beginning of the sequence and omitting end defaults to the end. Slices always return a new value of the same type as the container and never raise an index error for out-of-range bounds.</w:t>
+      </w:r>
+    </w:p>
+    <w:p>
+      <w:pPr>
+        <w:pStyle w:val="Code"/>
+      </w:pPr>
+      <w:proofErr w:type="spellStart"/>
+      <w:r>
+        <w:t>lst</w:t>
+      </w:r>
+      <w:proofErr w:type="spellEnd"/>
+      <w:r>
+        <w:t xml:space="preserve"> = [1, 2, 3, 4, 5]</w:t>
+      </w:r>
+    </w:p>
+    <w:p>
+      <w:pPr>
+        <w:pStyle w:val="Code"/>
+      </w:pPr>
+      <w:r>
+        <w:t>print(</w:t>
+      </w:r>
+      <w:proofErr w:type="spellStart"/>
+      <w:r>
+        <w:t>lst</w:t>
+      </w:r>
+      <w:proofErr w:type="spellEnd"/>
+      <w:r>
+        <w:t>[1:3])</w:t>
+      </w:r>
+      <w:r>
+        <w:tab/>
+      </w:r>
+      <w:r>
+        <w:tab/>
+        <w:t># [2, 3]</w:t>
+      </w:r>
+    </w:p>
+    <w:p>
+      <w:pPr>
+        <w:pStyle w:val="Code"/>
+      </w:pPr>
+      <w:r>
+        <w:t>print(</w:t>
+      </w:r>
+      <w:proofErr w:type="spellStart"/>
+      <w:r>
+        <w:t>lst</w:t>
+      </w:r>
+      <w:proofErr w:type="spellEnd"/>
+      <w:r>
+        <w:t>[:2])</w:t>
+      </w:r>
+      <w:r>
+        <w:tab/>
+      </w:r>
+      <w:r>
+        <w:tab/>
+        <w:t># [1, 2]</w:t>
+      </w:r>
+    </w:p>
+    <w:p>
+      <w:pPr>
+        <w:pStyle w:val="Code"/>
+      </w:pPr>
+      <w:r>
+        <w:t>print(</w:t>
+      </w:r>
+      <w:proofErr w:type="spellStart"/>
+      <w:r>
+        <w:t>lst</w:t>
+      </w:r>
+      <w:proofErr w:type="spellEnd"/>
+      <w:r>
+        <w:t>[3:])</w:t>
+      </w:r>
+      <w:r>
+        <w:tab/>
+      </w:r>
+      <w:r>
+        <w:tab/>
+        <w:t># [4, 5]</w:t>
+      </w:r>
+    </w:p>
+    <w:p>
+      <w:pPr>
+        <w:pStyle w:val="Code"/>
+      </w:pPr>
+    </w:p>
+    <w:p>
+      <w:pPr>
+        <w:pStyle w:val="Code"/>
+      </w:pPr>
+      <w:r>
+        <w:t xml:space="preserve">s = </w:t>
+      </w:r>
+      <w:r>
+        <w:t>"</w:t>
+      </w:r>
+      <w:r>
+        <w:t>hello world</w:t>
+      </w:r>
+      <w:r>
+        <w:t>"</w:t>
+      </w:r>
+    </w:p>
+    <w:p>
+      <w:pPr>
+        <w:pStyle w:val="Code"/>
+      </w:pPr>
+      <w:r>
+        <w:t>print(s[0:5])</w:t>
+      </w:r>
+      <w:r>
+        <w:tab/>
+      </w:r>
+      <w:r>
+        <w:tab/>
+        <w:t xml:space="preserve"># </w:t>
+      </w:r>
+      <w:r>
+        <w:t>"</w:t>
+      </w:r>
+      <w:r>
+        <w:t>hello</w:t>
+      </w:r>
+      <w:r>
+        <w:t>"</w:t>
+      </w:r>
+    </w:p>
+    <w:p>
+      <w:pPr>
+        <w:pStyle w:val="ListParagraph"/>
+        <w:ind w:left="846"/>
+        <w:jc w:val="both"/>
+        <w:rPr>
+          <w:rFonts w:asciiTheme="majorBidi" w:hAnsiTheme="majorBidi" w:cstheme="majorBidi"/>
+          <w:lang w:val="en-US"/>
+        </w:rPr>
+      </w:pPr>
+    </w:p>
+    <w:p>
+      <w:pPr>
+        <w:pStyle w:val="ListParagraph"/>
+        <w:numPr>
+          <w:ilvl w:val="1"/>
+          <w:numId w:val="2"/>
+        </w:numPr>
+        <w:ind w:left="845"/>
+        <w:jc w:val="both"/>
+        <w:outlineLvl w:val="1"/>
+        <w:rPr>
+          <w:rFonts w:asciiTheme="majorBidi" w:hAnsiTheme="majorBidi" w:cstheme="majorBidi"/>
+          <w:lang w:val="en-US"/>
+        </w:rPr>
+      </w:pPr>
+      <w:r>
+        <w:rPr>
+          <w:rFonts w:asciiTheme="majorBidi" w:hAnsiTheme="majorBidi" w:cstheme="majorBidi"/>
+          <w:lang w:val="en-US"/>
+        </w:rPr>
+        <w:t>Ternary Expressions</w:t>
+      </w:r>
+    </w:p>
+    <w:p>
+      <w:pPr>
+        <w:pStyle w:val="ListParagraph"/>
+        <w:ind w:left="846"/>
+        <w:jc w:val="both"/>
+        <w:rPr>
+          <w:rFonts w:asciiTheme="majorBidi" w:hAnsiTheme="majorBidi" w:cstheme="majorBidi"/>
+          <w:lang w:val="en-US"/>
+        </w:rPr>
+      </w:pPr>
+      <w:r>
+        <w:rPr>
+          <w:rFonts w:asciiTheme="majorBidi" w:hAnsiTheme="majorBidi" w:cstheme="majorBidi"/>
+          <w:lang w:val="en-US"/>
+        </w:rPr>
+        <w:t xml:space="preserve">A ternary expression is a conditional expression that evaluates to one of two values depending on a condition. The syntax is </w:t>
+      </w:r>
+      <w:proofErr w:type="spellStart"/>
+      <w:r>
+        <w:rPr>
+          <w:rStyle w:val="CodeChar"/>
+        </w:rPr>
+        <w:t>then_expr</w:t>
+      </w:r>
+      <w:proofErr w:type="spellEnd"/>
+      <w:r>
+        <w:rPr>
+          <w:rStyle w:val="CodeChar"/>
+        </w:rPr>
+        <w:t xml:space="preserve"> if condition else </w:t>
+      </w:r>
+      <w:proofErr w:type="spellStart"/>
+      <w:r>
+        <w:rPr>
+          <w:rStyle w:val="CodeChar"/>
+        </w:rPr>
+        <w:t>else_expr</w:t>
+      </w:r>
+      <w:proofErr w:type="spellEnd"/>
+      <w:r>
+        <w:rPr>
+          <w:rFonts w:asciiTheme="majorBidi" w:hAnsiTheme="majorBidi" w:cstheme="majorBidi"/>
+          <w:lang w:val="en-US"/>
+        </w:rPr>
+        <w:t>. The condition is evaluated first</w:t>
+      </w:r>
+      <w:r>
+        <w:rPr>
+          <w:rFonts w:asciiTheme="majorBidi" w:hAnsiTheme="majorBidi" w:cstheme="majorBidi"/>
+          <w:lang w:val="en-US"/>
+        </w:rPr>
+        <w:t>,</w:t>
+      </w:r>
+      <w:r>
+        <w:rPr>
+          <w:rFonts w:asciiTheme="majorBidi" w:hAnsiTheme="majorBidi" w:cstheme="majorBidi"/>
+          <w:lang w:val="en-US"/>
+        </w:rPr>
+        <w:t xml:space="preserve"> if it is truthy, </w:t>
+      </w:r>
+      <w:proofErr w:type="spellStart"/>
+      <w:r>
+        <w:rPr>
+          <w:rStyle w:val="CodeChar"/>
+        </w:rPr>
+        <w:t>then_expr</w:t>
+      </w:r>
+      <w:proofErr w:type="spellEnd"/>
+      <w:r>
+        <w:rPr>
+          <w:rFonts w:asciiTheme="majorBidi" w:hAnsiTheme="majorBidi" w:cstheme="majorBidi"/>
+          <w:lang w:val="en-US"/>
+        </w:rPr>
+        <w:t xml:space="preserve"> is evaluated and returned; otherwise </w:t>
+      </w:r>
+      <w:proofErr w:type="spellStart"/>
+      <w:r>
+        <w:rPr>
+          <w:rStyle w:val="CodeChar"/>
+        </w:rPr>
+        <w:t>else_expr</w:t>
+      </w:r>
+      <w:proofErr w:type="spellEnd"/>
+      <w:r>
+        <w:rPr>
+          <w:rFonts w:asciiTheme="majorBidi" w:hAnsiTheme="majorBidi" w:cstheme="majorBidi"/>
+          <w:lang w:val="en-US"/>
+        </w:rPr>
+        <w:t xml:space="preserve"> is evaluated and returned. Only one branch is evaluated.</w:t>
+      </w:r>
+    </w:p>
+    <w:p>
+      <w:pPr>
+        <w:pStyle w:val="Code"/>
+      </w:pPr>
+      <w:r>
+        <w:t>x = 10</w:t>
+      </w:r>
+    </w:p>
+    <w:p>
+      <w:pPr>
+        <w:pStyle w:val="Code"/>
+      </w:pPr>
+      <w:r>
+        <w:t xml:space="preserve">label = </w:t>
+      </w:r>
+      <w:r>
+        <w:t>"</w:t>
+      </w:r>
+      <w:r>
+        <w:t>positive</w:t>
+      </w:r>
+      <w:r>
+        <w:t>"</w:t>
+      </w:r>
+      <w:r>
+        <w:t xml:space="preserve"> is x &gt; 0 else </w:t>
+      </w:r>
+      <w:r>
+        <w:t>"</w:t>
+      </w:r>
+      <w:r>
+        <w:t>negative</w:t>
+      </w:r>
+      <w:r>
+        <w:t>"</w:t>
+      </w:r>
+    </w:p>
+    <w:p>
+      <w:pPr>
+        <w:pStyle w:val="Code"/>
+      </w:pPr>
+      <w:r>
+        <w:t>print(label)</w:t>
+      </w:r>
+      <w:r>
+        <w:tab/>
+      </w:r>
+      <w:r>
+        <w:tab/>
+      </w:r>
+      <w:r>
+        <w:tab/>
+        <w:t xml:space="preserve"># </w:t>
+      </w:r>
+      <w:r>
+        <w:t>"</w:t>
+      </w:r>
+      <w:r>
+        <w:t>positive</w:t>
+      </w:r>
+      <w:r>
+        <w:t>"</w:t>
+      </w:r>
+    </w:p>
+    <w:p>
+      <w:pPr>
+        <w:pStyle w:val="Code"/>
+      </w:pPr>
+    </w:p>
+    <w:p>
+      <w:pPr>
+        <w:pStyle w:val="Code"/>
+      </w:pPr>
+      <w:r>
+        <w:t>result = a if a &gt; b else b</w:t>
+      </w:r>
+      <w:r>
+        <w:tab/>
+        <w:t># max of a and b</w:t>
+      </w:r>
+    </w:p>
+    <w:p>
+      <w:pPr>
+        <w:pStyle w:val="ListParagraph"/>
+        <w:ind w:left="846"/>
+        <w:jc w:val="both"/>
+        <w:rPr>
+          <w:rFonts w:asciiTheme="majorBidi" w:hAnsiTheme="majorBidi" w:cstheme="majorBidi"/>
+          <w:lang w:val="en-US"/>
+        </w:rPr>
+      </w:pPr>
+    </w:p>
+    <w:p>
+      <w:pPr>
+        <w:pStyle w:val="ListParagraph"/>
+        <w:numPr>
+          <w:ilvl w:val="1"/>
+          <w:numId w:val="2"/>
+        </w:numPr>
+        <w:ind w:left="845"/>
+        <w:jc w:val="both"/>
+        <w:outlineLvl w:val="1"/>
+        <w:rPr>
+          <w:rFonts w:asciiTheme="majorBidi" w:hAnsiTheme="majorBidi" w:cstheme="majorBidi"/>
+          <w:lang w:val="en-US"/>
+        </w:rPr>
+      </w:pPr>
+      <w:r>
+        <w:rPr>
+          <w:rFonts w:asciiTheme="majorBidi" w:hAnsiTheme="majorBidi" w:cstheme="majorBidi"/>
+          <w:lang w:val="en-US"/>
+        </w:rPr>
+        <w:t>Lambda Expressions</w:t>
+      </w:r>
+    </w:p>
+    <w:p>
+      <w:pPr>
+        <w:pStyle w:val="ListParagraph"/>
+        <w:ind w:left="846"/>
+        <w:jc w:val="both"/>
+        <w:rPr>
+          <w:rFonts w:asciiTheme="majorBidi" w:hAnsiTheme="majorBidi" w:cstheme="majorBidi"/>
+          <w:lang w:val="en-US"/>
+        </w:rPr>
+      </w:pPr>
+      <w:r>
+        <w:rPr>
+          <w:rFonts w:asciiTheme="majorBidi" w:hAnsiTheme="majorBidi" w:cstheme="majorBidi"/>
+          <w:lang w:val="en-US"/>
+        </w:rPr>
+        <w:t xml:space="preserve">A lambda expression produces an anonymous function value inline without a </w:t>
+      </w:r>
+      <w:r>
+        <w:rPr>
+          <w:rStyle w:val="CodeChar"/>
+        </w:rPr>
+        <w:t>def</w:t>
+      </w:r>
+      <w:r>
+        <w:rPr>
+          <w:rFonts w:asciiTheme="majorBidi" w:hAnsiTheme="majorBidi" w:cstheme="majorBidi"/>
+          <w:lang w:val="en-US"/>
+        </w:rPr>
+        <w:t xml:space="preserve"> declaration. The syntax is </w:t>
+      </w:r>
+      <w:r>
+        <w:rPr>
+          <w:rStyle w:val="CodeChar"/>
+        </w:rPr>
+        <w:t>lambda params: expression</w:t>
+      </w:r>
+      <w:r>
+        <w:rPr>
+          <w:rFonts w:asciiTheme="majorBidi" w:hAnsiTheme="majorBidi" w:cstheme="majorBidi"/>
+          <w:lang w:val="en-US"/>
+        </w:rPr>
+        <w:t xml:space="preserve">. The body of a lambda is a single expression whose value is returned implicitly. Lambdas capture their enclosing lexical environment as closures, the same way named functions do. Lambdas are commonly used as arguments to higher-order functions such as </w:t>
+      </w:r>
+      <w:r>
+        <w:rPr>
+          <w:rStyle w:val="CodeChar"/>
+        </w:rPr>
+        <w:t>sort()</w:t>
+      </w:r>
+      <w:r>
+        <w:rPr>
+          <w:rFonts w:asciiTheme="majorBidi" w:hAnsiTheme="majorBidi" w:cstheme="majorBidi"/>
+          <w:lang w:val="en-US"/>
+        </w:rPr>
+        <w:t xml:space="preserve">, </w:t>
+      </w:r>
+      <w:r>
+        <w:rPr>
+          <w:rStyle w:val="CodeChar"/>
+        </w:rPr>
+        <w:t>map()</w:t>
+      </w:r>
+      <w:r>
+        <w:rPr>
+          <w:rFonts w:asciiTheme="majorBidi" w:hAnsiTheme="majorBidi" w:cstheme="majorBidi"/>
+          <w:lang w:val="en-US"/>
+        </w:rPr>
+        <w:t xml:space="preserve">, and </w:t>
+      </w:r>
+      <w:r>
+        <w:rPr>
+          <w:rStyle w:val="CodeChar"/>
+        </w:rPr>
+        <w:t>filter()</w:t>
+      </w:r>
+      <w:r>
+        <w:rPr>
+          <w:rFonts w:asciiTheme="majorBidi" w:hAnsiTheme="majorBidi" w:cstheme="majorBidi"/>
+          <w:lang w:val="en-US"/>
+        </w:rPr>
+        <w:t>, where defining a full named function would be unnecessarily verbose.</w:t>
+      </w:r>
+    </w:p>
+    <w:p>
+      <w:pPr>
+        <w:pStyle w:val="Code"/>
+      </w:pPr>
+      <w:r>
+        <w:t>square = lambda x: x * x</w:t>
+      </w:r>
+    </w:p>
+    <w:p>
+      <w:pPr>
+        <w:pStyle w:val="Code"/>
+      </w:pPr>
+      <w:r>
+        <w:t>add = lambda a, b: a + b</w:t>
+      </w:r>
+    </w:p>
+    <w:p>
+      <w:pPr>
+        <w:pStyle w:val="Code"/>
+      </w:pPr>
+    </w:p>
+    <w:p>
+      <w:pPr>
+        <w:pStyle w:val="Code"/>
+      </w:pPr>
+      <w:r>
+        <w:t>print(square(5))</w:t>
+      </w:r>
+      <w:r>
+        <w:tab/>
+      </w:r>
+      <w:r>
+        <w:t># 25</w:t>
+      </w:r>
+    </w:p>
+    <w:p>
+      <w:pPr>
+        <w:pStyle w:val="Code"/>
+      </w:pPr>
+      <w:r>
+        <w:t>print(add(3, 4))</w:t>
+      </w:r>
+      <w:r>
+        <w:tab/>
+      </w:r>
+      <w:r>
+        <w:t># 7</w:t>
+      </w:r>
+    </w:p>
+    <w:p>
+      <w:pPr>
+        <w:pStyle w:val="Code"/>
+      </w:pPr>
+    </w:p>
+    <w:p>
+      <w:pPr>
+        <w:pStyle w:val="Code"/>
+      </w:pPr>
+      <w:proofErr w:type="spellStart"/>
+      <w:r>
+        <w:t>nums</w:t>
+      </w:r>
+      <w:proofErr w:type="spellEnd"/>
+      <w:r>
+        <w:t xml:space="preserve"> = [3, 1, 4, 1, 5]</w:t>
+      </w:r>
+    </w:p>
+    <w:p>
+      <w:pPr>
+        <w:pStyle w:val="Code"/>
+      </w:pPr>
+      <w:proofErr w:type="spellStart"/>
+      <w:r>
+        <w:t>nums.sort</w:t>
+      </w:r>
+      <w:proofErr w:type="spellEnd"/>
+      <w:r>
+        <w:t>(key=lambda x: x)</w:t>
+      </w:r>
+    </w:p>
+    <w:p>
+      <w:pPr>
+        <w:pStyle w:val="Code"/>
+      </w:pPr>
+      <w:r>
+        <w:t xml:space="preserve">evens = </w:t>
+      </w:r>
+      <w:proofErr w:type="spellStart"/>
+      <w:r>
+        <w:t>nums.filter</w:t>
+      </w:r>
+      <w:proofErr w:type="spellEnd"/>
+      <w:r>
+        <w:t>(lambda x: x % 2 == 0)</w:t>
+      </w:r>
+    </w:p>
+    <w:p>
+      <w:pPr>
+        <w:pStyle w:val="Code"/>
+      </w:pPr>
+      <w:r>
+        <w:t xml:space="preserve">doubled = </w:t>
+      </w:r>
+      <w:proofErr w:type="spellStart"/>
+      <w:r>
+        <w:t>nums.map</w:t>
+      </w:r>
+      <w:proofErr w:type="spellEnd"/>
+      <w:r>
+        <w:t>(lambda x: x * 2)</w:t>
+      </w:r>
+    </w:p>
+    <w:p>
+      <w:pPr>
+        <w:pStyle w:val="ListParagraph"/>
+        <w:ind w:left="846"/>
+        <w:jc w:val="both"/>
+        <w:rPr>
+          <w:rFonts w:asciiTheme="majorBidi" w:hAnsiTheme="majorBidi" w:cstheme="majorBidi"/>
+          <w:lang w:val="en-US"/>
+        </w:rPr>
+      </w:pPr>
+    </w:p>
+    <w:p>
+      <w:pPr>
+        <w:pStyle w:val="ListParagraph"/>
+        <w:numPr>
+          <w:ilvl w:val="1"/>
+          <w:numId w:val="2"/>
+        </w:numPr>
+        <w:ind w:left="845"/>
+        <w:jc w:val="both"/>
+        <w:outlineLvl w:val="1"/>
+        <w:rPr>
+          <w:rFonts w:asciiTheme="majorBidi" w:hAnsiTheme="majorBidi" w:cstheme="majorBidi"/>
+          <w:lang w:val="en-US"/>
+        </w:rPr>
+      </w:pPr>
+      <w:r>
+        <w:rPr>
+          <w:rFonts w:asciiTheme="majorBidi" w:hAnsiTheme="majorBidi" w:cstheme="majorBidi"/>
+          <w:lang w:val="en-US"/>
+        </w:rPr>
+        <w:t>List Comprehension Expressions</w:t>
+      </w:r>
+    </w:p>
+    <w:p>
+      <w:pPr>
+        <w:pStyle w:val="ListParagraph"/>
+        <w:ind w:left="846"/>
+        <w:jc w:val="both"/>
+        <w:rPr>
+          <w:rFonts w:asciiTheme="majorBidi" w:hAnsiTheme="majorBidi" w:cstheme="majorBidi"/>
+          <w:lang w:val="en-US"/>
+        </w:rPr>
+      </w:pPr>
+      <w:r>
+        <w:rPr>
+          <w:rFonts w:asciiTheme="majorBidi" w:hAnsiTheme="majorBidi" w:cstheme="majorBidi"/>
+          <w:lang w:val="en-US"/>
+        </w:rPr>
+        <w:t xml:space="preserve">A list comprehension produces a new list by evaluating an expression for each element of an iterable, with an optional filter condition. The syntax is </w:t>
+      </w:r>
+      <w:r>
+        <w:rPr>
+          <w:rStyle w:val="CodeChar"/>
+        </w:rPr>
+        <w:t>[element for var in iterable]</w:t>
+      </w:r>
+      <w:r>
+        <w:rPr>
+          <w:rFonts w:asciiTheme="majorBidi" w:hAnsiTheme="majorBidi" w:cstheme="majorBidi"/>
+          <w:lang w:val="en-US"/>
+        </w:rPr>
+        <w:t xml:space="preserve"> or </w:t>
+      </w:r>
+      <w:r>
+        <w:rPr>
+          <w:rStyle w:val="CodeChar"/>
+        </w:rPr>
+        <w:t>[element for var in iterable if condition]</w:t>
+      </w:r>
+      <w:r>
+        <w:rPr>
+          <w:rFonts w:asciiTheme="majorBidi" w:hAnsiTheme="majorBidi" w:cstheme="majorBidi"/>
+          <w:lang w:val="en-US"/>
+        </w:rPr>
+        <w:t>. The iterable can be a list, range, or string. The comprehension variable is scoped to the comprehension and does not leak into the surrounding scope.</w:t>
+      </w:r>
+    </w:p>
+    <w:p>
+      <w:pPr>
+        <w:pStyle w:val="Code"/>
+      </w:pPr>
+      <w:r>
+        <w:t xml:space="preserve">squares </w:t>
+      </w:r>
+      <w:r>
+        <w:t>= [x * x for x in range(10)]</w:t>
+      </w:r>
+    </w:p>
+    <w:p>
+      <w:pPr>
+        <w:pStyle w:val="Code"/>
+      </w:pPr>
+      <w:r>
+        <w:t>evens = [x for x in range(20) if x % 2 == 0]</w:t>
+      </w:r>
+    </w:p>
+    <w:p>
+      <w:pPr>
+        <w:pStyle w:val="Code"/>
+      </w:pPr>
+      <w:r>
+        <w:t>letters = [c for c in "hello"]</w:t>
+      </w:r>
+    </w:p>
+    <w:p>
+      <w:pPr>
+        <w:pStyle w:val="Code"/>
+      </w:pPr>
+      <w:r>
+        <w:t>doubled = [x * 2 for x in [1, 2, 3, 4, 5]]</w:t>
+      </w:r>
+    </w:p>
+    <w:p>
+      <w:pPr>
+        <w:pStyle w:val="ListParagraph"/>
+        <w:ind w:left="846"/>
+        <w:jc w:val="both"/>
+        <w:rPr>
+          <w:rFonts w:asciiTheme="majorBidi" w:hAnsiTheme="majorBidi" w:cstheme="majorBidi"/>
+          <w:lang w:val="en-US"/>
+        </w:rPr>
+      </w:pPr>
+    </w:p>
+    <w:p>
+      <w:pPr>
+        <w:pStyle w:val="ListParagraph"/>
+        <w:numPr>
+          <w:ilvl w:val="1"/>
+          <w:numId w:val="2"/>
+        </w:numPr>
+        <w:ind w:left="845"/>
+        <w:jc w:val="both"/>
+        <w:outlineLvl w:val="1"/>
+        <w:rPr>
+          <w:rFonts w:asciiTheme="majorBidi" w:hAnsiTheme="majorBidi" w:cstheme="majorBidi"/>
+          <w:lang w:val="en-US"/>
+        </w:rPr>
+      </w:pPr>
+      <w:r>
+        <w:rPr>
+          <w:rFonts w:asciiTheme="majorBidi" w:hAnsiTheme="majorBidi" w:cstheme="majorBidi"/>
+          <w:lang w:val="en-US"/>
+        </w:rPr>
+        <w:t>Unpack Expressions</w:t>
+      </w:r>
+    </w:p>
+    <w:p>
+      <w:pPr>
+        <w:pStyle w:val="ListParagraph"/>
+        <w:ind w:left="846"/>
+        <w:jc w:val="both"/>
+        <w:rPr>
+          <w:rFonts w:asciiTheme="majorBidi" w:hAnsiTheme="majorBidi" w:cstheme="majorBidi"/>
+          <w:lang w:val="en-US"/>
+        </w:rPr>
+      </w:pPr>
+      <w:r>
+        <w:rPr>
+          <w:rFonts w:asciiTheme="majorBidi" w:hAnsiTheme="majorBidi" w:cstheme="majorBidi"/>
+          <w:lang w:val="en-US"/>
+        </w:rPr>
+        <w:t xml:space="preserve">An unpack expression </w:t>
+      </w:r>
+      <w:proofErr w:type="spellStart"/>
+      <w:r>
+        <w:rPr>
+          <w:rFonts w:asciiTheme="majorBidi" w:hAnsiTheme="majorBidi" w:cstheme="majorBidi"/>
+          <w:lang w:val="en-US"/>
+        </w:rPr>
+        <w:t>destructures</w:t>
+      </w:r>
+      <w:proofErr w:type="spellEnd"/>
+      <w:r>
+        <w:rPr>
+          <w:rFonts w:asciiTheme="majorBidi" w:hAnsiTheme="majorBidi" w:cstheme="majorBidi"/>
+          <w:lang w:val="en-US"/>
+        </w:rPr>
+        <w:t xml:space="preserve"> a list or tensor into multiple named variables in a single statement. The number of names on the left must exactly match the number of elements in the value being unpacked</w:t>
+      </w:r>
+      <w:r>
+        <w:rPr>
+          <w:rFonts w:asciiTheme="majorBidi" w:hAnsiTheme="majorBidi" w:cstheme="majorBidi"/>
+          <w:lang w:val="en-US"/>
+        </w:rPr>
+        <w:t>,</w:t>
+      </w:r>
+      <w:r>
+        <w:rPr>
+          <w:rFonts w:asciiTheme="majorBidi" w:hAnsiTheme="majorBidi" w:cstheme="majorBidi"/>
+          <w:lang w:val="en-US"/>
+        </w:rPr>
+        <w:t xml:space="preserve"> a mismatch raises a </w:t>
+      </w:r>
+      <w:proofErr w:type="spellStart"/>
+      <w:r>
+        <w:rPr>
+          <w:rStyle w:val="CodeChar"/>
+        </w:rPr>
+        <w:t>ValueError</w:t>
+      </w:r>
+      <w:proofErr w:type="spellEnd"/>
+      <w:r>
+        <w:rPr>
+          <w:rFonts w:asciiTheme="majorBidi" w:hAnsiTheme="majorBidi" w:cstheme="majorBidi"/>
+          <w:lang w:val="en-US"/>
+        </w:rPr>
+        <w:t xml:space="preserve"> at runtime.</w:t>
+      </w:r>
+    </w:p>
+    <w:p>
+      <w:pPr>
+        <w:pStyle w:val="Code"/>
+      </w:pPr>
+      <w:r>
+        <w:t>a, b, c</w:t>
+      </w:r>
+      <w:r>
+        <w:t xml:space="preserve"> </w:t>
+      </w:r>
+      <w:r>
+        <w:t>= [1, 2, 3]</w:t>
+      </w:r>
+    </w:p>
+    <w:p>
+      <w:pPr>
+        <w:pStyle w:val="Code"/>
+      </w:pPr>
+      <w:r>
+        <w:t>x, y = @[3.0, 4.0]</w:t>
+      </w:r>
+    </w:p>
+    <w:p>
+      <w:pPr>
+        <w:pStyle w:val="Code"/>
+      </w:pPr>
+    </w:p>
+    <w:p>
+      <w:pPr>
+        <w:pStyle w:val="Code"/>
+      </w:pPr>
+      <w:r>
+        <w:t>print(a)</w:t>
+      </w:r>
+      <w:r>
+        <w:tab/>
+      </w:r>
+      <w:r>
+        <w:t># 1</w:t>
+      </w:r>
+    </w:p>
+    <w:p>
+      <w:pPr>
+        <w:pStyle w:val="Code"/>
+      </w:pPr>
+      <w:r>
+        <w:t>print(x)</w:t>
+      </w:r>
+      <w:r>
+        <w:tab/>
+      </w:r>
+      <w:r>
+        <w:t># 3.0</w:t>
+      </w:r>
+    </w:p>
+    <w:p>
+      <w:pPr>
+        <w:pStyle w:val="ListParagraph"/>
+        <w:ind w:left="846"/>
+        <w:jc w:val="both"/>
+        <w:rPr>
+          <w:rFonts w:asciiTheme="majorBidi" w:hAnsiTheme="majorBidi" w:cstheme="majorBidi"/>
+          <w:lang w:val="en-US"/>
+        </w:rPr>
+      </w:pPr>
+    </w:p>
+    <w:p>
+      <w:pPr>
+        <w:pStyle w:val="ListParagraph"/>
+        <w:numPr>
+          <w:ilvl w:val="1"/>
+          <w:numId w:val="2"/>
+        </w:numPr>
+        <w:ind w:left="845"/>
+        <w:jc w:val="both"/>
+        <w:outlineLvl w:val="1"/>
+        <w:rPr>
+          <w:rFonts w:asciiTheme="majorBidi" w:hAnsiTheme="majorBidi" w:cstheme="majorBidi"/>
+          <w:lang w:val="en-US"/>
+        </w:rPr>
+      </w:pPr>
+      <w:r>
+        <w:rPr>
+          <w:rFonts w:asciiTheme="majorBidi" w:hAnsiTheme="majorBidi" w:cstheme="majorBidi"/>
+          <w:lang w:val="en-US"/>
+        </w:rPr>
+        <w:t>Pipe Expressions</w:t>
+      </w:r>
+    </w:p>
+    <w:p>
+      <w:pPr>
+        <w:pStyle w:val="ListParagraph"/>
+        <w:ind w:left="846"/>
+        <w:jc w:val="both"/>
+        <w:rPr>
+          <w:rFonts w:asciiTheme="majorBidi" w:hAnsiTheme="majorBidi" w:cstheme="majorBidi"/>
+          <w:lang w:val="en-US"/>
+        </w:rPr>
+      </w:pPr>
+      <w:r>
+        <w:rPr>
+          <w:rFonts w:asciiTheme="majorBidi" w:hAnsiTheme="majorBidi" w:cstheme="majorBidi"/>
+          <w:lang w:val="en-US"/>
+        </w:rPr>
+        <w:t xml:space="preserve">A pipe expression passes the value on the left as the first argument to the callable on the right using the </w:t>
+      </w:r>
+      <w:r>
+        <w:rPr>
+          <w:rStyle w:val="CodeChar"/>
+        </w:rPr>
+        <w:t>|&gt;</w:t>
+      </w:r>
+      <w:r>
+        <w:rPr>
+          <w:rFonts w:asciiTheme="majorBidi" w:hAnsiTheme="majorBidi" w:cstheme="majorBidi"/>
+          <w:lang w:val="en-US"/>
+        </w:rPr>
+        <w:t xml:space="preserve"> operator. Pipe expressions are left-associative, so a chain of pipes is evaluated left to right. The right-hand side must be a callable value</w:t>
+      </w:r>
+      <w:r>
+        <w:rPr>
+          <w:rFonts w:asciiTheme="majorBidi" w:hAnsiTheme="majorBidi" w:cstheme="majorBidi"/>
+          <w:lang w:val="en-US"/>
+        </w:rPr>
+        <w:t>,</w:t>
+      </w:r>
+      <w:r>
+        <w:rPr>
+          <w:rFonts w:asciiTheme="majorBidi" w:hAnsiTheme="majorBidi" w:cstheme="majorBidi"/>
+          <w:lang w:val="en-US"/>
+        </w:rPr>
+        <w:t xml:space="preserve"> passing a non-callable raises a </w:t>
+      </w:r>
+      <w:proofErr w:type="spellStart"/>
+      <w:r>
+        <w:rPr>
+          <w:rStyle w:val="CodeChar"/>
+        </w:rPr>
+        <w:t>TypeError</w:t>
+      </w:r>
+      <w:proofErr w:type="spellEnd"/>
+      <w:r>
+        <w:rPr>
+          <w:rFonts w:asciiTheme="majorBidi" w:hAnsiTheme="majorBidi" w:cstheme="majorBidi"/>
+          <w:lang w:val="en-US"/>
+        </w:rPr>
+        <w:t>. Pipes are particularly useful for expressing ML pipelines in a readable sequential form.</w:t>
+      </w:r>
+    </w:p>
+    <w:p>
+      <w:pPr>
+        <w:pStyle w:val="Code"/>
+      </w:pPr>
+      <w:r>
+        <w:t xml:space="preserve">result = </w:t>
+      </w:r>
+      <w:proofErr w:type="spellStart"/>
+      <w:r>
+        <w:t>raw_data</w:t>
+      </w:r>
+      <w:proofErr w:type="spellEnd"/>
+      <w:r>
+        <w:t xml:space="preserve"> |&gt; clean |&gt; normalize |&gt; train</w:t>
+      </w:r>
+    </w:p>
+    <w:p>
+      <w:pPr>
+        <w:pStyle w:val="ListParagraph"/>
         <w:ind w:left="426"/>
         <w:jc w:val="both"/>
         <w:rPr>
           <w:rFonts w:asciiTheme="majorBidi" w:hAnsiTheme="majorBidi" w:cstheme="majorBidi"/>
-          <w:sz w:val="28"/>
-          <w:szCs w:val="28"/>
-          <w:lang w:val="en-US"/>
-        </w:rPr>
-      </w:pPr>
-    </w:p>
-    <w:p>
-      <w:pPr>
-        <w:pStyle w:val="ListParagraph"/>
-        <w:ind w:left="426"/>
-        <w:jc w:val="both"/>
-        <w:rPr>
-          <w:rFonts w:asciiTheme="majorBidi" w:hAnsiTheme="majorBidi" w:cstheme="majorBidi"/>
-          <w:sz w:val="28"/>
-          <w:szCs w:val="28"/>
           <w:lang w:val="en-US"/>
         </w:rPr>
       </w:pPr>
@@ -15650,7 +19071,6 @@
   <w:style w:type="character" w:default="1" w:styleId="DefaultParagraphFont">
     <w:name w:val="Default Paragraph Font"/>
     <w:uiPriority w:val="1"/>
-    <w:semiHidden/>
     <w:unhideWhenUsed/>
   </w:style>
   <w:style w:type="table" w:default="1" w:styleId="TableNormal">

</xml_diff>